<commit_message>
ASPM25T10-18 ASPM25T10-19 ASPM25T10-20 #done #comment Implemented full login flow: Backend Auth API, Trainer Login, Protected Routes & Logout. Includes JWT, bcrypt, role-based redirect.
</commit_message>
<xml_diff>
--- a/docs/charter_2025-6_group10.docx
+++ b/docs/charter_2025-6_group10.docx
@@ -21,19 +21,11 @@
           <w:lang w:val="en-US"/>
         </w:rPr>
       </w:pPr>
-      <w:proofErr w:type="spellStart"/>
-      <w:r>
-        <w:rPr>
-          <w:lang w:val="en-US"/>
-        </w:rPr>
-        <w:t>FitCoach</w:t>
-      </w:r>
-      <w:proofErr w:type="spellEnd"/>
-      <w:r>
-        <w:rPr>
-          <w:lang w:val="en-US"/>
-        </w:rPr>
-        <w:t xml:space="preserve"> </w:t>
+      <w:r>
+        <w:rPr>
+          <w:lang w:val="en-US"/>
+        </w:rPr>
+        <w:t xml:space="preserve">FitCoach </w:t>
       </w:r>
       <w:r>
         <w:rPr>
@@ -94,16 +86,8 @@
         <w:rPr>
           <w:lang w:val="en-US"/>
         </w:rPr>
-        <w:t xml:space="preserve">Michail </w:t>
-      </w:r>
-      <w:proofErr w:type="spellStart"/>
-      <w:r>
-        <w:rPr>
-          <w:lang w:val="en-US"/>
-        </w:rPr>
-        <w:t>Tuchinski</w:t>
-      </w:r>
-      <w:proofErr w:type="spellEnd"/>
+        <w:t>Michail Tuchinski</w:t>
+      </w:r>
     </w:p>
     <w:p>
       <w:pPr>
@@ -233,28 +217,12 @@
           <w:lang w:val="en-US"/>
         </w:rPr>
       </w:pPr>
-      <w:proofErr w:type="spellStart"/>
-      <w:r>
-        <w:rPr>
-          <w:lang w:val="en-US"/>
-        </w:rPr>
-        <w:t>Yavgeni</w:t>
-      </w:r>
-      <w:proofErr w:type="spellEnd"/>
-      <w:r>
-        <w:rPr>
-          <w:lang w:val="en-US"/>
-        </w:rPr>
-        <w:t xml:space="preserve"> </w:t>
-      </w:r>
-      <w:proofErr w:type="spellStart"/>
-      <w:r>
-        <w:rPr>
-          <w:lang w:val="en-US"/>
-        </w:rPr>
-        <w:t>Karavkin</w:t>
-      </w:r>
-      <w:proofErr w:type="spellEnd"/>
+      <w:r>
+        <w:rPr>
+          <w:lang w:val="en-US"/>
+        </w:rPr>
+        <w:t>Yavgeni Karavkin</w:t>
+      </w:r>
     </w:p>
     <w:p>
       <w:pPr>
@@ -386,21 +354,7 @@
         <w:rPr>
           <w:lang w:val="en-US"/>
         </w:rPr>
-        <w:t xml:space="preserve"> Uses the system to view personalized workout instructions, receive real-time feedback, and </w:t>
-      </w:r>
-      <w:proofErr w:type="gramStart"/>
-      <w:r>
-        <w:rPr>
-          <w:lang w:val="en-US"/>
-        </w:rPr>
-        <w:t>track</w:t>
-      </w:r>
-      <w:proofErr w:type="gramEnd"/>
-      <w:r>
-        <w:rPr>
-          <w:lang w:val="en-US"/>
-        </w:rPr>
-        <w:t xml:space="preserve"> individual training progress during group sessions.</w:t>
+        <w:t xml:space="preserve"> Uses the system to view personalized workout instructions, receive real-time feedback, and track individual training progress during group sessions.</w:t>
       </w:r>
     </w:p>
     <w:p>
@@ -480,21 +434,7 @@
         <w:rPr>
           <w:lang w:val="en-US"/>
         </w:rPr>
-        <w:t xml:space="preserve"> Can leverage aggregated training data to support complementary services and </w:t>
-      </w:r>
-      <w:proofErr w:type="gramStart"/>
-      <w:r>
-        <w:rPr>
-          <w:lang w:val="en-US"/>
-        </w:rPr>
-        <w:t>personalized</w:t>
-      </w:r>
-      <w:proofErr w:type="gramEnd"/>
-      <w:r>
-        <w:rPr>
-          <w:lang w:val="en-US"/>
-        </w:rPr>
-        <w:t xml:space="preserve"> recommendations.</w:t>
+        <w:t xml:space="preserve"> Can leverage aggregated training data to support complementary services and personalized recommendations.</w:t>
       </w:r>
     </w:p>
     <w:p>
@@ -704,15 +644,7 @@
         </w:rPr>
       </w:pPr>
       <w:r>
-        <w:t xml:space="preserve">ABSTRACT (Executive </w:t>
-      </w:r>
-      <w:proofErr w:type="spellStart"/>
-      <w:r>
-        <w:t>Summary</w:t>
-      </w:r>
-      <w:proofErr w:type="spellEnd"/>
-      <w:r>
-        <w:t>) - Product Vision</w:t>
+        <w:t>ABSTRACT (Executive Summary) - Product Vision</w:t>
       </w:r>
     </w:p>
     <w:p>
@@ -777,7 +709,6 @@
           <w:lang w:val="en-US"/>
         </w:rPr>
       </w:pPr>
-      <w:proofErr w:type="gramStart"/>
       <w:r>
         <w:rPr>
           <w:b/>
@@ -792,15 +723,12 @@
         </w:rPr>
         <w:t xml:space="preserve"> </w:t>
       </w:r>
-      <w:proofErr w:type="spellStart"/>
       <w:r>
         <w:rPr>
           <w:lang w:val="en-US"/>
         </w:rPr>
         <w:t>FitCoach</w:t>
       </w:r>
-      <w:proofErr w:type="spellEnd"/>
-      <w:proofErr w:type="gramEnd"/>
       <w:r>
         <w:rPr>
           <w:lang w:val="en-US"/>
@@ -889,22 +817,18 @@
           <w:lang w:val="en-US"/>
         </w:rPr>
       </w:pPr>
-      <w:proofErr w:type="gramStart"/>
       <w:r>
         <w:rPr>
           <w:lang w:val="en-US"/>
         </w:rPr>
         <w:t xml:space="preserve">The </w:t>
       </w:r>
-      <w:proofErr w:type="spellStart"/>
       <w:r>
         <w:rPr>
           <w:lang w:val="en-US"/>
         </w:rPr>
         <w:t>FitCoach</w:t>
       </w:r>
-      <w:proofErr w:type="spellEnd"/>
-      <w:proofErr w:type="gramEnd"/>
       <w:r>
         <w:rPr>
           <w:lang w:val="en-US"/>
@@ -1079,21 +1003,7 @@
         <w:rPr>
           <w:lang w:val="en-US"/>
         </w:rPr>
-        <w:t xml:space="preserve">Daniel works across two commercial gyms in Tel Aviv </w:t>
-      </w:r>
-      <w:proofErr w:type="gramStart"/>
-      <w:r>
-        <w:rPr>
-          <w:lang w:val="en-US"/>
-        </w:rPr>
-        <w:t>and also</w:t>
-      </w:r>
-      <w:proofErr w:type="gramEnd"/>
-      <w:r>
-        <w:rPr>
-          <w:lang w:val="en-US"/>
-        </w:rPr>
-        <w:t xml:space="preserve"> runs independent small-group sessions in a private studio. He manages 15–25 active clients, training them in both individual and group formats, often with 2–4 clients per session who each follow a personalized program.</w:t>
+        <w:t>Daniel works across two commercial gyms in Tel Aviv and also runs independent small-group sessions in a private studio. He manages 15–25 active clients, training them in both individual and group formats, often with 2–4 clients per session who each follow a personalized program.</w:t>
       </w:r>
     </w:p>
     <w:p>
@@ -1437,16 +1347,8 @@
         <w:rPr>
           <w:lang w:val="en-US"/>
         </w:rPr>
-        <w:t xml:space="preserve">“My job is to coach, motivate, and correct technique—not to juggle papers and screens. If I can see all my clients’ programs at once, I can give each of them the attention they </w:t>
-      </w:r>
-      <w:proofErr w:type="gramStart"/>
-      <w:r>
-        <w:rPr>
-          <w:lang w:val="en-US"/>
-        </w:rPr>
-        <w:t>deserve.”</w:t>
-      </w:r>
-      <w:proofErr w:type="gramEnd"/>
+        <w:t>“My job is to coach, motivate, and correct technique—not to juggle papers and screens. If I can see all my clients’ programs at once, I can give each of them the attention they deserve.”</w:t>
+      </w:r>
     </w:p>
     <w:p>
       <w:pPr>
@@ -1588,21 +1490,7 @@
         <w:rPr>
           <w:lang w:val="en-US"/>
         </w:rPr>
-        <w:t xml:space="preserve">Tone muscles </w:t>
-      </w:r>
-      <w:proofErr w:type="gramStart"/>
-      <w:r>
-        <w:rPr>
-          <w:lang w:val="en-US"/>
-        </w:rPr>
-        <w:t>and increase</w:t>
-      </w:r>
-      <w:proofErr w:type="gramEnd"/>
-      <w:r>
-        <w:rPr>
-          <w:lang w:val="en-US"/>
-        </w:rPr>
-        <w:t xml:space="preserve"> strength</w:t>
+        <w:t>Tone muscles and increase strength</w:t>
       </w:r>
     </w:p>
     <w:p>
@@ -1724,21 +1612,7 @@
         <w:rPr>
           <w:lang w:val="en-US"/>
         </w:rPr>
-        <w:t xml:space="preserve">Lack of visibility </w:t>
-      </w:r>
-      <w:proofErr w:type="gramStart"/>
-      <w:r>
-        <w:rPr>
-          <w:lang w:val="en-US"/>
-        </w:rPr>
-        <w:t>into</w:t>
-      </w:r>
-      <w:proofErr w:type="gramEnd"/>
-      <w:r>
-        <w:rPr>
-          <w:lang w:val="en-US"/>
-        </w:rPr>
-        <w:t xml:space="preserve"> long-term progress and improvements</w:t>
+        <w:t>Lack of visibility into long-term progress and improvements</w:t>
       </w:r>
     </w:p>
     <w:p>
@@ -2227,21 +2101,7 @@
         <w:rPr>
           <w:lang w:val="en-US"/>
         </w:rPr>
-        <w:t xml:space="preserve">A (Achievable): The system is purpose-built for 2×2 split-screen </w:t>
-      </w:r>
-      <w:proofErr w:type="gramStart"/>
-      <w:r>
-        <w:rPr>
-          <w:lang w:val="en-US"/>
-        </w:rPr>
-        <w:t>display</w:t>
-      </w:r>
-      <w:proofErr w:type="gramEnd"/>
-      <w:r>
-        <w:rPr>
-          <w:lang w:val="en-US"/>
-        </w:rPr>
-        <w:t>.</w:t>
+        <w:t>A (Achievable): The system is purpose-built for 2×2 split-screen display.</w:t>
       </w:r>
     </w:p>
     <w:p>
@@ -2588,15 +2448,14 @@
           <w:lang w:val="en-US"/>
         </w:rPr>
       </w:pPr>
-      <w:proofErr w:type="spellStart"/>
       <w:r>
         <w:rPr>
           <w:b/>
           <w:bCs/>
+          <w:lang w:val="en-US"/>
         </w:rPr>
         <w:t>Trainerize</w:t>
       </w:r>
-      <w:proofErr w:type="spellEnd"/>
     </w:p>
     <w:p>
       <w:pPr>
@@ -2639,12 +2498,14 @@
         <w:rPr>
           <w:b/>
           <w:bCs/>
+          <w:lang w:val="en-US"/>
         </w:rPr>
       </w:pPr>
       <w:r>
         <w:rPr>
           <w:b/>
           <w:bCs/>
+          <w:lang w:val="en-US"/>
         </w:rPr>
         <w:lastRenderedPageBreak/>
         <w:t>My PT Hub</w:t>
@@ -2690,17 +2551,17 @@
         <w:rPr>
           <w:b/>
           <w:bCs/>
-        </w:rPr>
-      </w:pPr>
-      <w:proofErr w:type="spellStart"/>
+          <w:lang w:val="en-US"/>
+        </w:rPr>
+      </w:pPr>
       <w:r>
         <w:rPr>
           <w:b/>
           <w:bCs/>
+          <w:lang w:val="en-US"/>
         </w:rPr>
         <w:t>TrueCoach</w:t>
       </w:r>
-      <w:proofErr w:type="spellEnd"/>
     </w:p>
     <w:p>
       <w:pPr>
@@ -2742,12 +2603,14 @@
         <w:rPr>
           <w:b/>
           <w:bCs/>
+          <w:lang w:val="en-US"/>
         </w:rPr>
       </w:pPr>
       <w:r>
         <w:rPr>
           <w:b/>
           <w:bCs/>
+          <w:lang w:val="en-US"/>
         </w:rPr>
         <w:t>PT Distinction</w:t>
       </w:r>
@@ -2792,12 +2655,14 @@
         <w:rPr>
           <w:b/>
           <w:bCs/>
+          <w:lang w:val="en-US"/>
         </w:rPr>
       </w:pPr>
       <w:r>
         <w:rPr>
           <w:b/>
           <w:bCs/>
+          <w:lang w:val="en-US"/>
         </w:rPr>
         <w:t>Mindbody (Trainer tools)</w:t>
       </w:r>
@@ -2875,21 +2740,8 @@
           <w:numId w:val="18"/>
         </w:numPr>
       </w:pPr>
-      <w:proofErr w:type="spellStart"/>
-      <w:r>
-        <w:t>Trainers</w:t>
-      </w:r>
-      <w:proofErr w:type="spellEnd"/>
-      <w:r>
-        <w:t xml:space="preserve"> </w:t>
-      </w:r>
-      <w:proofErr w:type="spellStart"/>
-      <w:r>
-        <w:t>must</w:t>
-      </w:r>
-      <w:proofErr w:type="spellEnd"/>
-      <w:r>
-        <w:t>:</w:t>
+      <w:r>
+        <w:t>Trainers must:</w:t>
       </w:r>
     </w:p>
     <w:p>
@@ -2899,35 +2751,9 @@
           <w:numId w:val="18"/>
         </w:numPr>
       </w:pPr>
-      <w:proofErr w:type="spellStart"/>
-      <w:r>
-        <w:t>switch</w:t>
-      </w:r>
-      <w:proofErr w:type="spellEnd"/>
-      <w:r>
-        <w:t xml:space="preserve"> </w:t>
-      </w:r>
-      <w:proofErr w:type="spellStart"/>
-      <w:r>
-        <w:t>between</w:t>
-      </w:r>
-      <w:proofErr w:type="spellEnd"/>
-      <w:r>
-        <w:t xml:space="preserve"> </w:t>
-      </w:r>
-      <w:proofErr w:type="spellStart"/>
-      <w:r>
-        <w:t>client</w:t>
-      </w:r>
-      <w:proofErr w:type="spellEnd"/>
-      <w:r>
-        <w:t xml:space="preserve"> </w:t>
-      </w:r>
-      <w:proofErr w:type="spellStart"/>
-      <w:r>
-        <w:t>profiles</w:t>
-      </w:r>
-      <w:proofErr w:type="spellEnd"/>
+      <w:r>
+        <w:t>switch between client profiles</w:t>
+      </w:r>
     </w:p>
     <w:p>
       <w:pPr>
@@ -2936,27 +2762,9 @@
           <w:numId w:val="18"/>
         </w:numPr>
       </w:pPr>
-      <w:proofErr w:type="spellStart"/>
-      <w:r>
-        <w:t>use</w:t>
-      </w:r>
-      <w:proofErr w:type="spellEnd"/>
-      <w:r>
-        <w:t xml:space="preserve"> </w:t>
-      </w:r>
-      <w:proofErr w:type="spellStart"/>
-      <w:r>
-        <w:t>multiple</w:t>
-      </w:r>
-      <w:proofErr w:type="spellEnd"/>
-      <w:r>
-        <w:t xml:space="preserve"> </w:t>
-      </w:r>
-      <w:proofErr w:type="spellStart"/>
-      <w:r>
-        <w:t>devices</w:t>
-      </w:r>
-      <w:proofErr w:type="spellEnd"/>
+      <w:r>
+        <w:t>use multiple devices</w:t>
+      </w:r>
     </w:p>
     <w:p>
       <w:pPr>
@@ -2965,43 +2773,9 @@
           <w:numId w:val="18"/>
         </w:numPr>
       </w:pPr>
-      <w:proofErr w:type="spellStart"/>
-      <w:r>
-        <w:t>rely</w:t>
-      </w:r>
-      <w:proofErr w:type="spellEnd"/>
-      <w:r>
-        <w:t xml:space="preserve"> </w:t>
-      </w:r>
-      <w:proofErr w:type="spellStart"/>
-      <w:r>
-        <w:t>on</w:t>
-      </w:r>
-      <w:proofErr w:type="spellEnd"/>
-      <w:r>
-        <w:t xml:space="preserve"> </w:t>
-      </w:r>
-      <w:proofErr w:type="spellStart"/>
-      <w:r>
-        <w:t>memory</w:t>
-      </w:r>
-      <w:proofErr w:type="spellEnd"/>
-      <w:r>
-        <w:t xml:space="preserve"> </w:t>
-      </w:r>
-      <w:proofErr w:type="spellStart"/>
-      <w:r>
-        <w:t>or</w:t>
-      </w:r>
-      <w:proofErr w:type="spellEnd"/>
-      <w:r>
-        <w:t xml:space="preserve"> </w:t>
-      </w:r>
-      <w:proofErr w:type="spellStart"/>
-      <w:r>
-        <w:t>paper</w:t>
-      </w:r>
-      <w:proofErr w:type="spellEnd"/>
+      <w:r>
+        <w:t>rely on memory or paper</w:t>
+      </w:r>
     </w:p>
     <w:p>
       <w:pPr>
@@ -3059,19 +2833,9 @@
           <w:numId w:val="19"/>
         </w:numPr>
       </w:pPr>
-      <w:proofErr w:type="spellStart"/>
-      <w:r>
-        <w:t>different</w:t>
-      </w:r>
-      <w:proofErr w:type="spellEnd"/>
-      <w:r>
-        <w:t xml:space="preserve"> </w:t>
-      </w:r>
-      <w:proofErr w:type="spellStart"/>
-      <w:r>
-        <w:t>programs</w:t>
-      </w:r>
-      <w:proofErr w:type="spellEnd"/>
+      <w:r>
+        <w:t>different programs</w:t>
+      </w:r>
     </w:p>
     <w:p>
       <w:pPr>
@@ -3080,27 +2844,9 @@
           <w:numId w:val="19"/>
         </w:numPr>
       </w:pPr>
-      <w:proofErr w:type="spellStart"/>
-      <w:r>
-        <w:t>different</w:t>
-      </w:r>
-      <w:proofErr w:type="spellEnd"/>
-      <w:r>
-        <w:t xml:space="preserve"> </w:t>
-      </w:r>
-      <w:proofErr w:type="spellStart"/>
-      <w:r>
-        <w:t>reps</w:t>
-      </w:r>
-      <w:proofErr w:type="spellEnd"/>
-      <w:r>
-        <w:t xml:space="preserve"> / </w:t>
-      </w:r>
-      <w:proofErr w:type="spellStart"/>
-      <w:r>
-        <w:t>weights</w:t>
-      </w:r>
-      <w:proofErr w:type="spellEnd"/>
+      <w:r>
+        <w:t>different reps / weights</w:t>
+      </w:r>
     </w:p>
     <w:p>
       <w:pPr>
@@ -3109,27 +2855,9 @@
           <w:numId w:val="19"/>
         </w:numPr>
       </w:pPr>
-      <w:proofErr w:type="spellStart"/>
-      <w:r>
-        <w:t>different</w:t>
-      </w:r>
-      <w:proofErr w:type="spellEnd"/>
-      <w:r>
-        <w:t xml:space="preserve"> </w:t>
-      </w:r>
-      <w:proofErr w:type="spellStart"/>
-      <w:r>
-        <w:t>progression</w:t>
-      </w:r>
-      <w:proofErr w:type="spellEnd"/>
-      <w:r>
-        <w:t xml:space="preserve"> </w:t>
-      </w:r>
-      <w:proofErr w:type="spellStart"/>
-      <w:r>
-        <w:t>levels</w:t>
-      </w:r>
-      <w:proofErr w:type="spellEnd"/>
+      <w:r>
+        <w:t>different progression levels</w:t>
+      </w:r>
     </w:p>
     <w:p>
       <w:pPr>
@@ -3156,29 +2884,8 @@
           <w:numId w:val="20"/>
         </w:numPr>
       </w:pPr>
-      <w:proofErr w:type="spellStart"/>
-      <w:r>
-        <w:t>Trainers</w:t>
-      </w:r>
-      <w:proofErr w:type="spellEnd"/>
-      <w:r>
-        <w:t xml:space="preserve"> </w:t>
-      </w:r>
-      <w:proofErr w:type="spellStart"/>
-      <w:r>
-        <w:t>spend</w:t>
-      </w:r>
-      <w:proofErr w:type="spellEnd"/>
-      <w:r>
-        <w:t xml:space="preserve"> </w:t>
-      </w:r>
-      <w:proofErr w:type="spellStart"/>
-      <w:r>
-        <w:t>time</w:t>
-      </w:r>
-      <w:proofErr w:type="spellEnd"/>
-      <w:r>
-        <w:t>:</w:t>
+      <w:r>
+        <w:t>Trainers spend time:</w:t>
       </w:r>
     </w:p>
     <w:p>
@@ -3188,19 +2895,9 @@
           <w:numId w:val="20"/>
         </w:numPr>
       </w:pPr>
-      <w:proofErr w:type="spellStart"/>
-      <w:r>
-        <w:t>navigating</w:t>
-      </w:r>
-      <w:proofErr w:type="spellEnd"/>
-      <w:r>
-        <w:t xml:space="preserve"> </w:t>
-      </w:r>
-      <w:proofErr w:type="spellStart"/>
-      <w:r>
-        <w:t>apps</w:t>
-      </w:r>
-      <w:proofErr w:type="spellEnd"/>
+      <w:r>
+        <w:t>navigating apps</w:t>
+      </w:r>
     </w:p>
     <w:p>
       <w:pPr>
@@ -3209,27 +2906,9 @@
           <w:numId w:val="20"/>
         </w:numPr>
       </w:pPr>
-      <w:proofErr w:type="spellStart"/>
-      <w:r>
-        <w:t>searching</w:t>
-      </w:r>
-      <w:proofErr w:type="spellEnd"/>
-      <w:r>
-        <w:t xml:space="preserve"> </w:t>
-      </w:r>
-      <w:proofErr w:type="spellStart"/>
-      <w:r>
-        <w:t>client</w:t>
-      </w:r>
-      <w:proofErr w:type="spellEnd"/>
-      <w:r>
-        <w:t xml:space="preserve"> </w:t>
-      </w:r>
-      <w:proofErr w:type="spellStart"/>
-      <w:r>
-        <w:t>data</w:t>
-      </w:r>
-      <w:proofErr w:type="spellEnd"/>
+      <w:r>
+        <w:t>searching client data</w:t>
+      </w:r>
     </w:p>
     <w:p>
       <w:pPr>
@@ -3238,35 +2917,9 @@
           <w:numId w:val="20"/>
         </w:numPr>
       </w:pPr>
-      <w:proofErr w:type="spellStart"/>
-      <w:r>
-        <w:t>logging</w:t>
-      </w:r>
-      <w:proofErr w:type="spellEnd"/>
-      <w:r>
-        <w:t xml:space="preserve"> </w:t>
-      </w:r>
-      <w:proofErr w:type="spellStart"/>
-      <w:r>
-        <w:t>manually</w:t>
-      </w:r>
-      <w:proofErr w:type="spellEnd"/>
-      <w:r>
-        <w:t xml:space="preserve"> </w:t>
-      </w:r>
-      <w:proofErr w:type="spellStart"/>
-      <w:r>
-        <w:t>after</w:t>
-      </w:r>
-      <w:proofErr w:type="spellEnd"/>
-      <w:r>
-        <w:t xml:space="preserve"> </w:t>
-      </w:r>
-      <w:proofErr w:type="spellStart"/>
-      <w:r>
-        <w:t>sessions</w:t>
-      </w:r>
-      <w:proofErr w:type="spellEnd"/>
+      <w:r>
+        <w:t>logging manually after sessions</w:t>
+      </w:r>
     </w:p>
     <w:p>
       <w:pPr>
@@ -3293,37 +2946,8 @@
           <w:numId w:val="21"/>
         </w:numPr>
       </w:pPr>
-      <w:proofErr w:type="spellStart"/>
-      <w:r>
-        <w:t>Apps</w:t>
-      </w:r>
-      <w:proofErr w:type="spellEnd"/>
-      <w:r>
-        <w:t xml:space="preserve"> </w:t>
-      </w:r>
-      <w:proofErr w:type="spellStart"/>
-      <w:r>
-        <w:t>are</w:t>
-      </w:r>
-      <w:proofErr w:type="spellEnd"/>
-      <w:r>
-        <w:t xml:space="preserve"> </w:t>
-      </w:r>
-      <w:proofErr w:type="spellStart"/>
-      <w:r>
-        <w:t>optimized</w:t>
-      </w:r>
-      <w:proofErr w:type="spellEnd"/>
-      <w:r>
-        <w:t xml:space="preserve"> </w:t>
-      </w:r>
-      <w:proofErr w:type="spellStart"/>
-      <w:r>
-        <w:t>for</w:t>
-      </w:r>
-      <w:proofErr w:type="spellEnd"/>
-      <w:r>
-        <w:t>:</w:t>
+      <w:r>
+        <w:t>Apps are optimized for:</w:t>
       </w:r>
     </w:p>
     <w:p>
@@ -3333,19 +2957,9 @@
           <w:numId w:val="21"/>
         </w:numPr>
       </w:pPr>
-      <w:proofErr w:type="spellStart"/>
-      <w:r>
-        <w:t>before-session</w:t>
-      </w:r>
-      <w:proofErr w:type="spellEnd"/>
-      <w:r>
-        <w:t xml:space="preserve"> </w:t>
-      </w:r>
-      <w:proofErr w:type="spellStart"/>
-      <w:r>
-        <w:t>planning</w:t>
-      </w:r>
-      <w:proofErr w:type="spellEnd"/>
+      <w:r>
+        <w:t>before-session planning</w:t>
+      </w:r>
     </w:p>
     <w:p>
       <w:pPr>
@@ -3354,19 +2968,9 @@
           <w:numId w:val="21"/>
         </w:numPr>
       </w:pPr>
-      <w:proofErr w:type="spellStart"/>
-      <w:r>
-        <w:t>after-session</w:t>
-      </w:r>
-      <w:proofErr w:type="spellEnd"/>
-      <w:r>
-        <w:t xml:space="preserve"> </w:t>
-      </w:r>
-      <w:proofErr w:type="spellStart"/>
-      <w:r>
-        <w:t>review</w:t>
-      </w:r>
-      <w:proofErr w:type="spellEnd"/>
+      <w:r>
+        <w:t>after-session review</w:t>
+      </w:r>
     </w:p>
     <w:p>
       <w:pPr>
@@ -3411,23 +3015,7 @@
         </w:numPr>
       </w:pPr>
       <w:r>
-        <w:t xml:space="preserve">No </w:t>
-      </w:r>
-      <w:proofErr w:type="spellStart"/>
-      <w:r>
-        <w:t>concept</w:t>
-      </w:r>
-      <w:proofErr w:type="spellEnd"/>
-      <w:r>
-        <w:t xml:space="preserve"> </w:t>
-      </w:r>
-      <w:proofErr w:type="spellStart"/>
-      <w:r>
-        <w:t>of</w:t>
-      </w:r>
-      <w:proofErr w:type="spellEnd"/>
-      <w:r>
-        <w:t>:</w:t>
+        <w:t>No concept of:</w:t>
       </w:r>
     </w:p>
     <w:p>
@@ -3437,28 +3025,10 @@
           <w:numId w:val="22"/>
         </w:numPr>
       </w:pPr>
-      <w:proofErr w:type="spellStart"/>
       <w:r>
         <w:lastRenderedPageBreak/>
-        <w:t>shared</w:t>
-      </w:r>
-      <w:proofErr w:type="spellEnd"/>
-      <w:r>
-        <w:t xml:space="preserve"> </w:t>
-      </w:r>
-      <w:proofErr w:type="spellStart"/>
-      <w:r>
-        <w:t>session</w:t>
-      </w:r>
-      <w:proofErr w:type="spellEnd"/>
-      <w:r>
-        <w:t xml:space="preserve"> </w:t>
-      </w:r>
-      <w:proofErr w:type="spellStart"/>
-      <w:r>
-        <w:t>context</w:t>
-      </w:r>
-      <w:proofErr w:type="spellEnd"/>
+        <w:t>shared session context</w:t>
+      </w:r>
     </w:p>
     <w:p>
       <w:pPr>
@@ -3467,35 +3037,9 @@
           <w:numId w:val="22"/>
         </w:numPr>
       </w:pPr>
-      <w:proofErr w:type="spellStart"/>
-      <w:r>
-        <w:t>synchronized</w:t>
-      </w:r>
-      <w:proofErr w:type="spellEnd"/>
-      <w:r>
-        <w:t xml:space="preserve"> </w:t>
-      </w:r>
-      <w:proofErr w:type="spellStart"/>
-      <w:r>
-        <w:t>start</w:t>
-      </w:r>
-      <w:proofErr w:type="spellEnd"/>
-      <w:r>
-        <w:t xml:space="preserve"> / </w:t>
-      </w:r>
-      <w:proofErr w:type="spellStart"/>
-      <w:r>
-        <w:t>rest</w:t>
-      </w:r>
-      <w:proofErr w:type="spellEnd"/>
-      <w:r>
-        <w:t xml:space="preserve"> </w:t>
-      </w:r>
-      <w:proofErr w:type="spellStart"/>
-      <w:r>
-        <w:t>times</w:t>
-      </w:r>
-      <w:proofErr w:type="spellEnd"/>
+      <w:r>
+        <w:t>synchronized start / rest times</w:t>
+      </w:r>
     </w:p>
     <w:p>
       <w:pPr>
@@ -3504,27 +3048,9 @@
           <w:numId w:val="22"/>
         </w:numPr>
       </w:pPr>
-      <w:proofErr w:type="spellStart"/>
-      <w:r>
-        <w:t>trainer-centric</w:t>
-      </w:r>
-      <w:proofErr w:type="spellEnd"/>
-      <w:r>
-        <w:t xml:space="preserve"> </w:t>
-      </w:r>
-      <w:proofErr w:type="spellStart"/>
-      <w:r>
-        <w:t>session</w:t>
-      </w:r>
-      <w:proofErr w:type="spellEnd"/>
-      <w:r>
-        <w:t xml:space="preserve"> </w:t>
-      </w:r>
-      <w:proofErr w:type="spellStart"/>
-      <w:r>
-        <w:t>screen</w:t>
-      </w:r>
-      <w:proofErr w:type="spellEnd"/>
+      <w:r>
+        <w:t>trainer-centric session screen</w:t>
+      </w:r>
     </w:p>
     <w:p>
       <w:pPr>
@@ -3550,49 +3076,7 @@
         <w:rPr>
           <w:lang w:val="en-US"/>
         </w:rPr>
-        <w:t xml:space="preserve">Existing personal training management systems such as </w:t>
-      </w:r>
-      <w:proofErr w:type="spellStart"/>
-      <w:r>
-        <w:rPr>
-          <w:lang w:val="en-US"/>
-        </w:rPr>
-        <w:t>Trainerize</w:t>
-      </w:r>
-      <w:proofErr w:type="spellEnd"/>
-      <w:r>
-        <w:rPr>
-          <w:lang w:val="en-US"/>
-        </w:rPr>
-        <w:t xml:space="preserve">, My PT Hub, </w:t>
-      </w:r>
-      <w:proofErr w:type="spellStart"/>
-      <w:r>
-        <w:rPr>
-          <w:lang w:val="en-US"/>
-        </w:rPr>
-        <w:t>TrueCoach</w:t>
-      </w:r>
-      <w:proofErr w:type="spellEnd"/>
-      <w:r>
-        <w:rPr>
-          <w:lang w:val="en-US"/>
-        </w:rPr>
-        <w:t xml:space="preserve">, and PT Distinction provide robust tools for workout programming, progress tracking, and client communication. However, these platforms are fundamentally designed for single-client interaction and remote coaching workflows. They lack real-time multi-client visibility, split-screen interfaces, and trainer-centric session views required for effective small group training. As a result, trainers conducting group sessions must switch between clients or rely on manual methods, increasing cognitive load and reducing coaching quality. </w:t>
-      </w:r>
-      <w:proofErr w:type="spellStart"/>
-      <w:r>
-        <w:rPr>
-          <w:lang w:val="en-US"/>
-        </w:rPr>
-        <w:t>FitCoach</w:t>
-      </w:r>
-      <w:proofErr w:type="spellEnd"/>
-      <w:r>
-        <w:rPr>
-          <w:lang w:val="en-US"/>
-        </w:rPr>
-        <w:t xml:space="preserve"> differentiates itself by addressing this unmet need through a real-time 2×2 split-screen interface that displays up to four personalized workout programs simultaneously, enabling efficient, focused, and high-quality small group training sessions</w:t>
+        <w:t>Existing personal training management systems such as Trainerize, My PT Hub, TrueCoach, and PT Distinction provide robust tools for workout programming, progress tracking, and client communication. However, these platforms are fundamentally designed for single-client interaction and remote coaching workflows. They lack real-time multi-client visibility, split-screen interfaces, and trainer-centric session views required for effective small group training. As a result, trainers conducting group sessions must switch between clients or rely on manual methods, increasing cognitive load and reducing coaching quality. FitCoach differentiates itself by addressing this unmet need through a real-time 2×2 split-screen interface that displays up to four personalized workout programs simultaneously, enabling efficient, focused, and high-quality small group training sessions</w:t>
       </w:r>
     </w:p>
     <w:p>
@@ -3693,21 +3177,7 @@
         <w:rPr>
           <w:lang w:val="en-US"/>
         </w:rPr>
-        <w:t xml:space="preserve">Gym owners and fitness center operators gain measurable operational and financial advantages. Improved trainer efficiency allows more clients to be served per session, increasing revenue per training </w:t>
-      </w:r>
-      <w:proofErr w:type="gramStart"/>
-      <w:r>
-        <w:rPr>
-          <w:lang w:val="en-US"/>
-        </w:rPr>
-        <w:t>hour</w:t>
-      </w:r>
-      <w:proofErr w:type="gramEnd"/>
-      <w:r>
-        <w:rPr>
-          <w:lang w:val="en-US"/>
-        </w:rPr>
-        <w:t xml:space="preserve"> without additional staffing costs. Higher training quality and better client engagement contribute to increased </w:t>
+        <w:t xml:space="preserve">Gym owners and fitness center operators gain measurable operational and financial advantages. Improved trainer efficiency allows more clients to be served per session, increasing revenue per training hour without additional staffing costs. Higher training quality and better client engagement contribute to increased </w:t>
       </w:r>
       <w:r>
         <w:rPr>
@@ -3724,47 +3194,13 @@
           <w:bCs/>
         </w:rPr>
       </w:pPr>
-      <w:proofErr w:type="spellStart"/>
       <w:r>
         <w:rPr>
           <w:b/>
           <w:bCs/>
         </w:rPr>
-        <w:t>Quantified</w:t>
-      </w:r>
-      <w:proofErr w:type="spellEnd"/>
-      <w:r>
-        <w:rPr>
-          <w:b/>
-          <w:bCs/>
-        </w:rPr>
-        <w:t xml:space="preserve"> </w:t>
-      </w:r>
-      <w:proofErr w:type="spellStart"/>
-      <w:r>
-        <w:rPr>
-          <w:b/>
-          <w:bCs/>
-        </w:rPr>
-        <w:t>Benefits</w:t>
-      </w:r>
-      <w:proofErr w:type="spellEnd"/>
-      <w:r>
-        <w:rPr>
-          <w:b/>
-          <w:bCs/>
-        </w:rPr>
-        <w:t xml:space="preserve"> </w:t>
-      </w:r>
-      <w:proofErr w:type="spellStart"/>
-      <w:r>
-        <w:rPr>
-          <w:b/>
-          <w:bCs/>
-        </w:rPr>
-        <w:t>Summary</w:t>
-      </w:r>
-      <w:proofErr w:type="spellEnd"/>
+        <w:t>Quantified Benefits Summary</w:t>
+      </w:r>
     </w:p>
     <w:p>
       <w:pPr>
@@ -3879,21 +3315,7 @@
         <w:rPr>
           <w:lang w:val="en-US"/>
         </w:rPr>
-        <w:t xml:space="preserve"> Our work with AI is documented in </w:t>
-      </w:r>
-      <w:proofErr w:type="spellStart"/>
-      <w:r>
-        <w:rPr>
-          <w:lang w:val="en-US"/>
-        </w:rPr>
-        <w:t>ai_prompts_log</w:t>
-      </w:r>
-      <w:proofErr w:type="spellEnd"/>
-      <w:r>
-        <w:rPr>
-          <w:lang w:val="en-US"/>
-        </w:rPr>
-        <w:t>.</w:t>
+        <w:t xml:space="preserve"> Our work with AI is documented in ai_prompts_log.</w:t>
       </w:r>
     </w:p>
     <w:p>
@@ -4096,15 +3518,7 @@
               </w:rPr>
             </w:pPr>
             <w:r>
-              <w:t>Product Vision (</w:t>
-            </w:r>
-            <w:proofErr w:type="spellStart"/>
-            <w:r>
-              <w:t>Moore</w:t>
-            </w:r>
-            <w:proofErr w:type="spellEnd"/>
-            <w:r>
-              <w:t>)</w:t>
+              <w:t>Product Vision (Moore)</w:t>
             </w:r>
           </w:p>
         </w:tc>
@@ -4165,19 +3579,9 @@
                 <w:lang w:val="en-US"/>
               </w:rPr>
             </w:pPr>
-            <w:proofErr w:type="spellStart"/>
             <w:r>
-              <w:t>Personas</w:t>
+              <w:t>Personas creation</w:t>
             </w:r>
-            <w:proofErr w:type="spellEnd"/>
-            <w:r>
-              <w:t xml:space="preserve"> </w:t>
-            </w:r>
-            <w:proofErr w:type="spellStart"/>
-            <w:r>
-              <w:t>creation</w:t>
-            </w:r>
-            <w:proofErr w:type="spellEnd"/>
           </w:p>
         </w:tc>
       </w:tr>
@@ -4237,19 +3641,9 @@
                 <w:lang w:val="en-US"/>
               </w:rPr>
             </w:pPr>
-            <w:proofErr w:type="spellStart"/>
             <w:r>
-              <w:t>Problem</w:t>
+              <w:t>Problem Statement</w:t>
             </w:r>
-            <w:proofErr w:type="spellEnd"/>
-            <w:r>
-              <w:t xml:space="preserve"> </w:t>
-            </w:r>
-            <w:proofErr w:type="spellStart"/>
-            <w:r>
-              <w:t>Statement</w:t>
-            </w:r>
-            <w:proofErr w:type="spellEnd"/>
           </w:p>
         </w:tc>
       </w:tr>
@@ -4309,19 +3703,9 @@
                 <w:lang w:val="en-US"/>
               </w:rPr>
             </w:pPr>
-            <w:proofErr w:type="spellStart"/>
             <w:r>
-              <w:t>Competitor</w:t>
+              <w:t>Competitor analysis</w:t>
             </w:r>
-            <w:proofErr w:type="spellEnd"/>
-            <w:r>
-              <w:t xml:space="preserve"> </w:t>
-            </w:r>
-            <w:proofErr w:type="spellStart"/>
-            <w:r>
-              <w:t>analysis</w:t>
-            </w:r>
-            <w:proofErr w:type="spellEnd"/>
           </w:p>
         </w:tc>
       </w:tr>
@@ -4658,21 +4042,7 @@
         <w:rPr>
           <w:lang w:val="en-US"/>
         </w:rPr>
-        <w:t xml:space="preserve">Trainee / Client: Uses the system to view personalized workout instructions, receive real-time feedback, and </w:t>
-      </w:r>
-      <w:proofErr w:type="gramStart"/>
-      <w:r>
-        <w:rPr>
-          <w:lang w:val="en-US"/>
-        </w:rPr>
-        <w:t>track</w:t>
-      </w:r>
-      <w:proofErr w:type="gramEnd"/>
-      <w:r>
-        <w:rPr>
-          <w:lang w:val="en-US"/>
-        </w:rPr>
-        <w:t xml:space="preserve"> individual training progress during group sessions.</w:t>
+        <w:t>Trainee / Client: Uses the system to view personalized workout instructions, receive real-time feedback, and track individual training progress during group sessions.</w:t>
       </w:r>
     </w:p>
     <w:p>
@@ -4724,21 +4094,7 @@
         <w:rPr>
           <w:lang w:val="en-US"/>
         </w:rPr>
-        <w:t xml:space="preserve">Health &amp; Wellness Professionals (e.g., physiotherapists, nutritionists): Can leverage aggregated training data to support complementary services and </w:t>
-      </w:r>
-      <w:proofErr w:type="gramStart"/>
-      <w:r>
-        <w:rPr>
-          <w:lang w:val="en-US"/>
-        </w:rPr>
-        <w:t>personalized</w:t>
-      </w:r>
-      <w:proofErr w:type="gramEnd"/>
-      <w:r>
-        <w:rPr>
-          <w:lang w:val="en-US"/>
-        </w:rPr>
-        <w:t xml:space="preserve"> recommendations.</w:t>
+        <w:t>Health &amp; Wellness Professionals (e.g., physiotherapists, nutritionists): Can leverage aggregated training data to support complementary services and personalized recommendations.</w:t>
       </w:r>
     </w:p>
     <w:p>
@@ -5553,21 +4909,7 @@
         <w:rPr>
           <w:lang w:val="en-US"/>
         </w:rPr>
-        <w:t>Jan 20</w:t>
-      </w:r>
-      <w:proofErr w:type="gramStart"/>
-      <w:r>
-        <w:rPr>
-          <w:lang w:val="en-US"/>
-        </w:rPr>
-        <w:t>:  MILESTONE</w:t>
-      </w:r>
-      <w:proofErr w:type="gramEnd"/>
-      <w:r>
-        <w:rPr>
-          <w:lang w:val="en-US"/>
-        </w:rPr>
-        <w:t xml:space="preserve"> 2: Final Presentation in Class + Paper Submission</w:t>
+        <w:t>Jan 20:  MILESTONE 2: Final Presentation in Class + Paper Submission</w:t>
       </w:r>
     </w:p>
     <w:p>
@@ -5596,76 +4938,239 @@
           <w:bCs/>
         </w:rPr>
       </w:pPr>
-      <w:proofErr w:type="spellStart"/>
       <w:r>
         <w:rPr>
           <w:b/>
           <w:bCs/>
         </w:rPr>
-        <w:t>Programming</w:t>
-      </w:r>
-      <w:proofErr w:type="spellEnd"/>
-      <w:r>
+        <w:t>Programming Languages:</w:t>
+      </w:r>
+    </w:p>
+    <w:p>
+      <w:pPr>
+        <w:rPr>
+          <w:lang w:val="en-US"/>
+        </w:rPr>
+      </w:pPr>
+      <w:r>
+        <w:rPr>
+          <w:lang w:val="en-US"/>
+        </w:rPr>
+        <w:t>Primary: Python 3.11+ (Backend)</w:t>
+      </w:r>
+    </w:p>
+    <w:p>
+      <w:pPr>
+        <w:rPr>
+          <w:lang w:val="en-US"/>
+        </w:rPr>
+      </w:pPr>
+      <w:r>
+        <w:rPr>
+          <w:lang w:val="en-US"/>
+        </w:rPr>
+        <w:t>Secondary: JavaScript ES6+ (Frontend)</w:t>
+      </w:r>
+    </w:p>
+    <w:p>
+      <w:pPr>
+        <w:rPr>
+          <w:lang w:val="en-US"/>
+        </w:rPr>
+      </w:pPr>
+      <w:r>
+        <w:rPr>
+          <w:lang w:val="en-US"/>
+        </w:rPr>
+        <w:t>Database: Firebase Realtime Database (cloud - bonus!) OR PostgreSQL</w:t>
+      </w:r>
+    </w:p>
+    <w:p>
+      <w:pPr>
         <w:rPr>
           <w:b/>
           <w:bCs/>
-        </w:rPr>
-        <w:t xml:space="preserve"> </w:t>
-      </w:r>
-      <w:proofErr w:type="spellStart"/>
+          <w:lang w:val="en-US"/>
+        </w:rPr>
+      </w:pPr>
       <w:r>
         <w:rPr>
           <w:b/>
           <w:bCs/>
-        </w:rPr>
-        <w:t>Languages</w:t>
-      </w:r>
-      <w:proofErr w:type="spellEnd"/>
+          <w:lang w:val="en-US"/>
+        </w:rPr>
+        <w:t>Backend Stack:</w:t>
+      </w:r>
+    </w:p>
+    <w:p>
+      <w:pPr>
+        <w:rPr>
+          <w:lang w:val="en-US"/>
+        </w:rPr>
+      </w:pPr>
+      <w:r>
+        <w:rPr>
+          <w:lang w:val="en-US"/>
+        </w:rPr>
+        <w:t>Framework: Flask 3.0 (Python web framework)</w:t>
+      </w:r>
+    </w:p>
+    <w:p>
+      <w:pPr>
+        <w:rPr>
+          <w:lang w:val="en-US"/>
+        </w:rPr>
+      </w:pPr>
+      <w:r>
+        <w:rPr>
+          <w:lang w:val="en-US"/>
+        </w:rPr>
+        <w:t>API: RESTful API + WebSocket (Socket.IO)</w:t>
+      </w:r>
+    </w:p>
+    <w:p>
+      <w:pPr>
+        <w:rPr>
+          <w:lang w:val="en-US"/>
+        </w:rPr>
+      </w:pPr>
+      <w:r>
+        <w:rPr>
+          <w:lang w:val="en-US"/>
+        </w:rPr>
+        <w:t>Authentication: Flask-JWT-Extended</w:t>
+      </w:r>
+    </w:p>
+    <w:p>
+      <w:pPr>
+        <w:rPr>
+          <w:lang w:val="en-US"/>
+        </w:rPr>
+      </w:pPr>
+      <w:r>
+        <w:rPr>
+          <w:lang w:val="en-US"/>
+        </w:rPr>
+        <w:t>Database ORM: SQLAlchemy (if SQL) or Firebase SDK</w:t>
+      </w:r>
+    </w:p>
+    <w:p>
+      <w:pPr>
+        <w:rPr>
+          <w:lang w:val="en-US"/>
+        </w:rPr>
+      </w:pPr>
+      <w:r>
+        <w:rPr>
+          <w:lang w:val="en-US"/>
+        </w:rPr>
+        <w:t>Testing: pytest, pytest-cov</w:t>
+      </w:r>
+    </w:p>
+    <w:p>
+      <w:pPr>
+        <w:rPr>
+          <w:lang w:val="en-US"/>
+        </w:rPr>
+      </w:pPr>
+      <w:r>
+        <w:rPr>
+          <w:lang w:val="en-US"/>
+        </w:rPr>
+        <w:t>API Documentation: Swagger/OpenAPI</w:t>
+      </w:r>
+    </w:p>
+    <w:p>
+      <w:pPr>
+        <w:rPr>
+          <w:lang w:val="en-US"/>
+        </w:rPr>
+      </w:pPr>
       <w:r>
         <w:rPr>
           <w:b/>
           <w:bCs/>
-        </w:rPr>
-        <w:t>:</w:t>
-      </w:r>
-    </w:p>
-    <w:p>
-      <w:pPr>
-        <w:rPr>
-          <w:lang w:val="en-US"/>
-        </w:rPr>
-      </w:pPr>
-      <w:r>
-        <w:rPr>
-          <w:lang w:val="en-US"/>
-        </w:rPr>
-        <w:t>Primary: Python 3.11+ (Backend)</w:t>
-      </w:r>
-    </w:p>
-    <w:p>
-      <w:pPr>
-        <w:rPr>
-          <w:lang w:val="en-US"/>
-        </w:rPr>
-      </w:pPr>
-      <w:r>
-        <w:rPr>
-          <w:lang w:val="en-US"/>
-        </w:rPr>
-        <w:t>Secondary: JavaScript ES6+ (Frontend)</w:t>
-      </w:r>
-    </w:p>
-    <w:p>
-      <w:pPr>
-        <w:rPr>
-          <w:lang w:val="en-US"/>
-        </w:rPr>
-      </w:pPr>
-      <w:r>
-        <w:rPr>
-          <w:lang w:val="en-US"/>
-        </w:rPr>
-        <w:t>Database: Firebase Realtime Database (cloud - bonus!) OR PostgreSQL</w:t>
+          <w:lang w:val="en-US"/>
+        </w:rPr>
+        <w:t>DevOps &amp; Tools:</w:t>
+      </w:r>
+    </w:p>
+    <w:p>
+      <w:pPr>
+        <w:rPr>
+          <w:lang w:val="en-US"/>
+        </w:rPr>
+      </w:pPr>
+      <w:r>
+        <w:rPr>
+          <w:lang w:val="en-US"/>
+        </w:rPr>
+        <w:t>Version Control: GitHub (main + develop branches)</w:t>
+      </w:r>
+    </w:p>
+    <w:p>
+      <w:pPr>
+        <w:rPr>
+          <w:lang w:val="en-US"/>
+        </w:rPr>
+      </w:pPr>
+      <w:r>
+        <w:rPr>
+          <w:lang w:val="en-US"/>
+        </w:rPr>
+        <w:t>Project Management: Jira (Scrum board)</w:t>
+      </w:r>
+    </w:p>
+    <w:p>
+      <w:pPr>
+        <w:rPr>
+          <w:lang w:val="en-US"/>
+        </w:rPr>
+      </w:pPr>
+      <w:r>
+        <w:rPr>
+          <w:lang w:val="en-US"/>
+        </w:rPr>
+        <w:t>CI/CD: GitHub Actions (bonus - continuous pipeline)</w:t>
+      </w:r>
+    </w:p>
+    <w:p>
+      <w:pPr>
+        <w:rPr>
+          <w:lang w:val="en-US"/>
+        </w:rPr>
+      </w:pPr>
+      <w:r>
+        <w:rPr>
+          <w:lang w:val="en-US"/>
+        </w:rPr>
+        <w:t>Design: Figma</w:t>
+      </w:r>
+    </w:p>
+    <w:p>
+      <w:pPr>
+        <w:rPr>
+          <w:lang w:val="en-US"/>
+        </w:rPr>
+      </w:pPr>
+      <w:r>
+        <w:rPr>
+          <w:lang w:val="en-US"/>
+        </w:rPr>
+        <w:t>Code Editor: VS Code + GitHub Copilot</w:t>
+      </w:r>
+    </w:p>
+    <w:p>
+      <w:pPr>
+        <w:rPr>
+          <w:lang w:val="en-US"/>
+        </w:rPr>
+      </w:pPr>
+      <w:r>
+        <w:rPr>
+          <w:lang w:val="en-US"/>
+        </w:rPr>
+        <w:t>Deployment: Heroku/Vercel (bonus - web in production)</w:t>
       </w:r>
     </w:p>
     <w:p>
@@ -5682,1764 +5187,26 @@
           <w:bCs/>
           <w:lang w:val="en-US"/>
         </w:rPr>
-        <w:t>Backend Stack:</w:t>
-      </w:r>
-    </w:p>
-    <w:p>
-      <w:pPr>
-        <w:rPr>
-          <w:lang w:val="en-US"/>
-        </w:rPr>
-      </w:pPr>
-      <w:r>
-        <w:rPr>
-          <w:lang w:val="en-US"/>
-        </w:rPr>
-        <w:t>Framework: Flask 3.0 (Python web framework)</w:t>
-      </w:r>
-    </w:p>
-    <w:p>
-      <w:pPr>
-        <w:rPr>
-          <w:lang w:val="en-US"/>
-        </w:rPr>
-      </w:pPr>
-      <w:r>
-        <w:rPr>
-          <w:lang w:val="en-US"/>
-        </w:rPr>
-        <w:t>API: RESTful API + WebSocket (Socket.IO)</w:t>
-      </w:r>
-    </w:p>
-    <w:p>
-      <w:pPr>
-        <w:rPr>
-          <w:lang w:val="en-US"/>
-        </w:rPr>
-      </w:pPr>
-      <w:r>
-        <w:rPr>
-          <w:lang w:val="en-US"/>
-        </w:rPr>
-        <w:t>Authentication: Flask-JWT-Extended</w:t>
-      </w:r>
-    </w:p>
-    <w:p>
-      <w:pPr>
-        <w:rPr>
-          <w:lang w:val="en-US"/>
-        </w:rPr>
-      </w:pPr>
-      <w:r>
-        <w:rPr>
-          <w:lang w:val="en-US"/>
-        </w:rPr>
-        <w:t xml:space="preserve">Database ORM: </w:t>
-      </w:r>
-      <w:proofErr w:type="spellStart"/>
-      <w:r>
-        <w:rPr>
-          <w:lang w:val="en-US"/>
-        </w:rPr>
-        <w:t>SQLAlchemy</w:t>
-      </w:r>
-      <w:proofErr w:type="spellEnd"/>
-      <w:r>
-        <w:rPr>
-          <w:lang w:val="en-US"/>
-        </w:rPr>
-        <w:t xml:space="preserve"> (if SQL) or Firebase SDK</w:t>
-      </w:r>
-    </w:p>
-    <w:p>
-      <w:pPr>
-        <w:rPr>
-          <w:lang w:val="en-US"/>
-        </w:rPr>
-      </w:pPr>
-      <w:r>
-        <w:rPr>
-          <w:lang w:val="en-US"/>
-        </w:rPr>
-        <w:t xml:space="preserve">Testing: </w:t>
-      </w:r>
-      <w:proofErr w:type="spellStart"/>
-      <w:r>
-        <w:rPr>
-          <w:lang w:val="en-US"/>
-        </w:rPr>
-        <w:t>pytest</w:t>
-      </w:r>
-      <w:proofErr w:type="spellEnd"/>
-      <w:r>
-        <w:rPr>
-          <w:lang w:val="en-US"/>
-        </w:rPr>
-        <w:t xml:space="preserve">, </w:t>
-      </w:r>
-      <w:proofErr w:type="spellStart"/>
-      <w:r>
-        <w:rPr>
-          <w:lang w:val="en-US"/>
-        </w:rPr>
-        <w:t>pytest-cov</w:t>
-      </w:r>
-      <w:proofErr w:type="spellEnd"/>
-    </w:p>
-    <w:p>
-      <w:pPr>
-        <w:rPr>
-          <w:lang w:val="en-US"/>
-        </w:rPr>
-      </w:pPr>
-      <w:r>
-        <w:rPr>
-          <w:lang w:val="en-US"/>
-        </w:rPr>
-        <w:t>API Documentation: Swagger/</w:t>
-      </w:r>
-      <w:proofErr w:type="spellStart"/>
-      <w:r>
-        <w:rPr>
-          <w:lang w:val="en-US"/>
-        </w:rPr>
-        <w:t>OpenAPI</w:t>
-      </w:r>
-      <w:proofErr w:type="spellEnd"/>
-    </w:p>
-    <w:p>
-      <w:pPr>
-        <w:rPr>
-          <w:b/>
-          <w:bCs/>
-          <w:lang w:val="en-US"/>
-        </w:rPr>
-      </w:pPr>
-    </w:p>
-    <w:p>
-      <w:pPr>
-        <w:rPr>
-          <w:b/>
-          <w:bCs/>
-          <w:lang w:val="en-US"/>
-        </w:rPr>
-      </w:pPr>
-      <w:r>
-        <w:rPr>
-          <w:b/>
-          <w:bCs/>
-          <w:lang w:val="en-US"/>
-        </w:rPr>
-        <w:br w:type="page"/>
-      </w:r>
-      <w:r>
-        <w:rPr>
-          <w:b/>
-          <w:bCs/>
-          <w:lang w:val="en-US"/>
-        </w:rPr>
-        <w:lastRenderedPageBreak/>
-        <w:t>DevOps &amp; Tools:</w:t>
-      </w:r>
-    </w:p>
-    <w:p>
-      <w:pPr>
-        <w:rPr>
-          <w:lang w:val="en-US"/>
-        </w:rPr>
-      </w:pPr>
-      <w:r>
-        <w:rPr>
-          <w:lang w:val="en-US"/>
-        </w:rPr>
-        <w:t>Version Control: GitHub (main + develop branches)</w:t>
-      </w:r>
-    </w:p>
-    <w:p>
-      <w:pPr>
-        <w:rPr>
-          <w:lang w:val="en-US"/>
-        </w:rPr>
-      </w:pPr>
-      <w:r>
-        <w:rPr>
-          <w:lang w:val="en-US"/>
-        </w:rPr>
-        <w:t>Project Management: Jira (Scrum board)</w:t>
-      </w:r>
-    </w:p>
-    <w:p>
-      <w:pPr>
-        <w:rPr>
-          <w:lang w:val="en-US"/>
-        </w:rPr>
-      </w:pPr>
-      <w:r>
-        <w:rPr>
-          <w:lang w:val="en-US"/>
-        </w:rPr>
-        <w:t>CI/CD: GitHub Actions (bonus - continuous pipeline)</w:t>
-      </w:r>
-    </w:p>
-    <w:p>
-      <w:pPr>
-        <w:rPr>
-          <w:lang w:val="en-US"/>
-        </w:rPr>
-      </w:pPr>
-      <w:r>
-        <w:rPr>
-          <w:lang w:val="en-US"/>
-        </w:rPr>
-        <w:t>Design: Figma</w:t>
-      </w:r>
-    </w:p>
-    <w:p>
-      <w:pPr>
-        <w:rPr>
-          <w:lang w:val="en-US"/>
-        </w:rPr>
-      </w:pPr>
-      <w:r>
-        <w:rPr>
-          <w:lang w:val="en-US"/>
-        </w:rPr>
-        <w:t>Code Editor: VS Code + GitHub Copilot</w:t>
-      </w:r>
-    </w:p>
-    <w:p>
-      <w:pPr>
-        <w:rPr>
-          <w:lang w:val="en-US"/>
-        </w:rPr>
-      </w:pPr>
-      <w:r>
-        <w:rPr>
-          <w:lang w:val="en-US"/>
-        </w:rPr>
-        <w:t>Deployment: Heroku/</w:t>
-      </w:r>
-      <w:proofErr w:type="spellStart"/>
-      <w:r>
-        <w:rPr>
-          <w:lang w:val="en-US"/>
-        </w:rPr>
-        <w:t>Vercel</w:t>
-      </w:r>
-      <w:proofErr w:type="spellEnd"/>
-      <w:r>
-        <w:rPr>
-          <w:lang w:val="en-US"/>
-        </w:rPr>
-        <w:t xml:space="preserve"> (bonus - </w:t>
-      </w:r>
-      <w:proofErr w:type="gramStart"/>
-      <w:r>
-        <w:rPr>
-          <w:lang w:val="en-US"/>
-        </w:rPr>
-        <w:t>web in</w:t>
-      </w:r>
-      <w:proofErr w:type="gramEnd"/>
-      <w:r>
-        <w:rPr>
-          <w:lang w:val="en-US"/>
-        </w:rPr>
-        <w:t xml:space="preserve"> production)</w:t>
-      </w:r>
-    </w:p>
-    <w:p>
-      <w:pPr>
-        <w:rPr>
-          <w:lang w:val="en-US"/>
-        </w:rPr>
-      </w:pPr>
-      <w:r>
-        <w:rPr>
-          <w:b/>
-          <w:bCs/>
-          <w:lang w:val="en-US"/>
-        </w:rPr>
         <w:t>Architecture Diagram:</w:t>
       </w:r>
     </w:p>
     <w:p>
       <w:pPr>
-        <w:spacing w:after="160" w:line="278" w:lineRule="auto"/>
-        <w:ind w:firstLine="0"/>
-        <w:jc w:val="left"/>
-        <w:rPr>
-          <w:b/>
-          <w:bCs/>
-        </w:rPr>
-      </w:pPr>
-      <w:r>
-        <w:rPr>
-          <w:b/>
-          <w:bCs/>
-          <w:noProof/>
-          <w:lang w:val="en-US"/>
-        </w:rPr>
-        <mc:AlternateContent>
-          <mc:Choice Requires="wpg">
-            <w:drawing>
-              <wp:anchor distT="0" distB="0" distL="114300" distR="114300" simplePos="0" relativeHeight="251689984" behindDoc="0" locked="0" layoutInCell="1" allowOverlap="1" wp14:anchorId="19C026DD" wp14:editId="41C8EB77">
-                <wp:simplePos x="0" y="0"/>
-                <wp:positionH relativeFrom="column">
-                  <wp:posOffset>209578</wp:posOffset>
-                </wp:positionH>
-                <wp:positionV relativeFrom="paragraph">
-                  <wp:posOffset>155338</wp:posOffset>
-                </wp:positionV>
-                <wp:extent cx="3739416" cy="5766179"/>
-                <wp:effectExtent l="0" t="0" r="13970" b="25400"/>
-                <wp:wrapNone/>
-                <wp:docPr id="68627619" name="Группа 11"/>
-                <wp:cNvGraphicFramePr/>
-                <a:graphic xmlns:a="http://schemas.openxmlformats.org/drawingml/2006/main">
-                  <a:graphicData uri="http://schemas.microsoft.com/office/word/2010/wordprocessingGroup">
-                    <wpg:wgp>
-                      <wpg:cNvGrpSpPr/>
-                      <wpg:grpSpPr>
-                        <a:xfrm>
-                          <a:off x="0" y="0"/>
-                          <a:ext cx="3739416" cy="5766179"/>
-                          <a:chOff x="0" y="0"/>
-                          <a:chExt cx="3739416" cy="5766179"/>
-                        </a:xfrm>
-                      </wpg:grpSpPr>
-                      <wpg:grpSp>
-                        <wpg:cNvPr id="1698714911" name="Группа 3"/>
-                        <wpg:cNvGrpSpPr/>
-                        <wpg:grpSpPr>
-                          <a:xfrm>
-                            <a:off x="0" y="4325157"/>
-                            <a:ext cx="1971923" cy="1441022"/>
-                            <a:chOff x="-1" y="42760"/>
-                            <a:chExt cx="923925" cy="417215"/>
-                          </a:xfrm>
-                        </wpg:grpSpPr>
-                        <wps:wsp>
-                          <wps:cNvPr id="1624993139" name="Прямоугольник 1"/>
-                          <wps:cNvSpPr/>
-                          <wps:spPr>
-                            <a:xfrm>
-                              <a:off x="0" y="42760"/>
-                              <a:ext cx="914400" cy="417079"/>
-                            </a:xfrm>
-                            <a:prstGeom prst="rect">
-                              <a:avLst/>
-                            </a:prstGeom>
-                            <a:solidFill>
-                              <a:schemeClr val="bg1"/>
-                            </a:solidFill>
-                          </wps:spPr>
-                          <wps:style>
-                            <a:lnRef idx="2">
-                              <a:schemeClr val="accent1">
-                                <a:shade val="15000"/>
-                              </a:schemeClr>
-                            </a:lnRef>
-                            <a:fillRef idx="1">
-                              <a:schemeClr val="accent1"/>
-                            </a:fillRef>
-                            <a:effectRef idx="0">
-                              <a:schemeClr val="accent1"/>
-                            </a:effectRef>
-                            <a:fontRef idx="minor">
-                              <a:schemeClr val="lt1"/>
-                            </a:fontRef>
-                          </wps:style>
-                          <wps:bodyPr rot="0" spcFirstLastPara="0" vertOverflow="overflow" horzOverflow="overflow" vert="horz" wrap="square" lIns="91440" tIns="45720" rIns="91440" bIns="45720" numCol="1" spcCol="0" rtlCol="0" fromWordArt="0" anchor="ctr" anchorCtr="0" forceAA="0" compatLnSpc="1">
-                            <a:prstTxWarp prst="textNoShape">
-                              <a:avLst/>
-                            </a:prstTxWarp>
-                            <a:noAutofit/>
-                          </wps:bodyPr>
-                        </wps:wsp>
-                        <wps:wsp>
-                          <wps:cNvPr id="2132553232" name="Надпись 2"/>
-                          <wps:cNvSpPr txBox="1">
-                            <a:spLocks noChangeArrowheads="1"/>
-                          </wps:cNvSpPr>
-                          <wps:spPr bwMode="auto">
-                            <a:xfrm>
-                              <a:off x="-1" y="63948"/>
-                              <a:ext cx="923925" cy="396027"/>
-                            </a:xfrm>
-                            <a:prstGeom prst="rect">
-                              <a:avLst/>
-                            </a:prstGeom>
-                            <a:noFill/>
-                            <a:ln w="9525">
-                              <a:noFill/>
-                              <a:miter lim="800000"/>
-                              <a:headEnd/>
-                              <a:tailEnd/>
-                            </a:ln>
-                          </wps:spPr>
-                          <wps:txbx>
-                            <w:txbxContent>
-                              <w:p>
-                                <w:pPr>
-                                  <w:ind w:firstLine="0"/>
-                                  <w:rPr>
-                                    <w:lang w:val="en-US"/>
-                                  </w:rPr>
-                                </w:pPr>
-                                <w:r>
-                                  <w:rPr>
-                                    <w:lang w:val="en-US"/>
-                                  </w:rPr>
-                                  <w:t>Database</w:t>
-                                </w:r>
-                              </w:p>
-                              <w:p>
-                                <w:pPr>
-                                  <w:ind w:firstLine="0"/>
-                                  <w:rPr>
-                                    <w:lang w:val="en-US"/>
-                                  </w:rPr>
-                                </w:pPr>
-                                <w:r>
-                                  <w:rPr>
-                                    <w:lang w:val="en-US"/>
-                                  </w:rPr>
-                                  <w:t>(Firebase/PostgreSQL)</w:t>
-                                </w:r>
-                              </w:p>
-                              <w:p>
-                                <w:pPr>
-                                  <w:ind w:firstLine="0"/>
-                                  <w:rPr>
-                                    <w:lang w:val="en-US"/>
-                                  </w:rPr>
-                                </w:pPr>
-                                <w:r>
-                                  <w:rPr>
-                                    <w:lang w:val="en-US"/>
-                                  </w:rPr>
-                                  <w:t xml:space="preserve">- users </w:t>
-                                </w:r>
-                              </w:p>
-                              <w:p>
-                                <w:pPr>
-                                  <w:ind w:firstLine="0"/>
-                                  <w:rPr>
-                                    <w:lang w:val="en-US"/>
-                                  </w:rPr>
-                                </w:pPr>
-                                <w:r>
-                                  <w:rPr>
-                                    <w:lang w:val="en-US"/>
-                                  </w:rPr>
-                                  <w:t xml:space="preserve">- workouts </w:t>
-                                </w:r>
-                              </w:p>
-                              <w:p>
-                                <w:pPr>
-                                  <w:ind w:firstLine="0"/>
-                                  <w:rPr>
-                                    <w:lang w:val="en-US"/>
-                                  </w:rPr>
-                                </w:pPr>
-                                <w:r>
-                                  <w:rPr>
-                                    <w:lang w:val="en-US"/>
-                                  </w:rPr>
-                                  <w:t xml:space="preserve">- sessions </w:t>
-                                </w:r>
-                              </w:p>
-                              <w:p>
-                                <w:pPr>
-                                  <w:ind w:firstLine="0"/>
-                                </w:pPr>
-                                <w:r>
-                                  <w:t xml:space="preserve">- </w:t>
-                                </w:r>
-                                <w:proofErr w:type="spellStart"/>
-                                <w:r>
-                                  <w:t>exercises</w:t>
-                                </w:r>
-                                <w:proofErr w:type="spellEnd"/>
-                              </w:p>
-                              <w:p>
-                                <w:pPr>
-                                  <w:ind w:firstLine="0"/>
-                                  <w:rPr>
-                                    <w:lang w:val="en-US"/>
-                                  </w:rPr>
-                                </w:pPr>
-                              </w:p>
-                            </w:txbxContent>
-                          </wps:txbx>
-                          <wps:bodyPr rot="0" vert="horz" wrap="square" lIns="91440" tIns="45720" rIns="91440" bIns="45720" anchor="t" anchorCtr="0">
-                            <a:noAutofit/>
-                          </wps:bodyPr>
-                        </wps:wsp>
-                      </wpg:grpSp>
-                      <wpg:grpSp>
-                        <wpg:cNvPr id="1152360795" name="Группа 10"/>
-                        <wpg:cNvGrpSpPr/>
-                        <wpg:grpSpPr>
-                          <a:xfrm>
-                            <a:off x="274320" y="0"/>
-                            <a:ext cx="3465096" cy="3611036"/>
-                            <a:chOff x="0" y="0"/>
-                            <a:chExt cx="3465096" cy="3611036"/>
-                          </a:xfrm>
-                        </wpg:grpSpPr>
-                        <wpg:grpSp>
-                          <wpg:cNvPr id="1533624957" name="Группа 3"/>
-                          <wpg:cNvGrpSpPr/>
-                          <wpg:grpSpPr>
-                            <a:xfrm>
-                              <a:off x="0" y="2445026"/>
-                              <a:ext cx="1414494" cy="1166010"/>
-                              <a:chOff x="-15809" y="42853"/>
-                              <a:chExt cx="930209" cy="500072"/>
-                            </a:xfrm>
-                          </wpg:grpSpPr>
-                          <wps:wsp>
-                            <wps:cNvPr id="707410671" name="Прямоугольник 1"/>
-                            <wps:cNvSpPr/>
-                            <wps:spPr>
-                              <a:xfrm>
-                                <a:off x="0" y="42862"/>
-                                <a:ext cx="914400" cy="500063"/>
-                              </a:xfrm>
-                              <a:prstGeom prst="rect">
-                                <a:avLst/>
-                              </a:prstGeom>
-                              <a:solidFill>
-                                <a:schemeClr val="bg1"/>
-                              </a:solidFill>
-                            </wps:spPr>
-                            <wps:style>
-                              <a:lnRef idx="2">
-                                <a:schemeClr val="accent1">
-                                  <a:shade val="15000"/>
-                                </a:schemeClr>
-                              </a:lnRef>
-                              <a:fillRef idx="1">
-                                <a:schemeClr val="accent1"/>
-                              </a:fillRef>
-                              <a:effectRef idx="0">
-                                <a:schemeClr val="accent1"/>
-                              </a:effectRef>
-                              <a:fontRef idx="minor">
-                                <a:schemeClr val="lt1"/>
-                              </a:fontRef>
-                            </wps:style>
-                            <wps:bodyPr rot="0" spcFirstLastPara="0" vertOverflow="overflow" horzOverflow="overflow" vert="horz" wrap="square" lIns="91440" tIns="45720" rIns="91440" bIns="45720" numCol="1" spcCol="0" rtlCol="0" fromWordArt="0" anchor="ctr" anchorCtr="0" forceAA="0" compatLnSpc="1">
-                              <a:prstTxWarp prst="textNoShape">
-                                <a:avLst/>
-                              </a:prstTxWarp>
-                              <a:noAutofit/>
-                            </wps:bodyPr>
-                          </wps:wsp>
-                          <wps:wsp>
-                            <wps:cNvPr id="319660334" name="Надпись 2"/>
-                            <wps:cNvSpPr txBox="1">
-                              <a:spLocks noChangeArrowheads="1"/>
-                            </wps:cNvSpPr>
-                            <wps:spPr bwMode="auto">
-                              <a:xfrm>
-                                <a:off x="-15809" y="42853"/>
-                                <a:ext cx="923925" cy="476250"/>
-                              </a:xfrm>
-                              <a:prstGeom prst="rect">
-                                <a:avLst/>
-                              </a:prstGeom>
-                              <a:noFill/>
-                              <a:ln w="9525">
-                                <a:noFill/>
-                                <a:miter lim="800000"/>
-                                <a:headEnd/>
-                                <a:tailEnd/>
-                              </a:ln>
-                            </wps:spPr>
-                            <wps:txbx>
-                              <w:txbxContent>
-                                <w:p>
-                                  <w:pPr>
-                                    <w:ind w:firstLine="0"/>
-                                    <w:jc w:val="center"/>
-                                    <w:rPr>
-                                      <w:lang w:val="en-US"/>
-                                    </w:rPr>
-                                  </w:pPr>
-                                  <w:r>
-                                    <w:rPr>
-                                      <w:lang w:val="en-US"/>
-                                    </w:rPr>
-                                    <w:t>Flask Backend</w:t>
-                                  </w:r>
-                                </w:p>
-                                <w:p>
-                                  <w:pPr>
-                                    <w:ind w:firstLine="0"/>
-                                    <w:rPr>
-                                      <w:lang w:val="en-US"/>
-                                    </w:rPr>
-                                  </w:pPr>
-                                  <w:r>
-                                    <w:rPr>
-                                      <w:lang w:val="en-US"/>
-                                    </w:rPr>
-                                    <w:t>- Auth API</w:t>
-                                  </w:r>
-                                </w:p>
-                                <w:p>
-                                  <w:pPr>
-                                    <w:ind w:firstLine="0"/>
-                                    <w:rPr>
-                                      <w:lang w:val="en-US"/>
-                                    </w:rPr>
-                                  </w:pPr>
-                                  <w:r>
-                                    <w:rPr>
-                                      <w:lang w:val="en-US"/>
-                                    </w:rPr>
-                                    <w:t xml:space="preserve">- Workout API </w:t>
-                                  </w:r>
-                                </w:p>
-                                <w:p>
-                                  <w:pPr>
-                                    <w:ind w:firstLine="0"/>
-                                  </w:pPr>
-                                  <w:r>
-                                    <w:t xml:space="preserve">- </w:t>
-                                  </w:r>
-                                  <w:proofErr w:type="spellStart"/>
-                                  <w:r>
-                                    <w:t>Session</w:t>
-                                  </w:r>
-                                  <w:proofErr w:type="spellEnd"/>
-                                  <w:r>
-                                    <w:t xml:space="preserve"> API </w:t>
-                                  </w:r>
-                                </w:p>
-                                <w:p>
-                                  <w:pPr>
-                                    <w:ind w:firstLine="0"/>
-                                  </w:pPr>
-                                  <w:r>
-                                    <w:t>- Real-</w:t>
-                                  </w:r>
-                                  <w:proofErr w:type="spellStart"/>
-                                  <w:r>
-                                    <w:t>time</w:t>
-                                  </w:r>
-                                  <w:proofErr w:type="spellEnd"/>
-                                  <w:r>
-                                    <w:t xml:space="preserve"> WS</w:t>
-                                  </w:r>
-                                </w:p>
-                                <w:p>
-                                  <w:pPr>
-                                    <w:ind w:firstLine="0"/>
-                                    <w:rPr>
-                                      <w:lang w:val="en-US"/>
-                                    </w:rPr>
-                                  </w:pPr>
-                                </w:p>
-                              </w:txbxContent>
-                            </wps:txbx>
-                            <wps:bodyPr rot="0" vert="horz" wrap="square" lIns="91440" tIns="45720" rIns="91440" bIns="45720" anchor="t" anchorCtr="0">
-                              <a:noAutofit/>
-                            </wps:bodyPr>
-                          </wps:wsp>
-                        </wpg:grpSp>
-                        <wpg:grpSp>
-                          <wpg:cNvPr id="1755414539" name="Группа 9"/>
-                          <wpg:cNvGrpSpPr/>
-                          <wpg:grpSpPr>
-                            <a:xfrm>
-                              <a:off x="47708" y="0"/>
-                              <a:ext cx="3417388" cy="1745983"/>
-                              <a:chOff x="0" y="0"/>
-                              <a:chExt cx="3417388" cy="1745983"/>
-                            </a:xfrm>
-                          </wpg:grpSpPr>
-                          <wpg:grpSp>
-                            <wpg:cNvPr id="411565978" name="Группа 3"/>
-                            <wpg:cNvGrpSpPr/>
-                            <wpg:grpSpPr>
-                              <a:xfrm>
-                                <a:off x="2150563" y="1227955"/>
-                                <a:ext cx="1266825" cy="500034"/>
-                                <a:chOff x="-9525" y="42862"/>
-                                <a:chExt cx="923925" cy="500063"/>
-                              </a:xfrm>
-                            </wpg:grpSpPr>
-                            <wps:wsp>
-                              <wps:cNvPr id="761122423" name="Прямоугольник 1"/>
-                              <wps:cNvSpPr/>
-                              <wps:spPr>
-                                <a:xfrm>
-                                  <a:off x="0" y="42862"/>
-                                  <a:ext cx="914400" cy="500063"/>
-                                </a:xfrm>
-                                <a:prstGeom prst="rect">
-                                  <a:avLst/>
-                                </a:prstGeom>
-                                <a:solidFill>
-                                  <a:schemeClr val="bg1"/>
-                                </a:solidFill>
-                              </wps:spPr>
-                              <wps:style>
-                                <a:lnRef idx="2">
-                                  <a:schemeClr val="accent1">
-                                    <a:shade val="15000"/>
-                                  </a:schemeClr>
-                                </a:lnRef>
-                                <a:fillRef idx="1">
-                                  <a:schemeClr val="accent1"/>
-                                </a:fillRef>
-                                <a:effectRef idx="0">
-                                  <a:schemeClr val="accent1"/>
-                                </a:effectRef>
-                                <a:fontRef idx="minor">
-                                  <a:schemeClr val="lt1"/>
-                                </a:fontRef>
-                              </wps:style>
-                              <wps:bodyPr rot="0" spcFirstLastPara="0" vertOverflow="overflow" horzOverflow="overflow" vert="horz" wrap="square" lIns="91440" tIns="45720" rIns="91440" bIns="45720" numCol="1" spcCol="0" rtlCol="0" fromWordArt="0" anchor="ctr" anchorCtr="0" forceAA="0" compatLnSpc="1">
-                                <a:prstTxWarp prst="textNoShape">
-                                  <a:avLst/>
-                                </a:prstTxWarp>
-                                <a:noAutofit/>
-                              </wps:bodyPr>
-                            </wps:wsp>
-                            <wps:wsp>
-                              <wps:cNvPr id="403727285" name="Надпись 2"/>
-                              <wps:cNvSpPr txBox="1">
-                                <a:spLocks noChangeArrowheads="1"/>
-                              </wps:cNvSpPr>
-                              <wps:spPr bwMode="auto">
-                                <a:xfrm>
-                                  <a:off x="-9525" y="57178"/>
-                                  <a:ext cx="923925" cy="476250"/>
-                                </a:xfrm>
-                                <a:prstGeom prst="rect">
-                                  <a:avLst/>
-                                </a:prstGeom>
-                                <a:noFill/>
-                                <a:ln w="9525">
-                                  <a:noFill/>
-                                  <a:miter lim="800000"/>
-                                  <a:headEnd/>
-                                  <a:tailEnd/>
-                                </a:ln>
-                              </wps:spPr>
-                              <wps:txbx>
-                                <w:txbxContent>
-                                  <w:p>
-                                    <w:pPr>
-                                      <w:ind w:firstLine="0"/>
-                                      <w:jc w:val="center"/>
-                                    </w:pPr>
-                                    <w:r>
-                                      <w:t xml:space="preserve">4 </w:t>
-                                    </w:r>
-                                    <w:proofErr w:type="spellStart"/>
-                                    <w:r>
-                                      <w:t>Trainees</w:t>
-                                    </w:r>
-                                    <w:proofErr w:type="spellEnd"/>
-                                    <w:r>
-                                      <w:t xml:space="preserve"> </w:t>
-                                    </w:r>
-                                  </w:p>
-                                  <w:p>
-                                    <w:pPr>
-                                      <w:ind w:firstLine="0"/>
-                                      <w:jc w:val="center"/>
-                                    </w:pPr>
-                                    <w:r>
-                                      <w:t xml:space="preserve">(View Only) </w:t>
-                                    </w:r>
-                                  </w:p>
-                                  <w:p>
-                                    <w:pPr>
-                                      <w:ind w:firstLine="0"/>
-                                      <w:jc w:val="center"/>
-                                    </w:pPr>
-                                  </w:p>
-                                  <w:p>
-                                    <w:pPr>
-                                      <w:ind w:firstLine="0"/>
-                                    </w:pPr>
-                                  </w:p>
-                                </w:txbxContent>
-                              </wps:txbx>
-                              <wps:bodyPr rot="0" vert="horz" wrap="square" lIns="91440" tIns="45720" rIns="91440" bIns="45720" anchor="t" anchorCtr="0">
-                                <a:noAutofit/>
-                              </wps:bodyPr>
-                            </wps:wsp>
-                          </wpg:grpSp>
-                          <wpg:grpSp>
-                            <wpg:cNvPr id="1810058745" name="Группа 7"/>
-                            <wpg:cNvGrpSpPr/>
-                            <wpg:grpSpPr>
-                              <a:xfrm>
-                                <a:off x="0" y="0"/>
-                                <a:ext cx="1457007" cy="1745983"/>
-                                <a:chOff x="0" y="0"/>
-                                <a:chExt cx="1457007" cy="1745983"/>
-                              </a:xfrm>
-                            </wpg:grpSpPr>
-                            <wpg:grpSp>
-                              <wpg:cNvPr id="429518051" name="Группа 6"/>
-                              <wpg:cNvGrpSpPr/>
-                              <wpg:grpSpPr>
-                                <a:xfrm>
-                                  <a:off x="0" y="0"/>
-                                  <a:ext cx="1414462" cy="1745983"/>
-                                  <a:chOff x="0" y="0"/>
-                                  <a:chExt cx="1414462" cy="1745983"/>
-                                </a:xfrm>
-                              </wpg:grpSpPr>
-                              <wpg:grpSp>
-                                <wpg:cNvPr id="1297144281" name="Группа 3"/>
-                                <wpg:cNvGrpSpPr/>
-                                <wpg:grpSpPr>
-                                  <a:xfrm>
-                                    <a:off x="223837" y="0"/>
-                                    <a:ext cx="923925" cy="523572"/>
-                                    <a:chOff x="-9525" y="19020"/>
-                                    <a:chExt cx="923925" cy="523905"/>
-                                  </a:xfrm>
-                                </wpg:grpSpPr>
-                                <wps:wsp>
-                                  <wps:cNvPr id="557428059" name="Прямоугольник 1"/>
-                                  <wps:cNvSpPr/>
-                                  <wps:spPr>
-                                    <a:xfrm>
-                                      <a:off x="0" y="42862"/>
-                                      <a:ext cx="914400" cy="500063"/>
-                                    </a:xfrm>
-                                    <a:prstGeom prst="rect">
-                                      <a:avLst/>
-                                    </a:prstGeom>
-                                    <a:solidFill>
-                                      <a:schemeClr val="bg1"/>
-                                    </a:solidFill>
-                                  </wps:spPr>
-                                  <wps:style>
-                                    <a:lnRef idx="2">
-                                      <a:schemeClr val="accent1">
-                                        <a:shade val="15000"/>
-                                      </a:schemeClr>
-                                    </a:lnRef>
-                                    <a:fillRef idx="1">
-                                      <a:schemeClr val="accent1"/>
-                                    </a:fillRef>
-                                    <a:effectRef idx="0">
-                                      <a:schemeClr val="accent1"/>
-                                    </a:effectRef>
-                                    <a:fontRef idx="minor">
-                                      <a:schemeClr val="lt1"/>
-                                    </a:fontRef>
-                                  </wps:style>
-                                  <wps:bodyPr rot="0" spcFirstLastPara="0" vertOverflow="overflow" horzOverflow="overflow" vert="horz" wrap="square" lIns="91440" tIns="45720" rIns="91440" bIns="45720" numCol="1" spcCol="0" rtlCol="0" fromWordArt="0" anchor="ctr" anchorCtr="0" forceAA="0" compatLnSpc="1">
-                                    <a:prstTxWarp prst="textNoShape">
-                                      <a:avLst/>
-                                    </a:prstTxWarp>
-                                    <a:noAutofit/>
-                                  </wps:bodyPr>
-                                </wps:wsp>
-                                <wps:wsp>
-                                  <wps:cNvPr id="10753721" name="Надпись 2"/>
-                                  <wps:cNvSpPr txBox="1">
-                                    <a:spLocks noChangeArrowheads="1"/>
-                                  </wps:cNvSpPr>
-                                  <wps:spPr bwMode="auto">
-                                    <a:xfrm>
-                                      <a:off x="-9525" y="19020"/>
-                                      <a:ext cx="923925" cy="476250"/>
-                                    </a:xfrm>
-                                    <a:prstGeom prst="rect">
-                                      <a:avLst/>
-                                    </a:prstGeom>
-                                    <a:noFill/>
-                                    <a:ln w="9525">
-                                      <a:noFill/>
-                                      <a:miter lim="800000"/>
-                                      <a:headEnd/>
-                                      <a:tailEnd/>
-                                    </a:ln>
-                                  </wps:spPr>
-                                  <wps:txbx>
-                                    <w:txbxContent>
-                                      <w:p>
-                                        <w:pPr>
-                                          <w:ind w:firstLine="0"/>
-                                          <w:jc w:val="center"/>
-                                        </w:pPr>
-                                        <w:proofErr w:type="spellStart"/>
-                                        <w:r>
-                                          <w:t>Trainer</w:t>
-                                        </w:r>
-                                        <w:proofErr w:type="spellEnd"/>
-                                      </w:p>
-                                      <w:p>
-                                        <w:pPr>
-                                          <w:ind w:firstLine="0"/>
-                                          <w:jc w:val="center"/>
-                                        </w:pPr>
-                                        <w:r>
-                                          <w:t>(</w:t>
-                                        </w:r>
-                                        <w:proofErr w:type="spellStart"/>
-                                        <w:r>
-                                          <w:t>Browser</w:t>
-                                        </w:r>
-                                        <w:proofErr w:type="spellEnd"/>
-                                        <w:r>
-                                          <w:t>)</w:t>
-                                        </w:r>
-                                      </w:p>
-                                      <w:p>
-                                        <w:pPr>
-                                          <w:ind w:firstLine="0"/>
-                                        </w:pPr>
-                                      </w:p>
-                                    </w:txbxContent>
-                                  </wps:txbx>
-                                  <wps:bodyPr rot="0" vert="horz" wrap="square" lIns="91440" tIns="45720" rIns="91440" bIns="45720" anchor="t" anchorCtr="0">
-                                    <a:noAutofit/>
-                                  </wps:bodyPr>
-                                </wps:wsp>
-                              </wpg:grpSp>
-                              <wpg:grpSp>
-                                <wpg:cNvPr id="2110130196" name="Группа 3"/>
-                                <wpg:cNvGrpSpPr/>
-                                <wpg:grpSpPr>
-                                  <a:xfrm>
-                                    <a:off x="0" y="1223962"/>
-                                    <a:ext cx="1414462" cy="522021"/>
-                                    <a:chOff x="0" y="42838"/>
-                                    <a:chExt cx="923925" cy="500087"/>
-                                  </a:xfrm>
-                                </wpg:grpSpPr>
-                                <wps:wsp>
-                                  <wps:cNvPr id="374381101" name="Прямоугольник 1"/>
-                                  <wps:cNvSpPr/>
-                                  <wps:spPr>
-                                    <a:xfrm>
-                                      <a:off x="0" y="42862"/>
-                                      <a:ext cx="914400" cy="500063"/>
-                                    </a:xfrm>
-                                    <a:prstGeom prst="rect">
-                                      <a:avLst/>
-                                    </a:prstGeom>
-                                    <a:solidFill>
-                                      <a:schemeClr val="bg1"/>
-                                    </a:solidFill>
-                                  </wps:spPr>
-                                  <wps:style>
-                                    <a:lnRef idx="2">
-                                      <a:schemeClr val="accent1">
-                                        <a:shade val="15000"/>
-                                      </a:schemeClr>
-                                    </a:lnRef>
-                                    <a:fillRef idx="1">
-                                      <a:schemeClr val="accent1"/>
-                                    </a:fillRef>
-                                    <a:effectRef idx="0">
-                                      <a:schemeClr val="accent1"/>
-                                    </a:effectRef>
-                                    <a:fontRef idx="minor">
-                                      <a:schemeClr val="lt1"/>
-                                    </a:fontRef>
-                                  </wps:style>
-                                  <wps:bodyPr rot="0" spcFirstLastPara="0" vertOverflow="overflow" horzOverflow="overflow" vert="horz" wrap="square" lIns="91440" tIns="45720" rIns="91440" bIns="45720" numCol="1" spcCol="0" rtlCol="0" fromWordArt="0" anchor="ctr" anchorCtr="0" forceAA="0" compatLnSpc="1">
-                                    <a:prstTxWarp prst="textNoShape">
-                                      <a:avLst/>
-                                    </a:prstTxWarp>
-                                    <a:noAutofit/>
-                                  </wps:bodyPr>
-                                </wps:wsp>
-                                <wps:wsp>
-                                  <wps:cNvPr id="3670663" name="Надпись 2"/>
-                                  <wps:cNvSpPr txBox="1">
-                                    <a:spLocks noChangeArrowheads="1"/>
-                                  </wps:cNvSpPr>
-                                  <wps:spPr bwMode="auto">
-                                    <a:xfrm>
-                                      <a:off x="0" y="42838"/>
-                                      <a:ext cx="923925" cy="476250"/>
-                                    </a:xfrm>
-                                    <a:prstGeom prst="rect">
-                                      <a:avLst/>
-                                    </a:prstGeom>
-                                    <a:noFill/>
-                                    <a:ln w="9525">
-                                      <a:noFill/>
-                                      <a:miter lim="800000"/>
-                                      <a:headEnd/>
-                                      <a:tailEnd/>
-                                    </a:ln>
-                                  </wps:spPr>
-                                  <wps:txbx>
-                                    <w:txbxContent>
-                                      <w:p>
-                                        <w:pPr>
-                                          <w:ind w:firstLine="0"/>
-                                          <w:jc w:val="center"/>
-                                          <w:rPr>
-                                            <w:lang w:val="en-US"/>
-                                          </w:rPr>
-                                        </w:pPr>
-                                        <w:r>
-                                          <w:rPr>
-                                            <w:lang w:val="en-US"/>
-                                          </w:rPr>
-                                          <w:t>React Frontend</w:t>
-                                        </w:r>
-                                      </w:p>
-                                      <w:p>
-                                        <w:pPr>
-                                          <w:ind w:firstLine="0"/>
-                                          <w:jc w:val="center"/>
-                                          <w:rPr>
-                                            <w:lang w:val="en-US"/>
-                                          </w:rPr>
-                                        </w:pPr>
-                                        <w:r>
-                                          <w:rPr>
-                                            <w:lang w:val="en-US"/>
-                                          </w:rPr>
-                                          <w:t>Split-Screen UI</w:t>
-                                        </w:r>
-                                      </w:p>
-                                      <w:p>
-                                        <w:pPr>
-                                          <w:ind w:firstLine="0"/>
-                                          <w:jc w:val="center"/>
-                                          <w:rPr>
-                                            <w:lang w:val="en-US"/>
-                                          </w:rPr>
-                                        </w:pPr>
-                                      </w:p>
-                                      <w:p>
-                                        <w:pPr>
-                                          <w:ind w:firstLine="0"/>
-                                          <w:rPr>
-                                            <w:lang w:val="en-US"/>
-                                          </w:rPr>
-                                        </w:pPr>
-                                      </w:p>
-                                    </w:txbxContent>
-                                  </wps:txbx>
-                                  <wps:bodyPr rot="0" vert="horz" wrap="square" lIns="91440" tIns="45720" rIns="91440" bIns="45720" anchor="t" anchorCtr="0">
-                                    <a:noAutofit/>
-                                  </wps:bodyPr>
-                                </wps:wsp>
-                              </wpg:grpSp>
-                              <wps:wsp>
-                                <wps:cNvPr id="1271056832" name="Прямая со стрелкой 5"/>
-                                <wps:cNvCnPr/>
-                                <wps:spPr>
-                                  <a:xfrm>
-                                    <a:off x="695325" y="523875"/>
-                                    <a:ext cx="0" cy="700088"/>
-                                  </a:xfrm>
-                                  <a:prstGeom prst="straightConnector1">
-                                    <a:avLst/>
-                                  </a:prstGeom>
-                                  <a:ln w="19050">
-                                    <a:solidFill>
-                                      <a:schemeClr val="tx1"/>
-                                    </a:solidFill>
-                                    <a:tailEnd type="triangle"/>
-                                  </a:ln>
-                                </wps:spPr>
-                                <wps:style>
-                                  <a:lnRef idx="1">
-                                    <a:schemeClr val="accent1"/>
-                                  </a:lnRef>
-                                  <a:fillRef idx="0">
-                                    <a:schemeClr val="accent1"/>
-                                  </a:fillRef>
-                                  <a:effectRef idx="0">
-                                    <a:schemeClr val="accent1"/>
-                                  </a:effectRef>
-                                  <a:fontRef idx="minor">
-                                    <a:schemeClr val="tx1"/>
-                                  </a:fontRef>
-                                </wps:style>
-                                <wps:bodyPr/>
-                              </wps:wsp>
-                            </wpg:grpSp>
-                            <wps:wsp>
-                              <wps:cNvPr id="1392147820" name="Надпись 2"/>
-                              <wps:cNvSpPr txBox="1">
-                                <a:spLocks noChangeArrowheads="1"/>
-                              </wps:cNvSpPr>
-                              <wps:spPr bwMode="auto">
-                                <a:xfrm>
-                                  <a:off x="700087" y="723900"/>
-                                  <a:ext cx="756920" cy="280670"/>
-                                </a:xfrm>
-                                <a:prstGeom prst="rect">
-                                  <a:avLst/>
-                                </a:prstGeom>
-                                <a:noFill/>
-                                <a:ln w="9525">
-                                  <a:noFill/>
-                                  <a:miter lim="800000"/>
-                                  <a:headEnd/>
-                                  <a:tailEnd/>
-                                </a:ln>
-                              </wps:spPr>
-                              <wps:txbx>
-                                <w:txbxContent>
-                                  <w:p>
-                                    <w:pPr>
-                                      <w:ind w:firstLine="0"/>
-                                    </w:pPr>
-                                    <w:r>
-                                      <w:t>HTTPS</w:t>
-                                    </w:r>
-                                  </w:p>
-                                  <w:p/>
-                                </w:txbxContent>
-                              </wps:txbx>
-                              <wps:bodyPr rot="0" vert="horz" wrap="square" lIns="91440" tIns="45720" rIns="91440" bIns="45720" anchor="t" anchorCtr="0">
-                                <a:noAutofit/>
-                              </wps:bodyPr>
-                            </wps:wsp>
-                          </wpg:grpSp>
-                          <wps:wsp>
-                            <wps:cNvPr id="1399410596" name="Прямая со стрелкой 8"/>
-                            <wps:cNvCnPr/>
-                            <wps:spPr>
-                              <a:xfrm flipH="1">
-                                <a:off x="1413804" y="1483095"/>
-                                <a:ext cx="746952" cy="0"/>
-                              </a:xfrm>
-                              <a:prstGeom prst="straightConnector1">
-                                <a:avLst/>
-                              </a:prstGeom>
-                              <a:ln w="19050">
-                                <a:solidFill>
-                                  <a:schemeClr val="tx1"/>
-                                </a:solidFill>
-                                <a:tailEnd type="triangle"/>
-                              </a:ln>
-                            </wps:spPr>
-                            <wps:style>
-                              <a:lnRef idx="1">
-                                <a:schemeClr val="accent1"/>
-                              </a:lnRef>
-                              <a:fillRef idx="0">
-                                <a:schemeClr val="accent1"/>
-                              </a:fillRef>
-                              <a:effectRef idx="0">
-                                <a:schemeClr val="accent1"/>
-                              </a:effectRef>
-                              <a:fontRef idx="minor">
-                                <a:schemeClr val="tx1"/>
-                              </a:fontRef>
-                            </wps:style>
-                            <wps:bodyPr/>
-                          </wps:wsp>
-                        </wpg:grpSp>
-                        <wps:wsp>
-                          <wps:cNvPr id="2115909110" name="Прямая со стрелкой 5"/>
-                          <wps:cNvCnPr/>
-                          <wps:spPr>
-                            <a:xfrm>
-                              <a:off x="744110" y="1745311"/>
-                              <a:ext cx="0" cy="699940"/>
-                            </a:xfrm>
-                            <a:prstGeom prst="straightConnector1">
-                              <a:avLst/>
-                            </a:prstGeom>
-                            <a:ln w="19050">
-                              <a:solidFill>
-                                <a:schemeClr val="tx1"/>
-                              </a:solidFill>
-                              <a:tailEnd type="triangle"/>
-                            </a:ln>
-                          </wps:spPr>
-                          <wps:style>
-                            <a:lnRef idx="1">
-                              <a:schemeClr val="accent1"/>
-                            </a:lnRef>
-                            <a:fillRef idx="0">
-                              <a:schemeClr val="accent1"/>
-                            </a:fillRef>
-                            <a:effectRef idx="0">
-                              <a:schemeClr val="accent1"/>
-                            </a:effectRef>
-                            <a:fontRef idx="minor">
-                              <a:schemeClr val="tx1"/>
-                            </a:fontRef>
-                          </wps:style>
-                          <wps:bodyPr/>
-                        </wps:wsp>
-                        <wps:wsp>
-                          <wps:cNvPr id="177750392" name="Надпись 2"/>
-                          <wps:cNvSpPr txBox="1">
-                            <a:spLocks noChangeArrowheads="1"/>
-                          </wps:cNvSpPr>
-                          <wps:spPr bwMode="auto">
-                            <a:xfrm>
-                              <a:off x="675861" y="1932167"/>
-                              <a:ext cx="2105025" cy="276225"/>
-                            </a:xfrm>
-                            <a:prstGeom prst="rect">
-                              <a:avLst/>
-                            </a:prstGeom>
-                            <a:noFill/>
-                            <a:ln w="9525">
-                              <a:noFill/>
-                              <a:miter lim="800000"/>
-                              <a:headEnd/>
-                              <a:tailEnd/>
-                            </a:ln>
-                          </wps:spPr>
-                          <wps:txbx>
-                            <w:txbxContent>
-                              <w:p>
-                                <w:pPr>
-                                  <w:ind w:firstLine="0"/>
-                                </w:pPr>
-                                <w:r>
-                                  <w:t xml:space="preserve">REST API + </w:t>
-                                </w:r>
-                                <w:proofErr w:type="spellStart"/>
-                                <w:r>
-                                  <w:t>WebSocket</w:t>
-                                </w:r>
-                                <w:proofErr w:type="spellEnd"/>
-                              </w:p>
-                              <w:p/>
-                            </w:txbxContent>
-                          </wps:txbx>
-                          <wps:bodyPr rot="0" vert="horz" wrap="square" lIns="91440" tIns="45720" rIns="91440" bIns="45720" anchor="t" anchorCtr="0">
-                            <a:noAutofit/>
-                          </wps:bodyPr>
-                        </wps:wsp>
-                      </wpg:grpSp>
-                      <wps:wsp>
-                        <wps:cNvPr id="1854315332" name="Прямая со стрелкой 5"/>
-                        <wps:cNvCnPr/>
-                        <wps:spPr>
-                          <a:xfrm>
-                            <a:off x="1014454" y="3613867"/>
-                            <a:ext cx="0" cy="699857"/>
-                          </a:xfrm>
-                          <a:prstGeom prst="straightConnector1">
-                            <a:avLst/>
-                          </a:prstGeom>
-                          <a:ln w="19050">
-                            <a:solidFill>
-                              <a:schemeClr val="tx1"/>
-                            </a:solidFill>
-                            <a:tailEnd type="triangle"/>
-                          </a:ln>
-                        </wps:spPr>
-                        <wps:style>
-                          <a:lnRef idx="1">
-                            <a:schemeClr val="accent1"/>
-                          </a:lnRef>
-                          <a:fillRef idx="0">
-                            <a:schemeClr val="accent1"/>
-                          </a:fillRef>
-                          <a:effectRef idx="0">
-                            <a:schemeClr val="accent1"/>
-                          </a:effectRef>
-                          <a:fontRef idx="minor">
-                            <a:schemeClr val="tx1"/>
-                          </a:fontRef>
-                        </wps:style>
-                        <wps:bodyPr/>
-                      </wps:wsp>
-                      <wps:wsp>
-                        <wps:cNvPr id="1014735159" name="Надпись 2"/>
-                        <wps:cNvSpPr txBox="1">
-                          <a:spLocks noChangeArrowheads="1"/>
-                        </wps:cNvSpPr>
-                        <wps:spPr bwMode="auto">
-                          <a:xfrm>
-                            <a:off x="552616" y="3804699"/>
-                            <a:ext cx="2376170" cy="509270"/>
-                          </a:xfrm>
-                          <a:prstGeom prst="rect">
-                            <a:avLst/>
-                          </a:prstGeom>
-                          <a:noFill/>
-                          <a:ln w="9525">
-                            <a:noFill/>
-                            <a:miter lim="800000"/>
-                            <a:headEnd/>
-                            <a:tailEnd/>
-                          </a:ln>
-                        </wps:spPr>
-                        <wps:txbx>
-                          <w:txbxContent>
-                            <w:p>
-                              <w:proofErr w:type="spellStart"/>
-                              <w:r>
-                                <w:t>Firebase</w:t>
-                              </w:r>
-                              <w:proofErr w:type="spellEnd"/>
-                              <w:r>
-                                <w:t xml:space="preserve"> SDK / SQL</w:t>
-                              </w:r>
-                            </w:p>
-                            <w:p/>
-                          </w:txbxContent>
-                        </wps:txbx>
-                        <wps:bodyPr rot="0" vert="horz" wrap="square" lIns="91440" tIns="45720" rIns="91440" bIns="45720" anchor="t" anchorCtr="0">
-                          <a:spAutoFit/>
-                        </wps:bodyPr>
-                      </wps:wsp>
-                    </wpg:wgp>
-                  </a:graphicData>
-                </a:graphic>
-                <wp14:sizeRelV relativeFrom="margin">
-                  <wp14:pctHeight>0</wp14:pctHeight>
-                </wp14:sizeRelV>
-              </wp:anchor>
-            </w:drawing>
-          </mc:Choice>
-          <mc:Fallback>
-            <w:pict>
-              <v:group w14:anchorId="19C026DD" id="Группа 11" o:spid="_x0000_s1026" style="position:absolute;margin-left:16.5pt;margin-top:12.25pt;width:294.45pt;height:454.05pt;z-index:251689984;mso-height-relative:margin" coordsize="37394,57661" o:gfxdata="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">
-                <v:group id="Группа 3" o:spid="_x0000_s1027" style="position:absolute;top:43251;width:19719;height:14410" coordorigin=",427" coordsize="9239,4172" o:gfxdata="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">
-                  <v:rect id="Прямоугольник 1" o:spid="_x0000_s1028" style="position:absolute;top:427;width:9144;height:4171;visibility:visible;mso-wrap-style:square;v-text-anchor:middle" o:gfxdata="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" fillcolor="white [3212]" strokecolor="#030e13 [484]" strokeweight="1pt"/>
-                  <v:shapetype id="_x0000_t202" coordsize="21600,21600" o:spt="202" path="m,l,21600r21600,l21600,xe">
-                    <v:stroke joinstyle="miter"/>
-                    <v:path gradientshapeok="t" o:connecttype="rect"/>
-                  </v:shapetype>
-                  <v:shape id="Надпись 2" o:spid="_x0000_s1029" type="#_x0000_t202" style="position:absolute;top:639;width:9239;height:3960;visibility:visible;mso-wrap-style:square;v-text-anchor:top" o:gfxdata="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" filled="f" stroked="f">
-                    <v:textbox>
-                      <w:txbxContent>
-                        <w:p>
-                          <w:pPr>
-                            <w:ind w:firstLine="0"/>
-                            <w:rPr>
-                              <w:lang w:val="en-US"/>
-                            </w:rPr>
-                          </w:pPr>
-                          <w:r>
-                            <w:rPr>
-                              <w:lang w:val="en-US"/>
-                            </w:rPr>
-                            <w:t>Database</w:t>
-                          </w:r>
-                        </w:p>
-                        <w:p>
-                          <w:pPr>
-                            <w:ind w:firstLine="0"/>
-                            <w:rPr>
-                              <w:lang w:val="en-US"/>
-                            </w:rPr>
-                          </w:pPr>
-                          <w:r>
-                            <w:rPr>
-                              <w:lang w:val="en-US"/>
-                            </w:rPr>
-                            <w:t>(Firebase/PostgreSQL)</w:t>
-                          </w:r>
-                        </w:p>
-                        <w:p>
-                          <w:pPr>
-                            <w:ind w:firstLine="0"/>
-                            <w:rPr>
-                              <w:lang w:val="en-US"/>
-                            </w:rPr>
-                          </w:pPr>
-                          <w:r>
-                            <w:rPr>
-                              <w:lang w:val="en-US"/>
-                            </w:rPr>
-                            <w:t xml:space="preserve">- users </w:t>
-                          </w:r>
-                        </w:p>
-                        <w:p>
-                          <w:pPr>
-                            <w:ind w:firstLine="0"/>
-                            <w:rPr>
-                              <w:lang w:val="en-US"/>
-                            </w:rPr>
-                          </w:pPr>
-                          <w:r>
-                            <w:rPr>
-                              <w:lang w:val="en-US"/>
-                            </w:rPr>
-                            <w:t xml:space="preserve">- workouts </w:t>
-                          </w:r>
-                        </w:p>
-                        <w:p>
-                          <w:pPr>
-                            <w:ind w:firstLine="0"/>
-                            <w:rPr>
-                              <w:lang w:val="en-US"/>
-                            </w:rPr>
-                          </w:pPr>
-                          <w:r>
-                            <w:rPr>
-                              <w:lang w:val="en-US"/>
-                            </w:rPr>
-                            <w:t xml:space="preserve">- sessions </w:t>
-                          </w:r>
-                        </w:p>
-                        <w:p>
-                          <w:pPr>
-                            <w:ind w:firstLine="0"/>
-                          </w:pPr>
-                          <w:r>
-                            <w:t xml:space="preserve">- </w:t>
-                          </w:r>
-                          <w:proofErr w:type="spellStart"/>
-                          <w:r>
-                            <w:t>exercises</w:t>
-                          </w:r>
-                          <w:proofErr w:type="spellEnd"/>
-                        </w:p>
-                        <w:p>
-                          <w:pPr>
-                            <w:ind w:firstLine="0"/>
-                            <w:rPr>
-                              <w:lang w:val="en-US"/>
-                            </w:rPr>
-                          </w:pPr>
-                        </w:p>
-                      </w:txbxContent>
-                    </v:textbox>
-                  </v:shape>
-                </v:group>
-                <v:group id="Группа 10" o:spid="_x0000_s1030" style="position:absolute;left:2743;width:34651;height:36110" coordsize="34650,36110" o:gfxdata="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">
-                  <v:group id="Группа 3" o:spid="_x0000_s1031" style="position:absolute;top:24450;width:14144;height:11660" coordorigin="-158,428" coordsize="9302,5000" o:gfxdata="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">
-                    <v:rect id="Прямоугольник 1" o:spid="_x0000_s1032" style="position:absolute;top:428;width:9144;height:5001;visibility:visible;mso-wrap-style:square;v-text-anchor:middle" o:gfxdata="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" fillcolor="white [3212]" strokecolor="#030e13 [484]" strokeweight="1pt"/>
-                    <v:shape id="Надпись 2" o:spid="_x0000_s1033" type="#_x0000_t202" style="position:absolute;left:-158;top:428;width:9239;height:4763;visibility:visible;mso-wrap-style:square;v-text-anchor:top" o:gfxdata="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" filled="f" stroked="f">
-                      <v:textbox>
-                        <w:txbxContent>
-                          <w:p>
-                            <w:pPr>
-                              <w:ind w:firstLine="0"/>
-                              <w:jc w:val="center"/>
-                              <w:rPr>
-                                <w:lang w:val="en-US"/>
-                              </w:rPr>
-                            </w:pPr>
-                            <w:r>
-                              <w:rPr>
-                                <w:lang w:val="en-US"/>
-                              </w:rPr>
-                              <w:t>Flask Backend</w:t>
-                            </w:r>
-                          </w:p>
-                          <w:p>
-                            <w:pPr>
-                              <w:ind w:firstLine="0"/>
-                              <w:rPr>
-                                <w:lang w:val="en-US"/>
-                              </w:rPr>
-                            </w:pPr>
-                            <w:r>
-                              <w:rPr>
-                                <w:lang w:val="en-US"/>
-                              </w:rPr>
-                              <w:t>- Auth API</w:t>
-                            </w:r>
-                          </w:p>
-                          <w:p>
-                            <w:pPr>
-                              <w:ind w:firstLine="0"/>
-                              <w:rPr>
-                                <w:lang w:val="en-US"/>
-                              </w:rPr>
-                            </w:pPr>
-                            <w:r>
-                              <w:rPr>
-                                <w:lang w:val="en-US"/>
-                              </w:rPr>
-                              <w:t xml:space="preserve">- Workout API </w:t>
-                            </w:r>
-                          </w:p>
-                          <w:p>
-                            <w:pPr>
-                              <w:ind w:firstLine="0"/>
-                            </w:pPr>
-                            <w:r>
-                              <w:t xml:space="preserve">- </w:t>
-                            </w:r>
-                            <w:proofErr w:type="spellStart"/>
-                            <w:r>
-                              <w:t>Session</w:t>
-                            </w:r>
-                            <w:proofErr w:type="spellEnd"/>
-                            <w:r>
-                              <w:t xml:space="preserve"> API </w:t>
-                            </w:r>
-                          </w:p>
-                          <w:p>
-                            <w:pPr>
-                              <w:ind w:firstLine="0"/>
-                            </w:pPr>
-                            <w:r>
-                              <w:t>- Real-</w:t>
-                            </w:r>
-                            <w:proofErr w:type="spellStart"/>
-                            <w:r>
-                              <w:t>time</w:t>
-                            </w:r>
-                            <w:proofErr w:type="spellEnd"/>
-                            <w:r>
-                              <w:t xml:space="preserve"> WS</w:t>
-                            </w:r>
-                          </w:p>
-                          <w:p>
-                            <w:pPr>
-                              <w:ind w:firstLine="0"/>
-                              <w:rPr>
-                                <w:lang w:val="en-US"/>
-                              </w:rPr>
-                            </w:pPr>
-                          </w:p>
-                        </w:txbxContent>
-                      </v:textbox>
-                    </v:shape>
-                  </v:group>
-                  <v:group id="Группа 9" o:spid="_x0000_s1034" style="position:absolute;left:477;width:34173;height:17459" coordsize="34173,17459" o:gfxdata="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">
-                    <v:group id="Группа 3" o:spid="_x0000_s1035" style="position:absolute;left:21505;top:12279;width:12668;height:5000" coordorigin="-95,428" coordsize="9239,5000" o:gfxdata="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">
-                      <v:rect id="Прямоугольник 1" o:spid="_x0000_s1036" style="position:absolute;top:428;width:9144;height:5001;visibility:visible;mso-wrap-style:square;v-text-anchor:middle" o:gfxdata="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" fillcolor="white [3212]" strokecolor="#030e13 [484]" strokeweight="1pt"/>
-                      <v:shape id="Надпись 2" o:spid="_x0000_s1037" type="#_x0000_t202" style="position:absolute;left:-95;top:571;width:9239;height:4763;visibility:visible;mso-wrap-style:square;v-text-anchor:top" o:gfxdata="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" filled="f" stroked="f">
-                        <v:textbox>
-                          <w:txbxContent>
-                            <w:p>
-                              <w:pPr>
-                                <w:ind w:firstLine="0"/>
-                                <w:jc w:val="center"/>
-                              </w:pPr>
-                              <w:r>
-                                <w:t xml:space="preserve">4 </w:t>
-                              </w:r>
-                              <w:proofErr w:type="spellStart"/>
-                              <w:r>
-                                <w:t>Trainees</w:t>
-                              </w:r>
-                              <w:proofErr w:type="spellEnd"/>
-                              <w:r>
-                                <w:t xml:space="preserve"> </w:t>
-                              </w:r>
-                            </w:p>
-                            <w:p>
-                              <w:pPr>
-                                <w:ind w:firstLine="0"/>
-                                <w:jc w:val="center"/>
-                              </w:pPr>
-                              <w:r>
-                                <w:t xml:space="preserve">(View Only) </w:t>
-                              </w:r>
-                            </w:p>
-                            <w:p>
-                              <w:pPr>
-                                <w:ind w:firstLine="0"/>
-                                <w:jc w:val="center"/>
-                              </w:pPr>
-                            </w:p>
-                            <w:p>
-                              <w:pPr>
-                                <w:ind w:firstLine="0"/>
-                              </w:pPr>
-                            </w:p>
-                          </w:txbxContent>
-                        </v:textbox>
-                      </v:shape>
-                    </v:group>
-                    <v:group id="Группа 7" o:spid="_x0000_s1038" style="position:absolute;width:14570;height:17459" coordsize="14570,17459" o:gfxdata="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">
-                      <v:group id="Группа 6" o:spid="_x0000_s1039" style="position:absolute;width:14144;height:17459" coordsize="14144,17459" o:gfxdata="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">
-                        <v:group id="Группа 3" o:spid="_x0000_s1040" style="position:absolute;left:2238;width:9239;height:5235" coordorigin="-95,190" coordsize="9239,5239" o:gfxdata="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">
-                          <v:rect id="Прямоугольник 1" o:spid="_x0000_s1041" style="position:absolute;top:428;width:9144;height:5001;visibility:visible;mso-wrap-style:square;v-text-anchor:middle" o:gfxdata="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" fillcolor="white [3212]" strokecolor="#030e13 [484]" strokeweight="1pt"/>
-                          <v:shape id="Надпись 2" o:spid="_x0000_s1042" type="#_x0000_t202" style="position:absolute;left:-95;top:190;width:9239;height:4762;visibility:visible;mso-wrap-style:square;v-text-anchor:top" o:gfxdata="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" filled="f" stroked="f">
-                            <v:textbox>
-                              <w:txbxContent>
-                                <w:p>
-                                  <w:pPr>
-                                    <w:ind w:firstLine="0"/>
-                                    <w:jc w:val="center"/>
-                                  </w:pPr>
-                                  <w:proofErr w:type="spellStart"/>
-                                  <w:r>
-                                    <w:t>Trainer</w:t>
-                                  </w:r>
-                                  <w:proofErr w:type="spellEnd"/>
-                                </w:p>
-                                <w:p>
-                                  <w:pPr>
-                                    <w:ind w:firstLine="0"/>
-                                    <w:jc w:val="center"/>
-                                  </w:pPr>
-                                  <w:r>
-                                    <w:t>(</w:t>
-                                  </w:r>
-                                  <w:proofErr w:type="spellStart"/>
-                                  <w:r>
-                                    <w:t>Browser</w:t>
-                                  </w:r>
-                                  <w:proofErr w:type="spellEnd"/>
-                                  <w:r>
-                                    <w:t>)</w:t>
-                                  </w:r>
-                                </w:p>
-                                <w:p>
-                                  <w:pPr>
-                                    <w:ind w:firstLine="0"/>
-                                  </w:pPr>
-                                </w:p>
-                              </w:txbxContent>
-                            </v:textbox>
-                          </v:shape>
-                        </v:group>
-                        <v:group id="Группа 3" o:spid="_x0000_s1043" style="position:absolute;top:12239;width:14144;height:5220" coordorigin=",428" coordsize="9239,5000" o:gfxdata="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">
-                          <v:rect id="Прямоугольник 1" o:spid="_x0000_s1044" style="position:absolute;top:428;width:9144;height:5001;visibility:visible;mso-wrap-style:square;v-text-anchor:middle" o:gfxdata="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" fillcolor="white [3212]" strokecolor="#030e13 [484]" strokeweight="1pt"/>
-                          <v:shape id="Надпись 2" o:spid="_x0000_s1045" type="#_x0000_t202" style="position:absolute;top:428;width:9239;height:4762;visibility:visible;mso-wrap-style:square;v-text-anchor:top" o:gfxdata="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" filled="f" stroked="f">
-                            <v:textbox>
-                              <w:txbxContent>
-                                <w:p>
-                                  <w:pPr>
-                                    <w:ind w:firstLine="0"/>
-                                    <w:jc w:val="center"/>
-                                    <w:rPr>
-                                      <w:lang w:val="en-US"/>
-                                    </w:rPr>
-                                  </w:pPr>
-                                  <w:r>
-                                    <w:rPr>
-                                      <w:lang w:val="en-US"/>
-                                    </w:rPr>
-                                    <w:t>React Frontend</w:t>
-                                  </w:r>
-                                </w:p>
-                                <w:p>
-                                  <w:pPr>
-                                    <w:ind w:firstLine="0"/>
-                                    <w:jc w:val="center"/>
-                                    <w:rPr>
-                                      <w:lang w:val="en-US"/>
-                                    </w:rPr>
-                                  </w:pPr>
-                                  <w:r>
-                                    <w:rPr>
-                                      <w:lang w:val="en-US"/>
-                                    </w:rPr>
-                                    <w:t>Split-Screen UI</w:t>
-                                  </w:r>
-                                </w:p>
-                                <w:p>
-                                  <w:pPr>
-                                    <w:ind w:firstLine="0"/>
-                                    <w:jc w:val="center"/>
-                                    <w:rPr>
-                                      <w:lang w:val="en-US"/>
-                                    </w:rPr>
-                                  </w:pPr>
-                                </w:p>
-                                <w:p>
-                                  <w:pPr>
-                                    <w:ind w:firstLine="0"/>
-                                    <w:rPr>
-                                      <w:lang w:val="en-US"/>
-                                    </w:rPr>
-                                  </w:pPr>
-                                </w:p>
-                              </w:txbxContent>
-                            </v:textbox>
-                          </v:shape>
-                        </v:group>
-                        <v:shapetype id="_x0000_t32" coordsize="21600,21600" o:spt="32" o:oned="t" path="m,l21600,21600e" filled="f">
-                          <v:path arrowok="t" fillok="f" o:connecttype="none"/>
-                          <o:lock v:ext="edit" shapetype="t"/>
-                        </v:shapetype>
-                        <v:shape id="Прямая со стрелкой 5" o:spid="_x0000_s1046" type="#_x0000_t32" style="position:absolute;left:6953;top:5238;width:0;height:7001;visibility:visible;mso-wrap-style:square" o:connectortype="straight" o:gfxdata="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" strokecolor="black [3213]" strokeweight="1.5pt">
-                          <v:stroke endarrow="block" joinstyle="miter"/>
-                        </v:shape>
-                      </v:group>
-                      <v:shape id="Надпись 2" o:spid="_x0000_s1047" type="#_x0000_t202" style="position:absolute;left:7000;top:7239;width:7570;height:2806;visibility:visible;mso-wrap-style:square;v-text-anchor:top" o:gfxdata="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" filled="f" stroked="f">
-                        <v:textbox>
-                          <w:txbxContent>
-                            <w:p>
-                              <w:pPr>
-                                <w:ind w:firstLine="0"/>
-                              </w:pPr>
-                              <w:r>
-                                <w:t>HTTPS</w:t>
-                              </w:r>
-                            </w:p>
-                            <w:p/>
-                          </w:txbxContent>
-                        </v:textbox>
-                      </v:shape>
-                    </v:group>
-                    <v:shape id="Прямая со стрелкой 8" o:spid="_x0000_s1048" type="#_x0000_t32" style="position:absolute;left:14138;top:14830;width:7469;height:0;flip:x;visibility:visible;mso-wrap-style:square" o:connectortype="straight" o:gfxdata="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" strokecolor="black [3213]" strokeweight="1.5pt">
-                      <v:stroke endarrow="block" joinstyle="miter"/>
-                    </v:shape>
-                  </v:group>
-                  <v:shape id="Прямая со стрелкой 5" o:spid="_x0000_s1049" type="#_x0000_t32" style="position:absolute;left:7441;top:17453;width:0;height:6999;visibility:visible;mso-wrap-style:square" o:connectortype="straight" o:gfxdata="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" strokecolor="black [3213]" strokeweight="1.5pt">
-                    <v:stroke endarrow="block" joinstyle="miter"/>
-                  </v:shape>
-                  <v:shape id="Надпись 2" o:spid="_x0000_s1050" type="#_x0000_t202" style="position:absolute;left:6758;top:19321;width:21050;height:2762;visibility:visible;mso-wrap-style:square;v-text-anchor:top" o:gfxdata="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" filled="f" stroked="f">
-                    <v:textbox>
-                      <w:txbxContent>
-                        <w:p>
-                          <w:pPr>
-                            <w:ind w:firstLine="0"/>
-                          </w:pPr>
-                          <w:r>
-                            <w:t xml:space="preserve">REST API + </w:t>
-                          </w:r>
-                          <w:proofErr w:type="spellStart"/>
-                          <w:r>
-                            <w:t>WebSocket</w:t>
-                          </w:r>
-                          <w:proofErr w:type="spellEnd"/>
-                        </w:p>
-                        <w:p/>
-                      </w:txbxContent>
-                    </v:textbox>
-                  </v:shape>
-                </v:group>
-                <v:shape id="Прямая со стрелкой 5" o:spid="_x0000_s1051" type="#_x0000_t32" style="position:absolute;left:10144;top:36138;width:0;height:6999;visibility:visible;mso-wrap-style:square" o:connectortype="straight" o:gfxdata="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" strokecolor="black [3213]" strokeweight="1.5pt">
-                  <v:stroke endarrow="block" joinstyle="miter"/>
-                </v:shape>
-                <v:shape id="Надпись 2" o:spid="_x0000_s1052" type="#_x0000_t202" style="position:absolute;left:5526;top:38046;width:23761;height:5093;visibility:visible;mso-wrap-style:square;v-text-anchor:top" o:gfxdata="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" filled="f" stroked="f">
-                  <v:textbox style="mso-fit-shape-to-text:t">
-                    <w:txbxContent>
-                      <w:p>
-                        <w:proofErr w:type="spellStart"/>
-                        <w:r>
-                          <w:t>Firebase</w:t>
-                        </w:r>
-                        <w:proofErr w:type="spellEnd"/>
-                        <w:r>
-                          <w:t xml:space="preserve"> SDK / SQL</w:t>
-                        </w:r>
-                      </w:p>
-                      <w:p/>
-                    </w:txbxContent>
-                  </v:textbox>
-                </v:shape>
-              </v:group>
-            </w:pict>
-          </mc:Fallback>
-        </mc:AlternateContent>
-      </w:r>
-      <w:r>
-        <w:rPr>
-          <w:b/>
-          <w:bCs/>
-          <w:lang w:val="en-US"/>
-        </w:rPr>
-        <w:br w:type="page"/>
-      </w:r>
+        <w:rPr>
+          <w:lang w:val="en-US"/>
+        </w:rPr>
+      </w:pPr>
+      <w:hyperlink r:id="rId11" w:anchor="json=1XP5c9FkpmWjJ_CJQz1cI,_wsBa69sQPacTDEY2fTk6g" w:history="1">
+        <w:r>
+          <w:rPr>
+            <w:rStyle w:val="ad"/>
+            <w:b/>
+            <w:bCs/>
+            <w:lang w:val="en-US"/>
+          </w:rPr>
+          <w:t>Link</w:t>
+        </w:r>
+      </w:hyperlink>
     </w:p>
     <w:p>
       <w:pPr>
@@ -7450,7 +5217,6 @@
         </w:numPr>
       </w:pPr>
       <w:r>
-        <w:lastRenderedPageBreak/>
         <w:t>SUCCESS METRICS AND MEASUREMENTS</w:t>
       </w:r>
     </w:p>
@@ -7458,21 +5224,8 @@
       <w:pPr>
         <w:pStyle w:val="2"/>
       </w:pPr>
-      <w:proofErr w:type="spellStart"/>
-      <w:r>
-        <w:t>Technical</w:t>
-      </w:r>
-      <w:proofErr w:type="spellEnd"/>
-      <w:r>
-        <w:t xml:space="preserve"> </w:t>
-      </w:r>
-      <w:proofErr w:type="spellStart"/>
-      <w:r>
-        <w:t>Metrics</w:t>
-      </w:r>
-      <w:proofErr w:type="spellEnd"/>
-      <w:r>
-        <w:t>:</w:t>
+      <w:r>
+        <w:t>Technical Metrics:</w:t>
       </w:r>
     </w:p>
     <w:p>
@@ -7582,21 +5335,7 @@
         <w:rPr>
           <w:lang w:val="en-US"/>
         </w:rPr>
-        <w:t xml:space="preserve">Zero data loss (all workouts </w:t>
-      </w:r>
-      <w:proofErr w:type="gramStart"/>
-      <w:r>
-        <w:rPr>
-          <w:lang w:val="en-US"/>
-        </w:rPr>
-        <w:t>auto-saved</w:t>
-      </w:r>
-      <w:proofErr w:type="gramEnd"/>
-      <w:r>
-        <w:rPr>
-          <w:lang w:val="en-US"/>
-        </w:rPr>
-        <w:t>)</w:t>
+        <w:t>Zero data loss (all workouts auto-saved)</w:t>
       </w:r>
     </w:p>
     <w:p>
@@ -7735,6 +5474,7 @@
         <w:rPr>
           <w:lang w:val="en-US"/>
         </w:rPr>
+        <w:lastRenderedPageBreak/>
         <w:t>Switch between client views: &lt;2 seconds</w:t>
       </w:r>
     </w:p>
@@ -7888,21 +5628,7 @@
         <w:rPr>
           <w:lang w:val="en-US"/>
         </w:rPr>
-        <w:t>Automated testing (</w:t>
-      </w:r>
-      <w:proofErr w:type="spellStart"/>
-      <w:r>
-        <w:rPr>
-          <w:lang w:val="en-US"/>
-        </w:rPr>
-        <w:t>pytest</w:t>
-      </w:r>
-      <w:proofErr w:type="spellEnd"/>
-      <w:r>
-        <w:rPr>
-          <w:lang w:val="en-US"/>
-        </w:rPr>
-        <w:t>, Jest)</w:t>
+        <w:t>Automated testing (pytest, Jest)</w:t>
       </w:r>
     </w:p>
     <w:p>
@@ -7954,21 +5680,7 @@
         <w:rPr>
           <w:lang w:val="en-US"/>
         </w:rPr>
-        <w:t>Code coverage reports (</w:t>
-      </w:r>
-      <w:proofErr w:type="spellStart"/>
-      <w:r>
-        <w:rPr>
-          <w:lang w:val="en-US"/>
-        </w:rPr>
-        <w:t>pytest-cov</w:t>
-      </w:r>
-      <w:proofErr w:type="spellEnd"/>
-      <w:r>
-        <w:rPr>
-          <w:lang w:val="en-US"/>
-        </w:rPr>
-        <w:t>)</w:t>
+        <w:t>Code coverage reports (pytest-cov)</w:t>
       </w:r>
     </w:p>
     <w:p>
@@ -8084,7 +5796,6 @@
                 <w:szCs w:val="22"/>
               </w:rPr>
             </w:pPr>
-            <w:proofErr w:type="spellStart"/>
             <w:r>
               <w:rPr>
                 <w:sz w:val="24"/>
@@ -8092,7 +5803,6 @@
               </w:rPr>
               <w:t>Description</w:t>
             </w:r>
-            <w:proofErr w:type="spellEnd"/>
           </w:p>
         </w:tc>
         <w:tc>
@@ -8117,37 +5827,12 @@
                 <w:szCs w:val="22"/>
               </w:rPr>
             </w:pPr>
-            <w:proofErr w:type="spellStart"/>
             <w:r>
               <w:rPr>
                 <w:sz w:val="24"/>
                 <w:szCs w:val="22"/>
               </w:rPr>
-              <w:t>Severity</w:t>
-            </w:r>
-            <w:proofErr w:type="spellEnd"/>
-            <w:r>
-              <w:rPr>
-                <w:sz w:val="24"/>
-                <w:szCs w:val="22"/>
-              </w:rPr>
-              <w:t xml:space="preserve"> (</w:t>
-            </w:r>
-            <w:proofErr w:type="gramStart"/>
-            <w:r>
-              <w:rPr>
-                <w:sz w:val="24"/>
-                <w:szCs w:val="22"/>
-              </w:rPr>
-              <w:t>0-1</w:t>
-            </w:r>
-            <w:proofErr w:type="gramEnd"/>
-            <w:r>
-              <w:rPr>
-                <w:sz w:val="24"/>
-                <w:szCs w:val="22"/>
-              </w:rPr>
-              <w:t>)</w:t>
+              <w:t>Severity (0-1)</w:t>
             </w:r>
           </w:p>
         </w:tc>
@@ -8173,37 +5858,12 @@
                 <w:szCs w:val="22"/>
               </w:rPr>
             </w:pPr>
-            <w:proofErr w:type="spellStart"/>
             <w:r>
               <w:rPr>
                 <w:sz w:val="24"/>
                 <w:szCs w:val="22"/>
               </w:rPr>
-              <w:t>Probability</w:t>
-            </w:r>
-            <w:proofErr w:type="spellEnd"/>
-            <w:r>
-              <w:rPr>
-                <w:sz w:val="24"/>
-                <w:szCs w:val="22"/>
-              </w:rPr>
-              <w:t xml:space="preserve"> (</w:t>
-            </w:r>
-            <w:proofErr w:type="gramStart"/>
-            <w:r>
-              <w:rPr>
-                <w:sz w:val="24"/>
-                <w:szCs w:val="22"/>
-              </w:rPr>
-              <w:t>0-1</w:t>
-            </w:r>
-            <w:proofErr w:type="gramEnd"/>
-            <w:r>
-              <w:rPr>
-                <w:sz w:val="24"/>
-                <w:szCs w:val="22"/>
-              </w:rPr>
-              <w:t>)</w:t>
+              <w:t>Probability (0-1)</w:t>
             </w:r>
           </w:p>
         </w:tc>
@@ -8260,21 +5920,12 @@
                 <w:szCs w:val="22"/>
               </w:rPr>
             </w:pPr>
-            <w:proofErr w:type="spellStart"/>
             <w:r>
               <w:rPr>
                 <w:sz w:val="24"/>
                 <w:szCs w:val="22"/>
               </w:rPr>
-              <w:t>Mitigation</w:t>
-            </w:r>
-            <w:proofErr w:type="spellEnd"/>
-            <w:r>
-              <w:rPr>
-                <w:sz w:val="24"/>
-                <w:szCs w:val="22"/>
-              </w:rPr>
-              <w:t xml:space="preserve"> Strategy</w:t>
+              <w:t>Mitigation Strategy</w:t>
             </w:r>
           </w:p>
         </w:tc>
@@ -8307,33 +5958,8 @@
                 <w:sz w:val="24"/>
                 <w:szCs w:val="22"/>
               </w:rPr>
-              <w:t xml:space="preserve">R1: </w:t>
+              <w:t>R1: Split-screen complexity</w:t>
             </w:r>
-            <w:proofErr w:type="spellStart"/>
-            <w:r>
-              <w:rPr>
-                <w:sz w:val="24"/>
-                <w:szCs w:val="22"/>
-              </w:rPr>
-              <w:t>Split-screen</w:t>
-            </w:r>
-            <w:proofErr w:type="spellEnd"/>
-            <w:r>
-              <w:rPr>
-                <w:sz w:val="24"/>
-                <w:szCs w:val="22"/>
-              </w:rPr>
-              <w:t xml:space="preserve"> </w:t>
-            </w:r>
-            <w:proofErr w:type="spellStart"/>
-            <w:r>
-              <w:rPr>
-                <w:sz w:val="24"/>
-                <w:szCs w:val="22"/>
-              </w:rPr>
-              <w:t>complexity</w:t>
-            </w:r>
-            <w:proofErr w:type="spellEnd"/>
           </w:p>
         </w:tc>
         <w:tc>
@@ -8551,33 +6177,8 @@
                 <w:sz w:val="24"/>
                 <w:szCs w:val="22"/>
               </w:rPr>
-              <w:t xml:space="preserve">R2: Data </w:t>
+              <w:t>R2: Data model complexity</w:t>
             </w:r>
-            <w:proofErr w:type="spellStart"/>
-            <w:r>
-              <w:rPr>
-                <w:sz w:val="24"/>
-                <w:szCs w:val="22"/>
-              </w:rPr>
-              <w:t>model</w:t>
-            </w:r>
-            <w:proofErr w:type="spellEnd"/>
-            <w:r>
-              <w:rPr>
-                <w:sz w:val="24"/>
-                <w:szCs w:val="22"/>
-              </w:rPr>
-              <w:t xml:space="preserve"> </w:t>
-            </w:r>
-            <w:proofErr w:type="spellStart"/>
-            <w:r>
-              <w:rPr>
-                <w:sz w:val="24"/>
-                <w:szCs w:val="22"/>
-              </w:rPr>
-              <w:t>complexity</w:t>
-            </w:r>
-            <w:proofErr w:type="spellEnd"/>
           </w:p>
         </w:tc>
         <w:tc>
@@ -9016,49 +6617,8 @@
                 <w:sz w:val="24"/>
                 <w:szCs w:val="22"/>
               </w:rPr>
-              <w:t xml:space="preserve">R4: </w:t>
+              <w:t>R4: Trainer workflow mismatch</w:t>
             </w:r>
-            <w:proofErr w:type="spellStart"/>
-            <w:r>
-              <w:rPr>
-                <w:sz w:val="24"/>
-                <w:szCs w:val="22"/>
-              </w:rPr>
-              <w:t>Trainer</w:t>
-            </w:r>
-            <w:proofErr w:type="spellEnd"/>
-            <w:r>
-              <w:rPr>
-                <w:sz w:val="24"/>
-                <w:szCs w:val="22"/>
-              </w:rPr>
-              <w:t xml:space="preserve"> </w:t>
-            </w:r>
-            <w:proofErr w:type="spellStart"/>
-            <w:r>
-              <w:rPr>
-                <w:sz w:val="24"/>
-                <w:szCs w:val="22"/>
-              </w:rPr>
-              <w:t>workflow</w:t>
-            </w:r>
-            <w:proofErr w:type="spellEnd"/>
-            <w:r>
-              <w:rPr>
-                <w:sz w:val="24"/>
-                <w:szCs w:val="22"/>
-              </w:rPr>
-              <w:t xml:space="preserve"> </w:t>
-            </w:r>
-            <w:proofErr w:type="spellStart"/>
-            <w:r>
-              <w:rPr>
-                <w:sz w:val="24"/>
-                <w:szCs w:val="22"/>
-              </w:rPr>
-              <w:t>mismatch</w:t>
-            </w:r>
-            <w:proofErr w:type="spellEnd"/>
           </w:p>
         </w:tc>
         <w:tc>
@@ -9497,17 +7057,8 @@
                 <w:sz w:val="24"/>
                 <w:szCs w:val="22"/>
               </w:rPr>
-              <w:t xml:space="preserve">R6: Time </w:t>
+              <w:t>R6: Time constraint</w:t>
             </w:r>
-            <w:proofErr w:type="spellStart"/>
-            <w:r>
-              <w:rPr>
-                <w:sz w:val="24"/>
-                <w:szCs w:val="22"/>
-              </w:rPr>
-              <w:t>constraint</w:t>
-            </w:r>
-            <w:proofErr w:type="spellEnd"/>
           </w:p>
         </w:tc>
         <w:tc>
@@ -9665,25 +7216,7 @@
                 <w:szCs w:val="22"/>
                 <w:lang w:val="en-US"/>
               </w:rPr>
-              <w:t>- Prioritize core features (</w:t>
-            </w:r>
-            <w:proofErr w:type="spellStart"/>
-            <w:r>
-              <w:rPr>
-                <w:sz w:val="24"/>
-                <w:szCs w:val="22"/>
-                <w:lang w:val="en-US"/>
-              </w:rPr>
-              <w:t>MoSCoW</w:t>
-            </w:r>
-            <w:proofErr w:type="spellEnd"/>
-            <w:r>
-              <w:rPr>
-                <w:sz w:val="24"/>
-                <w:szCs w:val="22"/>
-                <w:lang w:val="en-US"/>
-              </w:rPr>
-              <w:t>)</w:t>
+              <w:t>- Prioritize core features (MoSCoW)</w:t>
             </w:r>
             <w:r>
               <w:rPr>
@@ -9743,33 +7276,8 @@
                 <w:sz w:val="24"/>
                 <w:szCs w:val="22"/>
               </w:rPr>
-              <w:t xml:space="preserve">R7: AI </w:t>
+              <w:t>R7: AI code quality</w:t>
             </w:r>
-            <w:proofErr w:type="spellStart"/>
-            <w:r>
-              <w:rPr>
-                <w:sz w:val="24"/>
-                <w:szCs w:val="22"/>
-              </w:rPr>
-              <w:t>code</w:t>
-            </w:r>
-            <w:proofErr w:type="spellEnd"/>
-            <w:r>
-              <w:rPr>
-                <w:sz w:val="24"/>
-                <w:szCs w:val="22"/>
-              </w:rPr>
-              <w:t xml:space="preserve"> </w:t>
-            </w:r>
-            <w:proofErr w:type="spellStart"/>
-            <w:r>
-              <w:rPr>
-                <w:sz w:val="24"/>
-                <w:szCs w:val="22"/>
-              </w:rPr>
-              <w:t>quality</w:t>
-            </w:r>
-            <w:proofErr w:type="spellEnd"/>
           </w:p>
         </w:tc>
         <w:tc>
@@ -9987,17 +7495,8 @@
                 <w:sz w:val="24"/>
                 <w:szCs w:val="22"/>
               </w:rPr>
-              <w:t xml:space="preserve">R8: Database </w:t>
+              <w:t>R8: Database choice</w:t>
             </w:r>
-            <w:proofErr w:type="spellStart"/>
-            <w:r>
-              <w:rPr>
-                <w:sz w:val="24"/>
-                <w:szCs w:val="22"/>
-              </w:rPr>
-              <w:t>choice</w:t>
-            </w:r>
-            <w:proofErr w:type="spellEnd"/>
           </w:p>
         </w:tc>
         <w:tc>
@@ -10209,53 +7708,24 @@
     <w:p>
       <w:pPr>
         <w:rPr>
+          <w:lang w:val="en-US"/>
+        </w:rPr>
+      </w:pPr>
+      <w:r>
+        <w:rPr>
           <w:b/>
           <w:bCs/>
           <w:lang w:val="en-US"/>
         </w:rPr>
-      </w:pPr>
-    </w:p>
-    <w:p>
-      <w:pPr>
-        <w:spacing w:after="160" w:line="278" w:lineRule="auto"/>
-        <w:ind w:firstLine="0"/>
-        <w:jc w:val="left"/>
+        <w:lastRenderedPageBreak/>
+        <w:t>References</w:t>
+      </w:r>
+      <w:r>
         <w:rPr>
           <w:b/>
           <w:bCs/>
           <w:lang w:val="en-US"/>
         </w:rPr>
-      </w:pPr>
-      <w:r>
-        <w:rPr>
-          <w:b/>
-          <w:bCs/>
-          <w:lang w:val="en-US"/>
-        </w:rPr>
-        <w:br w:type="page"/>
-      </w:r>
-    </w:p>
-    <w:p>
-      <w:pPr>
-        <w:rPr>
-          <w:lang w:val="en-US"/>
-        </w:rPr>
-      </w:pPr>
-      <w:r>
-        <w:rPr>
-          <w:b/>
-          <w:bCs/>
-          <w:lang w:val="en-US"/>
-        </w:rPr>
-        <w:lastRenderedPageBreak/>
-        <w:t>References</w:t>
-      </w:r>
-      <w:r>
-        <w:rPr>
-          <w:b/>
-          <w:bCs/>
-          <w:lang w:val="en-US"/>
-        </w:rPr>
         <w:t>:</w:t>
       </w:r>
     </w:p>
@@ -10269,21 +7739,7 @@
         <w:rPr>
           <w:lang w:val="en-US"/>
         </w:rPr>
-        <w:t xml:space="preserve">Nottingham, S. L., Lam, K. C., </w:t>
-      </w:r>
-      <w:proofErr w:type="spellStart"/>
-      <w:r>
-        <w:rPr>
-          <w:lang w:val="en-US"/>
-        </w:rPr>
-        <w:t>Kasamatsu</w:t>
-      </w:r>
-      <w:proofErr w:type="spellEnd"/>
-      <w:r>
-        <w:rPr>
-          <w:lang w:val="en-US"/>
-        </w:rPr>
-        <w:t>, T. M., Eppelheimer, B. L., &amp; Welch Bacon, C. E. (2017). Athletic Trainers' Reasons for and Mechanics of Documenting Patient Care. </w:t>
+        <w:t>Nottingham, S. L., Lam, K. C., Kasamatsu, T. M., Eppelheimer, B. L., &amp; Welch Bacon, C. E. (2017). Athletic Trainers' Reasons for and Mechanics of Documenting Patient Care. </w:t>
       </w:r>
       <w:r>
         <w:rPr>
@@ -10319,23 +7775,8 @@
         <w:rPr>
           <w:lang w:val="en-US"/>
         </w:rPr>
-        <w:t>García-Fernández, J., Gálvez-Ruiz, P., Bohórquez, M. R., Grimaldi-</w:t>
-      </w:r>
-      <w:proofErr w:type="spellStart"/>
-      <w:r>
-        <w:rPr>
-          <w:lang w:val="en-US"/>
-        </w:rPr>
-        <w:t>Puyana</w:t>
-      </w:r>
-      <w:proofErr w:type="spellEnd"/>
-      <w:r>
-        <w:rPr>
-          <w:lang w:val="en-US"/>
-        </w:rPr>
-        <w:t>, M., &amp; Cepeda-Carrión, I. (2020). The Relationship between Technological Capabilities and Organizational Impact: Direct and Indirect Routes for Employed and Self-Employed Personal Fitness Trainers. </w:t>
-      </w:r>
-      <w:proofErr w:type="spellStart"/>
+        <w:t>García-Fernández, J., Gálvez-Ruiz, P., Bohórquez, M. R., Grimaldi-Puyana, M., &amp; Cepeda-Carrión, I. (2020). The Relationship between Technological Capabilities and Organizational Impact: Direct and Indirect Routes for Employed and Self-Employed Personal Fitness Trainers. </w:t>
+      </w:r>
       <w:r>
         <w:rPr>
           <w:i/>
@@ -10343,7 +7784,6 @@
         </w:rPr>
         <w:t>Sustainability</w:t>
       </w:r>
-      <w:proofErr w:type="spellEnd"/>
       <w:r>
         <w:t>, </w:t>
       </w:r>

</xml_diff>

<commit_message>
ASPM25T10-61 ASPM25T10-62 ASPM25T10-63 #done #comment Implemented complete trainee login authentication. Added Maya Levi seed user, TraineeDashboard, and ensured role-based routing.
</commit_message>
<xml_diff>
--- a/docs/charter_2025-6_group10.docx
+++ b/docs/charter_2025-6_group10.docx
@@ -21,11 +21,19 @@
           <w:lang w:val="en-US"/>
         </w:rPr>
       </w:pPr>
-      <w:r>
-        <w:rPr>
-          <w:lang w:val="en-US"/>
-        </w:rPr>
-        <w:t xml:space="preserve">FitCoach </w:t>
+      <w:proofErr w:type="spellStart"/>
+      <w:r>
+        <w:rPr>
+          <w:lang w:val="en-US"/>
+        </w:rPr>
+        <w:t>FitCoach</w:t>
+      </w:r>
+      <w:proofErr w:type="spellEnd"/>
+      <w:r>
+        <w:rPr>
+          <w:lang w:val="en-US"/>
+        </w:rPr>
+        <w:t xml:space="preserve"> </w:t>
       </w:r>
       <w:r>
         <w:rPr>
@@ -86,8 +94,16 @@
         <w:rPr>
           <w:lang w:val="en-US"/>
         </w:rPr>
-        <w:t>Michail Tuchinski</w:t>
-      </w:r>
+        <w:t xml:space="preserve">Michail </w:t>
+      </w:r>
+      <w:proofErr w:type="spellStart"/>
+      <w:r>
+        <w:rPr>
+          <w:lang w:val="en-US"/>
+        </w:rPr>
+        <w:t>Tuchinski</w:t>
+      </w:r>
+      <w:proofErr w:type="spellEnd"/>
     </w:p>
     <w:p>
       <w:pPr>
@@ -217,12 +233,28 @@
           <w:lang w:val="en-US"/>
         </w:rPr>
       </w:pPr>
-      <w:r>
-        <w:rPr>
-          <w:lang w:val="en-US"/>
-        </w:rPr>
-        <w:t>Yavgeni Karavkin</w:t>
-      </w:r>
+      <w:proofErr w:type="spellStart"/>
+      <w:r>
+        <w:rPr>
+          <w:lang w:val="en-US"/>
+        </w:rPr>
+        <w:t>Yavgeni</w:t>
+      </w:r>
+      <w:proofErr w:type="spellEnd"/>
+      <w:r>
+        <w:rPr>
+          <w:lang w:val="en-US"/>
+        </w:rPr>
+        <w:t xml:space="preserve"> </w:t>
+      </w:r>
+      <w:proofErr w:type="spellStart"/>
+      <w:r>
+        <w:rPr>
+          <w:lang w:val="en-US"/>
+        </w:rPr>
+        <w:t>Karavkin</w:t>
+      </w:r>
+      <w:proofErr w:type="spellEnd"/>
     </w:p>
     <w:p>
       <w:pPr>
@@ -644,7 +676,15 @@
         </w:rPr>
       </w:pPr>
       <w:r>
-        <w:t>ABSTRACT (Executive Summary) - Product Vision</w:t>
+        <w:t xml:space="preserve">ABSTRACT (Executive </w:t>
+      </w:r>
+      <w:proofErr w:type="spellStart"/>
+      <w:r>
+        <w:t>Summary</w:t>
+      </w:r>
+      <w:proofErr w:type="spellEnd"/>
+      <w:r>
+        <w:t>) - Product Vision</w:t>
       </w:r>
     </w:p>
     <w:p>
@@ -723,12 +763,14 @@
         </w:rPr>
         <w:t xml:space="preserve"> </w:t>
       </w:r>
+      <w:proofErr w:type="spellStart"/>
       <w:r>
         <w:rPr>
           <w:lang w:val="en-US"/>
         </w:rPr>
         <w:t>FitCoach</w:t>
       </w:r>
+      <w:proofErr w:type="spellEnd"/>
       <w:r>
         <w:rPr>
           <w:lang w:val="en-US"/>
@@ -823,12 +865,14 @@
         </w:rPr>
         <w:t xml:space="preserve">The </w:t>
       </w:r>
+      <w:proofErr w:type="spellStart"/>
       <w:r>
         <w:rPr>
           <w:lang w:val="en-US"/>
         </w:rPr>
         <w:t>FitCoach</w:t>
       </w:r>
+      <w:proofErr w:type="spellEnd"/>
       <w:r>
         <w:rPr>
           <w:lang w:val="en-US"/>
@@ -2448,6 +2492,7 @@
           <w:lang w:val="en-US"/>
         </w:rPr>
       </w:pPr>
+      <w:proofErr w:type="spellStart"/>
       <w:r>
         <w:rPr>
           <w:b/>
@@ -2456,6 +2501,7 @@
         </w:rPr>
         <w:t>Trainerize</w:t>
       </w:r>
+      <w:proofErr w:type="spellEnd"/>
     </w:p>
     <w:p>
       <w:pPr>
@@ -2554,6 +2600,7 @@
           <w:lang w:val="en-US"/>
         </w:rPr>
       </w:pPr>
+      <w:proofErr w:type="spellStart"/>
       <w:r>
         <w:rPr>
           <w:b/>
@@ -2562,6 +2609,7 @@
         </w:rPr>
         <w:t>TrueCoach</w:t>
       </w:r>
+      <w:proofErr w:type="spellEnd"/>
     </w:p>
     <w:p>
       <w:pPr>
@@ -2740,8 +2788,21 @@
           <w:numId w:val="18"/>
         </w:numPr>
       </w:pPr>
-      <w:r>
-        <w:t>Trainers must:</w:t>
+      <w:proofErr w:type="spellStart"/>
+      <w:r>
+        <w:t>Trainers</w:t>
+      </w:r>
+      <w:proofErr w:type="spellEnd"/>
+      <w:r>
+        <w:t xml:space="preserve"> </w:t>
+      </w:r>
+      <w:proofErr w:type="spellStart"/>
+      <w:r>
+        <w:t>must</w:t>
+      </w:r>
+      <w:proofErr w:type="spellEnd"/>
+      <w:r>
+        <w:t>:</w:t>
       </w:r>
     </w:p>
     <w:p>
@@ -2751,9 +2812,35 @@
           <w:numId w:val="18"/>
         </w:numPr>
       </w:pPr>
-      <w:r>
-        <w:t>switch between client profiles</w:t>
-      </w:r>
+      <w:proofErr w:type="spellStart"/>
+      <w:r>
+        <w:t>switch</w:t>
+      </w:r>
+      <w:proofErr w:type="spellEnd"/>
+      <w:r>
+        <w:t xml:space="preserve"> </w:t>
+      </w:r>
+      <w:proofErr w:type="spellStart"/>
+      <w:r>
+        <w:t>between</w:t>
+      </w:r>
+      <w:proofErr w:type="spellEnd"/>
+      <w:r>
+        <w:t xml:space="preserve"> </w:t>
+      </w:r>
+      <w:proofErr w:type="spellStart"/>
+      <w:r>
+        <w:t>client</w:t>
+      </w:r>
+      <w:proofErr w:type="spellEnd"/>
+      <w:r>
+        <w:t xml:space="preserve"> </w:t>
+      </w:r>
+      <w:proofErr w:type="spellStart"/>
+      <w:r>
+        <w:t>profiles</w:t>
+      </w:r>
+      <w:proofErr w:type="spellEnd"/>
     </w:p>
     <w:p>
       <w:pPr>
@@ -2762,9 +2849,27 @@
           <w:numId w:val="18"/>
         </w:numPr>
       </w:pPr>
-      <w:r>
-        <w:t>use multiple devices</w:t>
-      </w:r>
+      <w:proofErr w:type="spellStart"/>
+      <w:r>
+        <w:t>use</w:t>
+      </w:r>
+      <w:proofErr w:type="spellEnd"/>
+      <w:r>
+        <w:t xml:space="preserve"> </w:t>
+      </w:r>
+      <w:proofErr w:type="spellStart"/>
+      <w:r>
+        <w:t>multiple</w:t>
+      </w:r>
+      <w:proofErr w:type="spellEnd"/>
+      <w:r>
+        <w:t xml:space="preserve"> </w:t>
+      </w:r>
+      <w:proofErr w:type="spellStart"/>
+      <w:r>
+        <w:t>devices</w:t>
+      </w:r>
+      <w:proofErr w:type="spellEnd"/>
     </w:p>
     <w:p>
       <w:pPr>
@@ -2773,9 +2878,43 @@
           <w:numId w:val="18"/>
         </w:numPr>
       </w:pPr>
-      <w:r>
-        <w:t>rely on memory or paper</w:t>
-      </w:r>
+      <w:proofErr w:type="spellStart"/>
+      <w:r>
+        <w:t>rely</w:t>
+      </w:r>
+      <w:proofErr w:type="spellEnd"/>
+      <w:r>
+        <w:t xml:space="preserve"> </w:t>
+      </w:r>
+      <w:proofErr w:type="spellStart"/>
+      <w:r>
+        <w:t>on</w:t>
+      </w:r>
+      <w:proofErr w:type="spellEnd"/>
+      <w:r>
+        <w:t xml:space="preserve"> </w:t>
+      </w:r>
+      <w:proofErr w:type="spellStart"/>
+      <w:r>
+        <w:t>memory</w:t>
+      </w:r>
+      <w:proofErr w:type="spellEnd"/>
+      <w:r>
+        <w:t xml:space="preserve"> </w:t>
+      </w:r>
+      <w:proofErr w:type="spellStart"/>
+      <w:r>
+        <w:t>or</w:t>
+      </w:r>
+      <w:proofErr w:type="spellEnd"/>
+      <w:r>
+        <w:t xml:space="preserve"> </w:t>
+      </w:r>
+      <w:proofErr w:type="spellStart"/>
+      <w:r>
+        <w:t>paper</w:t>
+      </w:r>
+      <w:proofErr w:type="spellEnd"/>
     </w:p>
     <w:p>
       <w:pPr>
@@ -2833,9 +2972,19 @@
           <w:numId w:val="19"/>
         </w:numPr>
       </w:pPr>
-      <w:r>
-        <w:t>different programs</w:t>
-      </w:r>
+      <w:proofErr w:type="spellStart"/>
+      <w:r>
+        <w:t>different</w:t>
+      </w:r>
+      <w:proofErr w:type="spellEnd"/>
+      <w:r>
+        <w:t xml:space="preserve"> </w:t>
+      </w:r>
+      <w:proofErr w:type="spellStart"/>
+      <w:r>
+        <w:t>programs</w:t>
+      </w:r>
+      <w:proofErr w:type="spellEnd"/>
     </w:p>
     <w:p>
       <w:pPr>
@@ -2844,9 +2993,27 @@
           <w:numId w:val="19"/>
         </w:numPr>
       </w:pPr>
-      <w:r>
-        <w:t>different reps / weights</w:t>
-      </w:r>
+      <w:proofErr w:type="spellStart"/>
+      <w:r>
+        <w:t>different</w:t>
+      </w:r>
+      <w:proofErr w:type="spellEnd"/>
+      <w:r>
+        <w:t xml:space="preserve"> </w:t>
+      </w:r>
+      <w:proofErr w:type="spellStart"/>
+      <w:r>
+        <w:t>reps</w:t>
+      </w:r>
+      <w:proofErr w:type="spellEnd"/>
+      <w:r>
+        <w:t xml:space="preserve"> / </w:t>
+      </w:r>
+      <w:proofErr w:type="spellStart"/>
+      <w:r>
+        <w:t>weights</w:t>
+      </w:r>
+      <w:proofErr w:type="spellEnd"/>
     </w:p>
     <w:p>
       <w:pPr>
@@ -2855,9 +3022,27 @@
           <w:numId w:val="19"/>
         </w:numPr>
       </w:pPr>
-      <w:r>
-        <w:t>different progression levels</w:t>
-      </w:r>
+      <w:proofErr w:type="spellStart"/>
+      <w:r>
+        <w:t>different</w:t>
+      </w:r>
+      <w:proofErr w:type="spellEnd"/>
+      <w:r>
+        <w:t xml:space="preserve"> </w:t>
+      </w:r>
+      <w:proofErr w:type="spellStart"/>
+      <w:r>
+        <w:t>progression</w:t>
+      </w:r>
+      <w:proofErr w:type="spellEnd"/>
+      <w:r>
+        <w:t xml:space="preserve"> </w:t>
+      </w:r>
+      <w:proofErr w:type="spellStart"/>
+      <w:r>
+        <w:t>levels</w:t>
+      </w:r>
+      <w:proofErr w:type="spellEnd"/>
     </w:p>
     <w:p>
       <w:pPr>
@@ -2884,8 +3069,29 @@
           <w:numId w:val="20"/>
         </w:numPr>
       </w:pPr>
-      <w:r>
-        <w:t>Trainers spend time:</w:t>
+      <w:proofErr w:type="spellStart"/>
+      <w:r>
+        <w:t>Trainers</w:t>
+      </w:r>
+      <w:proofErr w:type="spellEnd"/>
+      <w:r>
+        <w:t xml:space="preserve"> </w:t>
+      </w:r>
+      <w:proofErr w:type="spellStart"/>
+      <w:r>
+        <w:t>spend</w:t>
+      </w:r>
+      <w:proofErr w:type="spellEnd"/>
+      <w:r>
+        <w:t xml:space="preserve"> </w:t>
+      </w:r>
+      <w:proofErr w:type="spellStart"/>
+      <w:r>
+        <w:t>time</w:t>
+      </w:r>
+      <w:proofErr w:type="spellEnd"/>
+      <w:r>
+        <w:t>:</w:t>
       </w:r>
     </w:p>
     <w:p>
@@ -2895,9 +3101,19 @@
           <w:numId w:val="20"/>
         </w:numPr>
       </w:pPr>
-      <w:r>
-        <w:t>navigating apps</w:t>
-      </w:r>
+      <w:proofErr w:type="spellStart"/>
+      <w:r>
+        <w:t>navigating</w:t>
+      </w:r>
+      <w:proofErr w:type="spellEnd"/>
+      <w:r>
+        <w:t xml:space="preserve"> </w:t>
+      </w:r>
+      <w:proofErr w:type="spellStart"/>
+      <w:r>
+        <w:t>apps</w:t>
+      </w:r>
+      <w:proofErr w:type="spellEnd"/>
     </w:p>
     <w:p>
       <w:pPr>
@@ -2906,9 +3122,27 @@
           <w:numId w:val="20"/>
         </w:numPr>
       </w:pPr>
-      <w:r>
-        <w:t>searching client data</w:t>
-      </w:r>
+      <w:proofErr w:type="spellStart"/>
+      <w:r>
+        <w:t>searching</w:t>
+      </w:r>
+      <w:proofErr w:type="spellEnd"/>
+      <w:r>
+        <w:t xml:space="preserve"> </w:t>
+      </w:r>
+      <w:proofErr w:type="spellStart"/>
+      <w:r>
+        <w:t>client</w:t>
+      </w:r>
+      <w:proofErr w:type="spellEnd"/>
+      <w:r>
+        <w:t xml:space="preserve"> </w:t>
+      </w:r>
+      <w:proofErr w:type="spellStart"/>
+      <w:r>
+        <w:t>data</w:t>
+      </w:r>
+      <w:proofErr w:type="spellEnd"/>
     </w:p>
     <w:p>
       <w:pPr>
@@ -2917,9 +3151,35 @@
           <w:numId w:val="20"/>
         </w:numPr>
       </w:pPr>
-      <w:r>
-        <w:t>logging manually after sessions</w:t>
-      </w:r>
+      <w:proofErr w:type="spellStart"/>
+      <w:r>
+        <w:t>logging</w:t>
+      </w:r>
+      <w:proofErr w:type="spellEnd"/>
+      <w:r>
+        <w:t xml:space="preserve"> </w:t>
+      </w:r>
+      <w:proofErr w:type="spellStart"/>
+      <w:r>
+        <w:t>manually</w:t>
+      </w:r>
+      <w:proofErr w:type="spellEnd"/>
+      <w:r>
+        <w:t xml:space="preserve"> </w:t>
+      </w:r>
+      <w:proofErr w:type="spellStart"/>
+      <w:r>
+        <w:t>after</w:t>
+      </w:r>
+      <w:proofErr w:type="spellEnd"/>
+      <w:r>
+        <w:t xml:space="preserve"> </w:t>
+      </w:r>
+      <w:proofErr w:type="spellStart"/>
+      <w:r>
+        <w:t>sessions</w:t>
+      </w:r>
+      <w:proofErr w:type="spellEnd"/>
     </w:p>
     <w:p>
       <w:pPr>
@@ -2946,8 +3206,37 @@
           <w:numId w:val="21"/>
         </w:numPr>
       </w:pPr>
-      <w:r>
-        <w:t>Apps are optimized for:</w:t>
+      <w:proofErr w:type="spellStart"/>
+      <w:r>
+        <w:t>Apps</w:t>
+      </w:r>
+      <w:proofErr w:type="spellEnd"/>
+      <w:r>
+        <w:t xml:space="preserve"> </w:t>
+      </w:r>
+      <w:proofErr w:type="spellStart"/>
+      <w:r>
+        <w:t>are</w:t>
+      </w:r>
+      <w:proofErr w:type="spellEnd"/>
+      <w:r>
+        <w:t xml:space="preserve"> </w:t>
+      </w:r>
+      <w:proofErr w:type="spellStart"/>
+      <w:r>
+        <w:t>optimized</w:t>
+      </w:r>
+      <w:proofErr w:type="spellEnd"/>
+      <w:r>
+        <w:t xml:space="preserve"> </w:t>
+      </w:r>
+      <w:proofErr w:type="spellStart"/>
+      <w:r>
+        <w:t>for</w:t>
+      </w:r>
+      <w:proofErr w:type="spellEnd"/>
+      <w:r>
+        <w:t>:</w:t>
       </w:r>
     </w:p>
     <w:p>
@@ -2957,9 +3246,19 @@
           <w:numId w:val="21"/>
         </w:numPr>
       </w:pPr>
-      <w:r>
-        <w:t>before-session planning</w:t>
-      </w:r>
+      <w:proofErr w:type="spellStart"/>
+      <w:r>
+        <w:t>before-session</w:t>
+      </w:r>
+      <w:proofErr w:type="spellEnd"/>
+      <w:r>
+        <w:t xml:space="preserve"> </w:t>
+      </w:r>
+      <w:proofErr w:type="spellStart"/>
+      <w:r>
+        <w:t>planning</w:t>
+      </w:r>
+      <w:proofErr w:type="spellEnd"/>
     </w:p>
     <w:p>
       <w:pPr>
@@ -2968,9 +3267,19 @@
           <w:numId w:val="21"/>
         </w:numPr>
       </w:pPr>
-      <w:r>
-        <w:t>after-session review</w:t>
-      </w:r>
+      <w:proofErr w:type="spellStart"/>
+      <w:r>
+        <w:t>after-session</w:t>
+      </w:r>
+      <w:proofErr w:type="spellEnd"/>
+      <w:r>
+        <w:t xml:space="preserve"> </w:t>
+      </w:r>
+      <w:proofErr w:type="spellStart"/>
+      <w:r>
+        <w:t>review</w:t>
+      </w:r>
+      <w:proofErr w:type="spellEnd"/>
     </w:p>
     <w:p>
       <w:pPr>
@@ -3015,7 +3324,23 @@
         </w:numPr>
       </w:pPr>
       <w:r>
-        <w:t>No concept of:</w:t>
+        <w:t xml:space="preserve">No </w:t>
+      </w:r>
+      <w:proofErr w:type="spellStart"/>
+      <w:r>
+        <w:t>concept</w:t>
+      </w:r>
+      <w:proofErr w:type="spellEnd"/>
+      <w:r>
+        <w:t xml:space="preserve"> </w:t>
+      </w:r>
+      <w:proofErr w:type="spellStart"/>
+      <w:r>
+        <w:t>of</w:t>
+      </w:r>
+      <w:proofErr w:type="spellEnd"/>
+      <w:r>
+        <w:t>:</w:t>
       </w:r>
     </w:p>
     <w:p>
@@ -3025,10 +3350,28 @@
           <w:numId w:val="22"/>
         </w:numPr>
       </w:pPr>
+      <w:proofErr w:type="spellStart"/>
       <w:r>
         <w:lastRenderedPageBreak/>
-        <w:t>shared session context</w:t>
-      </w:r>
+        <w:t>shared</w:t>
+      </w:r>
+      <w:proofErr w:type="spellEnd"/>
+      <w:r>
+        <w:t xml:space="preserve"> </w:t>
+      </w:r>
+      <w:proofErr w:type="spellStart"/>
+      <w:r>
+        <w:t>session</w:t>
+      </w:r>
+      <w:proofErr w:type="spellEnd"/>
+      <w:r>
+        <w:t xml:space="preserve"> </w:t>
+      </w:r>
+      <w:proofErr w:type="spellStart"/>
+      <w:r>
+        <w:t>context</w:t>
+      </w:r>
+      <w:proofErr w:type="spellEnd"/>
     </w:p>
     <w:p>
       <w:pPr>
@@ -3037,9 +3380,35 @@
           <w:numId w:val="22"/>
         </w:numPr>
       </w:pPr>
-      <w:r>
-        <w:t>synchronized start / rest times</w:t>
-      </w:r>
+      <w:proofErr w:type="spellStart"/>
+      <w:r>
+        <w:t>synchronized</w:t>
+      </w:r>
+      <w:proofErr w:type="spellEnd"/>
+      <w:r>
+        <w:t xml:space="preserve"> </w:t>
+      </w:r>
+      <w:proofErr w:type="spellStart"/>
+      <w:r>
+        <w:t>start</w:t>
+      </w:r>
+      <w:proofErr w:type="spellEnd"/>
+      <w:r>
+        <w:t xml:space="preserve"> / </w:t>
+      </w:r>
+      <w:proofErr w:type="spellStart"/>
+      <w:r>
+        <w:t>rest</w:t>
+      </w:r>
+      <w:proofErr w:type="spellEnd"/>
+      <w:r>
+        <w:t xml:space="preserve"> </w:t>
+      </w:r>
+      <w:proofErr w:type="spellStart"/>
+      <w:r>
+        <w:t>times</w:t>
+      </w:r>
+      <w:proofErr w:type="spellEnd"/>
     </w:p>
     <w:p>
       <w:pPr>
@@ -3048,9 +3417,27 @@
           <w:numId w:val="22"/>
         </w:numPr>
       </w:pPr>
-      <w:r>
-        <w:t>trainer-centric session screen</w:t>
-      </w:r>
+      <w:proofErr w:type="spellStart"/>
+      <w:r>
+        <w:t>trainer-centric</w:t>
+      </w:r>
+      <w:proofErr w:type="spellEnd"/>
+      <w:r>
+        <w:t xml:space="preserve"> </w:t>
+      </w:r>
+      <w:proofErr w:type="spellStart"/>
+      <w:r>
+        <w:t>session</w:t>
+      </w:r>
+      <w:proofErr w:type="spellEnd"/>
+      <w:r>
+        <w:t xml:space="preserve"> </w:t>
+      </w:r>
+      <w:proofErr w:type="spellStart"/>
+      <w:r>
+        <w:t>screen</w:t>
+      </w:r>
+      <w:proofErr w:type="spellEnd"/>
     </w:p>
     <w:p>
       <w:pPr>
@@ -3076,7 +3463,49 @@
         <w:rPr>
           <w:lang w:val="en-US"/>
         </w:rPr>
-        <w:t>Existing personal training management systems such as Trainerize, My PT Hub, TrueCoach, and PT Distinction provide robust tools for workout programming, progress tracking, and client communication. However, these platforms are fundamentally designed for single-client interaction and remote coaching workflows. They lack real-time multi-client visibility, split-screen interfaces, and trainer-centric session views required for effective small group training. As a result, trainers conducting group sessions must switch between clients or rely on manual methods, increasing cognitive load and reducing coaching quality. FitCoach differentiates itself by addressing this unmet need through a real-time 2×2 split-screen interface that displays up to four personalized workout programs simultaneously, enabling efficient, focused, and high-quality small group training sessions</w:t>
+        <w:t xml:space="preserve">Existing personal training management systems such as </w:t>
+      </w:r>
+      <w:proofErr w:type="spellStart"/>
+      <w:r>
+        <w:rPr>
+          <w:lang w:val="en-US"/>
+        </w:rPr>
+        <w:t>Trainerize</w:t>
+      </w:r>
+      <w:proofErr w:type="spellEnd"/>
+      <w:r>
+        <w:rPr>
+          <w:lang w:val="en-US"/>
+        </w:rPr>
+        <w:t xml:space="preserve">, My PT Hub, </w:t>
+      </w:r>
+      <w:proofErr w:type="spellStart"/>
+      <w:r>
+        <w:rPr>
+          <w:lang w:val="en-US"/>
+        </w:rPr>
+        <w:t>TrueCoach</w:t>
+      </w:r>
+      <w:proofErr w:type="spellEnd"/>
+      <w:r>
+        <w:rPr>
+          <w:lang w:val="en-US"/>
+        </w:rPr>
+        <w:t xml:space="preserve">, and PT Distinction provide robust tools for workout programming, progress tracking, and client communication. However, these platforms are fundamentally designed for single-client interaction and remote coaching workflows. They lack real-time multi-client visibility, split-screen interfaces, and trainer-centric session views required for effective small group training. As a result, trainers conducting group sessions must switch between clients or rely on manual methods, increasing cognitive load and reducing coaching quality. </w:t>
+      </w:r>
+      <w:proofErr w:type="spellStart"/>
+      <w:r>
+        <w:rPr>
+          <w:lang w:val="en-US"/>
+        </w:rPr>
+        <w:t>FitCoach</w:t>
+      </w:r>
+      <w:proofErr w:type="spellEnd"/>
+      <w:r>
+        <w:rPr>
+          <w:lang w:val="en-US"/>
+        </w:rPr>
+        <w:t xml:space="preserve"> differentiates itself by addressing this unmet need through a real-time 2×2 split-screen interface that displays up to four personalized workout programs simultaneously, enabling efficient, focused, and high-quality small group training sessions</w:t>
       </w:r>
     </w:p>
     <w:p>
@@ -3194,13 +3623,47 @@
           <w:bCs/>
         </w:rPr>
       </w:pPr>
+      <w:proofErr w:type="spellStart"/>
       <w:r>
         <w:rPr>
           <w:b/>
           <w:bCs/>
         </w:rPr>
-        <w:t>Quantified Benefits Summary</w:t>
-      </w:r>
+        <w:t>Quantified</w:t>
+      </w:r>
+      <w:proofErr w:type="spellEnd"/>
+      <w:r>
+        <w:rPr>
+          <w:b/>
+          <w:bCs/>
+        </w:rPr>
+        <w:t xml:space="preserve"> </w:t>
+      </w:r>
+      <w:proofErr w:type="spellStart"/>
+      <w:r>
+        <w:rPr>
+          <w:b/>
+          <w:bCs/>
+        </w:rPr>
+        <w:t>Benefits</w:t>
+      </w:r>
+      <w:proofErr w:type="spellEnd"/>
+      <w:r>
+        <w:rPr>
+          <w:b/>
+          <w:bCs/>
+        </w:rPr>
+        <w:t xml:space="preserve"> </w:t>
+      </w:r>
+      <w:proofErr w:type="spellStart"/>
+      <w:r>
+        <w:rPr>
+          <w:b/>
+          <w:bCs/>
+        </w:rPr>
+        <w:t>Summary</w:t>
+      </w:r>
+      <w:proofErr w:type="spellEnd"/>
     </w:p>
     <w:p>
       <w:pPr>
@@ -3315,7 +3778,21 @@
         <w:rPr>
           <w:lang w:val="en-US"/>
         </w:rPr>
-        <w:t xml:space="preserve"> Our work with AI is documented in ai_prompts_log.</w:t>
+        <w:t xml:space="preserve"> Our work with AI is documented in </w:t>
+      </w:r>
+      <w:proofErr w:type="spellStart"/>
+      <w:r>
+        <w:rPr>
+          <w:lang w:val="en-US"/>
+        </w:rPr>
+        <w:t>ai_prompts_log</w:t>
+      </w:r>
+      <w:proofErr w:type="spellEnd"/>
+      <w:r>
+        <w:rPr>
+          <w:lang w:val="en-US"/>
+        </w:rPr>
+        <w:t>.</w:t>
       </w:r>
     </w:p>
     <w:p>
@@ -3518,7 +3995,15 @@
               </w:rPr>
             </w:pPr>
             <w:r>
-              <w:t>Product Vision (Moore)</w:t>
+              <w:t>Product Vision (</w:t>
+            </w:r>
+            <w:proofErr w:type="spellStart"/>
+            <w:r>
+              <w:t>Moore</w:t>
+            </w:r>
+            <w:proofErr w:type="spellEnd"/>
+            <w:r>
+              <w:t>)</w:t>
             </w:r>
           </w:p>
         </w:tc>
@@ -3579,9 +4064,19 @@
                 <w:lang w:val="en-US"/>
               </w:rPr>
             </w:pPr>
-            <w:r>
-              <w:t>Personas creation</w:t>
-            </w:r>
+            <w:proofErr w:type="spellStart"/>
+            <w:r>
+              <w:t>Personas</w:t>
+            </w:r>
+            <w:proofErr w:type="spellEnd"/>
+            <w:r>
+              <w:t xml:space="preserve"> </w:t>
+            </w:r>
+            <w:proofErr w:type="spellStart"/>
+            <w:r>
+              <w:t>creation</w:t>
+            </w:r>
+            <w:proofErr w:type="spellEnd"/>
           </w:p>
         </w:tc>
       </w:tr>
@@ -3641,9 +4136,19 @@
                 <w:lang w:val="en-US"/>
               </w:rPr>
             </w:pPr>
-            <w:r>
-              <w:t>Problem Statement</w:t>
-            </w:r>
+            <w:proofErr w:type="spellStart"/>
+            <w:r>
+              <w:t>Problem</w:t>
+            </w:r>
+            <w:proofErr w:type="spellEnd"/>
+            <w:r>
+              <w:t xml:space="preserve"> </w:t>
+            </w:r>
+            <w:proofErr w:type="spellStart"/>
+            <w:r>
+              <w:t>Statement</w:t>
+            </w:r>
+            <w:proofErr w:type="spellEnd"/>
           </w:p>
         </w:tc>
       </w:tr>
@@ -3703,9 +4208,19 @@
                 <w:lang w:val="en-US"/>
               </w:rPr>
             </w:pPr>
-            <w:r>
-              <w:t>Competitor analysis</w:t>
-            </w:r>
+            <w:proofErr w:type="spellStart"/>
+            <w:r>
+              <w:t>Competitor</w:t>
+            </w:r>
+            <w:proofErr w:type="spellEnd"/>
+            <w:r>
+              <w:t xml:space="preserve"> </w:t>
+            </w:r>
+            <w:proofErr w:type="spellStart"/>
+            <w:r>
+              <w:t>analysis</w:t>
+            </w:r>
+            <w:proofErr w:type="spellEnd"/>
           </w:p>
         </w:tc>
       </w:tr>
@@ -4938,239 +5453,76 @@
           <w:bCs/>
         </w:rPr>
       </w:pPr>
+      <w:proofErr w:type="spellStart"/>
       <w:r>
         <w:rPr>
           <w:b/>
           <w:bCs/>
         </w:rPr>
-        <w:t>Programming Languages:</w:t>
-      </w:r>
-    </w:p>
-    <w:p>
-      <w:pPr>
-        <w:rPr>
-          <w:lang w:val="en-US"/>
-        </w:rPr>
-      </w:pPr>
-      <w:r>
-        <w:rPr>
-          <w:lang w:val="en-US"/>
-        </w:rPr>
-        <w:t>Primary: Python 3.11+ (Backend)</w:t>
-      </w:r>
-    </w:p>
-    <w:p>
-      <w:pPr>
-        <w:rPr>
-          <w:lang w:val="en-US"/>
-        </w:rPr>
-      </w:pPr>
-      <w:r>
-        <w:rPr>
-          <w:lang w:val="en-US"/>
-        </w:rPr>
-        <w:t>Secondary: JavaScript ES6+ (Frontend)</w:t>
-      </w:r>
-    </w:p>
-    <w:p>
-      <w:pPr>
-        <w:rPr>
-          <w:lang w:val="en-US"/>
-        </w:rPr>
-      </w:pPr>
-      <w:r>
-        <w:rPr>
-          <w:lang w:val="en-US"/>
-        </w:rPr>
-        <w:t>Database: Firebase Realtime Database (cloud - bonus!) OR PostgreSQL</w:t>
-      </w:r>
-    </w:p>
-    <w:p>
-      <w:pPr>
+        <w:t>Programming</w:t>
+      </w:r>
+      <w:proofErr w:type="spellEnd"/>
+      <w:r>
         <w:rPr>
           <w:b/>
           <w:bCs/>
-          <w:lang w:val="en-US"/>
-        </w:rPr>
-      </w:pPr>
+        </w:rPr>
+        <w:t xml:space="preserve"> </w:t>
+      </w:r>
+      <w:proofErr w:type="spellStart"/>
       <w:r>
         <w:rPr>
           <w:b/>
           <w:bCs/>
-          <w:lang w:val="en-US"/>
-        </w:rPr>
-        <w:t>Backend Stack:</w:t>
-      </w:r>
-    </w:p>
-    <w:p>
-      <w:pPr>
-        <w:rPr>
-          <w:lang w:val="en-US"/>
-        </w:rPr>
-      </w:pPr>
-      <w:r>
-        <w:rPr>
-          <w:lang w:val="en-US"/>
-        </w:rPr>
-        <w:t>Framework: Flask 3.0 (Python web framework)</w:t>
-      </w:r>
-    </w:p>
-    <w:p>
-      <w:pPr>
-        <w:rPr>
-          <w:lang w:val="en-US"/>
-        </w:rPr>
-      </w:pPr>
-      <w:r>
-        <w:rPr>
-          <w:lang w:val="en-US"/>
-        </w:rPr>
-        <w:t>API: RESTful API + WebSocket (Socket.IO)</w:t>
-      </w:r>
-    </w:p>
-    <w:p>
-      <w:pPr>
-        <w:rPr>
-          <w:lang w:val="en-US"/>
-        </w:rPr>
-      </w:pPr>
-      <w:r>
-        <w:rPr>
-          <w:lang w:val="en-US"/>
-        </w:rPr>
-        <w:t>Authentication: Flask-JWT-Extended</w:t>
-      </w:r>
-    </w:p>
-    <w:p>
-      <w:pPr>
-        <w:rPr>
-          <w:lang w:val="en-US"/>
-        </w:rPr>
-      </w:pPr>
-      <w:r>
-        <w:rPr>
-          <w:lang w:val="en-US"/>
-        </w:rPr>
-        <w:t>Database ORM: SQLAlchemy (if SQL) or Firebase SDK</w:t>
-      </w:r>
-    </w:p>
-    <w:p>
-      <w:pPr>
-        <w:rPr>
-          <w:lang w:val="en-US"/>
-        </w:rPr>
-      </w:pPr>
-      <w:r>
-        <w:rPr>
-          <w:lang w:val="en-US"/>
-        </w:rPr>
-        <w:t>Testing: pytest, pytest-cov</w:t>
-      </w:r>
-    </w:p>
-    <w:p>
-      <w:pPr>
-        <w:rPr>
-          <w:lang w:val="en-US"/>
-        </w:rPr>
-      </w:pPr>
-      <w:r>
-        <w:rPr>
-          <w:lang w:val="en-US"/>
-        </w:rPr>
-        <w:t>API Documentation: Swagger/OpenAPI</w:t>
-      </w:r>
-    </w:p>
-    <w:p>
-      <w:pPr>
-        <w:rPr>
-          <w:lang w:val="en-US"/>
-        </w:rPr>
-      </w:pPr>
+        </w:rPr>
+        <w:t>Languages</w:t>
+      </w:r>
+      <w:proofErr w:type="spellEnd"/>
       <w:r>
         <w:rPr>
           <w:b/>
           <w:bCs/>
-          <w:lang w:val="en-US"/>
-        </w:rPr>
-        <w:t>DevOps &amp; Tools:</w:t>
-      </w:r>
-    </w:p>
-    <w:p>
-      <w:pPr>
-        <w:rPr>
-          <w:lang w:val="en-US"/>
-        </w:rPr>
-      </w:pPr>
-      <w:r>
-        <w:rPr>
-          <w:lang w:val="en-US"/>
-        </w:rPr>
-        <w:t>Version Control: GitHub (main + develop branches)</w:t>
-      </w:r>
-    </w:p>
-    <w:p>
-      <w:pPr>
-        <w:rPr>
-          <w:lang w:val="en-US"/>
-        </w:rPr>
-      </w:pPr>
-      <w:r>
-        <w:rPr>
-          <w:lang w:val="en-US"/>
-        </w:rPr>
-        <w:t>Project Management: Jira (Scrum board)</w:t>
-      </w:r>
-    </w:p>
-    <w:p>
-      <w:pPr>
-        <w:rPr>
-          <w:lang w:val="en-US"/>
-        </w:rPr>
-      </w:pPr>
-      <w:r>
-        <w:rPr>
-          <w:lang w:val="en-US"/>
-        </w:rPr>
-        <w:t>CI/CD: GitHub Actions (bonus - continuous pipeline)</w:t>
-      </w:r>
-    </w:p>
-    <w:p>
-      <w:pPr>
-        <w:rPr>
-          <w:lang w:val="en-US"/>
-        </w:rPr>
-      </w:pPr>
-      <w:r>
-        <w:rPr>
-          <w:lang w:val="en-US"/>
-        </w:rPr>
-        <w:t>Design: Figma</w:t>
-      </w:r>
-    </w:p>
-    <w:p>
-      <w:pPr>
-        <w:rPr>
-          <w:lang w:val="en-US"/>
-        </w:rPr>
-      </w:pPr>
-      <w:r>
-        <w:rPr>
-          <w:lang w:val="en-US"/>
-        </w:rPr>
-        <w:t>Code Editor: VS Code + GitHub Copilot</w:t>
-      </w:r>
-    </w:p>
-    <w:p>
-      <w:pPr>
-        <w:rPr>
-          <w:lang w:val="en-US"/>
-        </w:rPr>
-      </w:pPr>
-      <w:r>
-        <w:rPr>
-          <w:lang w:val="en-US"/>
-        </w:rPr>
-        <w:t>Deployment: Heroku/Vercel (bonus - web in production)</w:t>
+        </w:rPr>
+        <w:t>:</w:t>
+      </w:r>
+    </w:p>
+    <w:p>
+      <w:pPr>
+        <w:rPr>
+          <w:lang w:val="en-US"/>
+        </w:rPr>
+      </w:pPr>
+      <w:r>
+        <w:rPr>
+          <w:lang w:val="en-US"/>
+        </w:rPr>
+        <w:t>Primary: Python 3.11+ (Backend)</w:t>
+      </w:r>
+    </w:p>
+    <w:p>
+      <w:pPr>
+        <w:rPr>
+          <w:lang w:val="en-US"/>
+        </w:rPr>
+      </w:pPr>
+      <w:r>
+        <w:rPr>
+          <w:lang w:val="en-US"/>
+        </w:rPr>
+        <w:t>Secondary: JavaScript ES6+ (Frontend)</w:t>
+      </w:r>
+    </w:p>
+    <w:p>
+      <w:pPr>
+        <w:rPr>
+          <w:lang w:val="en-US"/>
+        </w:rPr>
+      </w:pPr>
+      <w:r>
+        <w:rPr>
+          <w:lang w:val="en-US"/>
+        </w:rPr>
+        <w:t>Database: Firebase Realtime Database (cloud - bonus!) OR PostgreSQL</w:t>
       </w:r>
     </w:p>
     <w:p>
@@ -5187,6 +5539,252 @@
           <w:bCs/>
           <w:lang w:val="en-US"/>
         </w:rPr>
+        <w:t>Backend Stack:</w:t>
+      </w:r>
+    </w:p>
+    <w:p>
+      <w:pPr>
+        <w:rPr>
+          <w:lang w:val="en-US"/>
+        </w:rPr>
+      </w:pPr>
+      <w:r>
+        <w:rPr>
+          <w:lang w:val="en-US"/>
+        </w:rPr>
+        <w:t>Framework: Flask 3.0 (Python web framework)</w:t>
+      </w:r>
+    </w:p>
+    <w:p>
+      <w:pPr>
+        <w:rPr>
+          <w:lang w:val="en-US"/>
+        </w:rPr>
+      </w:pPr>
+      <w:r>
+        <w:rPr>
+          <w:lang w:val="en-US"/>
+        </w:rPr>
+        <w:t>API: RESTful API + WebSocket (Socket.IO)</w:t>
+      </w:r>
+    </w:p>
+    <w:p>
+      <w:pPr>
+        <w:rPr>
+          <w:lang w:val="en-US"/>
+        </w:rPr>
+      </w:pPr>
+      <w:r>
+        <w:rPr>
+          <w:lang w:val="en-US"/>
+        </w:rPr>
+        <w:t>Authentication: Flask-JWT-Extended</w:t>
+      </w:r>
+    </w:p>
+    <w:p>
+      <w:pPr>
+        <w:rPr>
+          <w:lang w:val="en-US"/>
+        </w:rPr>
+      </w:pPr>
+      <w:r>
+        <w:rPr>
+          <w:lang w:val="en-US"/>
+        </w:rPr>
+        <w:t xml:space="preserve">Database ORM: </w:t>
+      </w:r>
+      <w:proofErr w:type="spellStart"/>
+      <w:r>
+        <w:rPr>
+          <w:lang w:val="en-US"/>
+        </w:rPr>
+        <w:t>SQLAlchemy</w:t>
+      </w:r>
+      <w:proofErr w:type="spellEnd"/>
+      <w:r>
+        <w:rPr>
+          <w:lang w:val="en-US"/>
+        </w:rPr>
+        <w:t xml:space="preserve"> (if SQL) or Firebase SDK</w:t>
+      </w:r>
+    </w:p>
+    <w:p>
+      <w:pPr>
+        <w:rPr>
+          <w:lang w:val="en-US"/>
+        </w:rPr>
+      </w:pPr>
+      <w:r>
+        <w:rPr>
+          <w:lang w:val="en-US"/>
+        </w:rPr>
+        <w:t xml:space="preserve">Testing: </w:t>
+      </w:r>
+      <w:proofErr w:type="spellStart"/>
+      <w:r>
+        <w:rPr>
+          <w:lang w:val="en-US"/>
+        </w:rPr>
+        <w:t>pytest</w:t>
+      </w:r>
+      <w:proofErr w:type="spellEnd"/>
+      <w:r>
+        <w:rPr>
+          <w:lang w:val="en-US"/>
+        </w:rPr>
+        <w:t xml:space="preserve">, </w:t>
+      </w:r>
+      <w:proofErr w:type="spellStart"/>
+      <w:r>
+        <w:rPr>
+          <w:lang w:val="en-US"/>
+        </w:rPr>
+        <w:t>pytest-cov</w:t>
+      </w:r>
+      <w:proofErr w:type="spellEnd"/>
+    </w:p>
+    <w:p>
+      <w:pPr>
+        <w:rPr>
+          <w:lang w:val="en-US"/>
+        </w:rPr>
+      </w:pPr>
+      <w:r>
+        <w:rPr>
+          <w:lang w:val="en-US"/>
+        </w:rPr>
+        <w:t>API Documentation: Swagger/</w:t>
+      </w:r>
+      <w:proofErr w:type="spellStart"/>
+      <w:r>
+        <w:rPr>
+          <w:lang w:val="en-US"/>
+        </w:rPr>
+        <w:t>OpenAPI</w:t>
+      </w:r>
+      <w:proofErr w:type="spellEnd"/>
+    </w:p>
+    <w:p>
+      <w:pPr>
+        <w:rPr>
+          <w:lang w:val="en-US"/>
+        </w:rPr>
+      </w:pPr>
+      <w:r>
+        <w:rPr>
+          <w:b/>
+          <w:bCs/>
+          <w:lang w:val="en-US"/>
+        </w:rPr>
+        <w:t>DevOps &amp; Tools:</w:t>
+      </w:r>
+    </w:p>
+    <w:p>
+      <w:pPr>
+        <w:rPr>
+          <w:lang w:val="en-US"/>
+        </w:rPr>
+      </w:pPr>
+      <w:r>
+        <w:rPr>
+          <w:lang w:val="en-US"/>
+        </w:rPr>
+        <w:t>Version Control: GitHub (main + develop branches)</w:t>
+      </w:r>
+    </w:p>
+    <w:p>
+      <w:pPr>
+        <w:rPr>
+          <w:lang w:val="en-US"/>
+        </w:rPr>
+      </w:pPr>
+      <w:r>
+        <w:rPr>
+          <w:lang w:val="en-US"/>
+        </w:rPr>
+        <w:t>Project Management: Jira (Scrum board)</w:t>
+      </w:r>
+    </w:p>
+    <w:p>
+      <w:pPr>
+        <w:rPr>
+          <w:lang w:val="en-US"/>
+        </w:rPr>
+      </w:pPr>
+      <w:r>
+        <w:rPr>
+          <w:lang w:val="en-US"/>
+        </w:rPr>
+        <w:t>CI/CD: GitHub Actions (bonus - continuous pipeline)</w:t>
+      </w:r>
+    </w:p>
+    <w:p>
+      <w:pPr>
+        <w:rPr>
+          <w:lang w:val="en-US"/>
+        </w:rPr>
+      </w:pPr>
+      <w:r>
+        <w:rPr>
+          <w:lang w:val="en-US"/>
+        </w:rPr>
+        <w:t>Design: Figma</w:t>
+      </w:r>
+    </w:p>
+    <w:p>
+      <w:pPr>
+        <w:rPr>
+          <w:lang w:val="en-US"/>
+        </w:rPr>
+      </w:pPr>
+      <w:r>
+        <w:rPr>
+          <w:lang w:val="en-US"/>
+        </w:rPr>
+        <w:t>Code Editor: VS Code + GitHub Copilot</w:t>
+      </w:r>
+    </w:p>
+    <w:p>
+      <w:pPr>
+        <w:rPr>
+          <w:lang w:val="en-US"/>
+        </w:rPr>
+      </w:pPr>
+      <w:r>
+        <w:rPr>
+          <w:lang w:val="en-US"/>
+        </w:rPr>
+        <w:t>Deployment: Heroku/</w:t>
+      </w:r>
+      <w:proofErr w:type="spellStart"/>
+      <w:r>
+        <w:rPr>
+          <w:lang w:val="en-US"/>
+        </w:rPr>
+        <w:t>Vercel</w:t>
+      </w:r>
+      <w:proofErr w:type="spellEnd"/>
+      <w:r>
+        <w:rPr>
+          <w:lang w:val="en-US"/>
+        </w:rPr>
+        <w:t xml:space="preserve"> (bonus - web in production)</w:t>
+      </w:r>
+    </w:p>
+    <w:p>
+      <w:pPr>
+        <w:rPr>
+          <w:b/>
+          <w:bCs/>
+          <w:lang w:val="en-US"/>
+        </w:rPr>
+      </w:pPr>
+      <w:r>
+        <w:rPr>
+          <w:b/>
+          <w:bCs/>
+          <w:lang w:val="en-US"/>
+        </w:rPr>
         <w:t>Architecture Diagram:</w:t>
       </w:r>
     </w:p>
@@ -5196,7 +5794,7 @@
           <w:lang w:val="en-US"/>
         </w:rPr>
       </w:pPr>
-      <w:hyperlink r:id="rId11" w:anchor="json=1XP5c9FkpmWjJ_CJQz1cI,_wsBa69sQPacTDEY2fTk6g" w:history="1">
+      <w:hyperlink r:id="rId11" w:anchor="json=oTOMih-6XafhS7H1nFTc3,swiqNQf0erjD71pdI_k3vg" w:history="1">
         <w:r>
           <w:rPr>
             <w:rStyle w:val="ad"/>
@@ -5224,8 +5822,21 @@
       <w:pPr>
         <w:pStyle w:val="2"/>
       </w:pPr>
-      <w:r>
-        <w:t>Technical Metrics:</w:t>
+      <w:proofErr w:type="spellStart"/>
+      <w:r>
+        <w:t>Technical</w:t>
+      </w:r>
+      <w:proofErr w:type="spellEnd"/>
+      <w:r>
+        <w:t xml:space="preserve"> </w:t>
+      </w:r>
+      <w:proofErr w:type="spellStart"/>
+      <w:r>
+        <w:t>Metrics</w:t>
+      </w:r>
+      <w:proofErr w:type="spellEnd"/>
+      <w:r>
+        <w:t>:</w:t>
       </w:r>
     </w:p>
     <w:p>
@@ -5628,7 +6239,21 @@
         <w:rPr>
           <w:lang w:val="en-US"/>
         </w:rPr>
-        <w:t>Automated testing (pytest, Jest)</w:t>
+        <w:t>Automated testing (</w:t>
+      </w:r>
+      <w:proofErr w:type="spellStart"/>
+      <w:r>
+        <w:rPr>
+          <w:lang w:val="en-US"/>
+        </w:rPr>
+        <w:t>pytest</w:t>
+      </w:r>
+      <w:proofErr w:type="spellEnd"/>
+      <w:r>
+        <w:rPr>
+          <w:lang w:val="en-US"/>
+        </w:rPr>
+        <w:t>, Jest)</w:t>
       </w:r>
     </w:p>
     <w:p>
@@ -5680,7 +6305,21 @@
         <w:rPr>
           <w:lang w:val="en-US"/>
         </w:rPr>
-        <w:t>Code coverage reports (pytest-cov)</w:t>
+        <w:t>Code coverage reports (</w:t>
+      </w:r>
+      <w:proofErr w:type="spellStart"/>
+      <w:r>
+        <w:rPr>
+          <w:lang w:val="en-US"/>
+        </w:rPr>
+        <w:t>pytest-cov</w:t>
+      </w:r>
+      <w:proofErr w:type="spellEnd"/>
+      <w:r>
+        <w:rPr>
+          <w:lang w:val="en-US"/>
+        </w:rPr>
+        <w:t>)</w:t>
       </w:r>
     </w:p>
     <w:p>
@@ -5796,6 +6435,7 @@
                 <w:szCs w:val="22"/>
               </w:rPr>
             </w:pPr>
+            <w:proofErr w:type="spellStart"/>
             <w:r>
               <w:rPr>
                 <w:sz w:val="24"/>
@@ -5803,6 +6443,7 @@
               </w:rPr>
               <w:t>Description</w:t>
             </w:r>
+            <w:proofErr w:type="spellEnd"/>
           </w:p>
         </w:tc>
         <w:tc>
@@ -5827,12 +6468,21 @@
                 <w:szCs w:val="22"/>
               </w:rPr>
             </w:pPr>
-            <w:r>
-              <w:rPr>
-                <w:sz w:val="24"/>
-                <w:szCs w:val="22"/>
-              </w:rPr>
-              <w:t>Severity (0-1)</w:t>
+            <w:proofErr w:type="spellStart"/>
+            <w:r>
+              <w:rPr>
+                <w:sz w:val="24"/>
+                <w:szCs w:val="22"/>
+              </w:rPr>
+              <w:t>Severity</w:t>
+            </w:r>
+            <w:proofErr w:type="spellEnd"/>
+            <w:r>
+              <w:rPr>
+                <w:sz w:val="24"/>
+                <w:szCs w:val="22"/>
+              </w:rPr>
+              <w:t xml:space="preserve"> (0-1)</w:t>
             </w:r>
           </w:p>
         </w:tc>
@@ -5858,12 +6508,21 @@
                 <w:szCs w:val="22"/>
               </w:rPr>
             </w:pPr>
-            <w:r>
-              <w:rPr>
-                <w:sz w:val="24"/>
-                <w:szCs w:val="22"/>
-              </w:rPr>
-              <w:t>Probability (0-1)</w:t>
+            <w:proofErr w:type="spellStart"/>
+            <w:r>
+              <w:rPr>
+                <w:sz w:val="24"/>
+                <w:szCs w:val="22"/>
+              </w:rPr>
+              <w:t>Probability</w:t>
+            </w:r>
+            <w:proofErr w:type="spellEnd"/>
+            <w:r>
+              <w:rPr>
+                <w:sz w:val="24"/>
+                <w:szCs w:val="22"/>
+              </w:rPr>
+              <w:t xml:space="preserve"> (0-1)</w:t>
             </w:r>
           </w:p>
         </w:tc>
@@ -5920,12 +6579,21 @@
                 <w:szCs w:val="22"/>
               </w:rPr>
             </w:pPr>
-            <w:r>
-              <w:rPr>
-                <w:sz w:val="24"/>
-                <w:szCs w:val="22"/>
-              </w:rPr>
-              <w:t>Mitigation Strategy</w:t>
+            <w:proofErr w:type="spellStart"/>
+            <w:r>
+              <w:rPr>
+                <w:sz w:val="24"/>
+                <w:szCs w:val="22"/>
+              </w:rPr>
+              <w:t>Mitigation</w:t>
+            </w:r>
+            <w:proofErr w:type="spellEnd"/>
+            <w:r>
+              <w:rPr>
+                <w:sz w:val="24"/>
+                <w:szCs w:val="22"/>
+              </w:rPr>
+              <w:t xml:space="preserve"> Strategy</w:t>
             </w:r>
           </w:p>
         </w:tc>
@@ -5958,8 +6626,33 @@
                 <w:sz w:val="24"/>
                 <w:szCs w:val="22"/>
               </w:rPr>
-              <w:t>R1: Split-screen complexity</w:t>
-            </w:r>
+              <w:t xml:space="preserve">R1: </w:t>
+            </w:r>
+            <w:proofErr w:type="spellStart"/>
+            <w:r>
+              <w:rPr>
+                <w:sz w:val="24"/>
+                <w:szCs w:val="22"/>
+              </w:rPr>
+              <w:t>Split-screen</w:t>
+            </w:r>
+            <w:proofErr w:type="spellEnd"/>
+            <w:r>
+              <w:rPr>
+                <w:sz w:val="24"/>
+                <w:szCs w:val="22"/>
+              </w:rPr>
+              <w:t xml:space="preserve"> </w:t>
+            </w:r>
+            <w:proofErr w:type="spellStart"/>
+            <w:r>
+              <w:rPr>
+                <w:sz w:val="24"/>
+                <w:szCs w:val="22"/>
+              </w:rPr>
+              <w:t>complexity</w:t>
+            </w:r>
+            <w:proofErr w:type="spellEnd"/>
           </w:p>
         </w:tc>
         <w:tc>
@@ -6177,8 +6870,33 @@
                 <w:sz w:val="24"/>
                 <w:szCs w:val="22"/>
               </w:rPr>
-              <w:t>R2: Data model complexity</w:t>
-            </w:r>
+              <w:t xml:space="preserve">R2: Data </w:t>
+            </w:r>
+            <w:proofErr w:type="spellStart"/>
+            <w:r>
+              <w:rPr>
+                <w:sz w:val="24"/>
+                <w:szCs w:val="22"/>
+              </w:rPr>
+              <w:t>model</w:t>
+            </w:r>
+            <w:proofErr w:type="spellEnd"/>
+            <w:r>
+              <w:rPr>
+                <w:sz w:val="24"/>
+                <w:szCs w:val="22"/>
+              </w:rPr>
+              <w:t xml:space="preserve"> </w:t>
+            </w:r>
+            <w:proofErr w:type="spellStart"/>
+            <w:r>
+              <w:rPr>
+                <w:sz w:val="24"/>
+                <w:szCs w:val="22"/>
+              </w:rPr>
+              <w:t>complexity</w:t>
+            </w:r>
+            <w:proofErr w:type="spellEnd"/>
           </w:p>
         </w:tc>
         <w:tc>
@@ -6617,8 +7335,49 @@
                 <w:sz w:val="24"/>
                 <w:szCs w:val="22"/>
               </w:rPr>
-              <w:t>R4: Trainer workflow mismatch</w:t>
-            </w:r>
+              <w:t xml:space="preserve">R4: </w:t>
+            </w:r>
+            <w:proofErr w:type="spellStart"/>
+            <w:r>
+              <w:rPr>
+                <w:sz w:val="24"/>
+                <w:szCs w:val="22"/>
+              </w:rPr>
+              <w:t>Trainer</w:t>
+            </w:r>
+            <w:proofErr w:type="spellEnd"/>
+            <w:r>
+              <w:rPr>
+                <w:sz w:val="24"/>
+                <w:szCs w:val="22"/>
+              </w:rPr>
+              <w:t xml:space="preserve"> </w:t>
+            </w:r>
+            <w:proofErr w:type="spellStart"/>
+            <w:r>
+              <w:rPr>
+                <w:sz w:val="24"/>
+                <w:szCs w:val="22"/>
+              </w:rPr>
+              <w:t>workflow</w:t>
+            </w:r>
+            <w:proofErr w:type="spellEnd"/>
+            <w:r>
+              <w:rPr>
+                <w:sz w:val="24"/>
+                <w:szCs w:val="22"/>
+              </w:rPr>
+              <w:t xml:space="preserve"> </w:t>
+            </w:r>
+            <w:proofErr w:type="spellStart"/>
+            <w:r>
+              <w:rPr>
+                <w:sz w:val="24"/>
+                <w:szCs w:val="22"/>
+              </w:rPr>
+              <w:t>mismatch</w:t>
+            </w:r>
+            <w:proofErr w:type="spellEnd"/>
           </w:p>
         </w:tc>
         <w:tc>
@@ -7057,8 +7816,17 @@
                 <w:sz w:val="24"/>
                 <w:szCs w:val="22"/>
               </w:rPr>
-              <w:t>R6: Time constraint</w:t>
-            </w:r>
+              <w:t xml:space="preserve">R6: Time </w:t>
+            </w:r>
+            <w:proofErr w:type="spellStart"/>
+            <w:r>
+              <w:rPr>
+                <w:sz w:val="24"/>
+                <w:szCs w:val="22"/>
+              </w:rPr>
+              <w:t>constraint</w:t>
+            </w:r>
+            <w:proofErr w:type="spellEnd"/>
           </w:p>
         </w:tc>
         <w:tc>
@@ -7216,7 +7984,25 @@
                 <w:szCs w:val="22"/>
                 <w:lang w:val="en-US"/>
               </w:rPr>
-              <w:t>- Prioritize core features (MoSCoW)</w:t>
+              <w:t>- Prioritize core features (</w:t>
+            </w:r>
+            <w:proofErr w:type="spellStart"/>
+            <w:r>
+              <w:rPr>
+                <w:sz w:val="24"/>
+                <w:szCs w:val="22"/>
+                <w:lang w:val="en-US"/>
+              </w:rPr>
+              <w:t>MoSCoW</w:t>
+            </w:r>
+            <w:proofErr w:type="spellEnd"/>
+            <w:r>
+              <w:rPr>
+                <w:sz w:val="24"/>
+                <w:szCs w:val="22"/>
+                <w:lang w:val="en-US"/>
+              </w:rPr>
+              <w:t>)</w:t>
             </w:r>
             <w:r>
               <w:rPr>
@@ -7276,8 +8062,33 @@
                 <w:sz w:val="24"/>
                 <w:szCs w:val="22"/>
               </w:rPr>
-              <w:t>R7: AI code quality</w:t>
-            </w:r>
+              <w:t xml:space="preserve">R7: AI </w:t>
+            </w:r>
+            <w:proofErr w:type="spellStart"/>
+            <w:r>
+              <w:rPr>
+                <w:sz w:val="24"/>
+                <w:szCs w:val="22"/>
+              </w:rPr>
+              <w:t>code</w:t>
+            </w:r>
+            <w:proofErr w:type="spellEnd"/>
+            <w:r>
+              <w:rPr>
+                <w:sz w:val="24"/>
+                <w:szCs w:val="22"/>
+              </w:rPr>
+              <w:t xml:space="preserve"> </w:t>
+            </w:r>
+            <w:proofErr w:type="spellStart"/>
+            <w:r>
+              <w:rPr>
+                <w:sz w:val="24"/>
+                <w:szCs w:val="22"/>
+              </w:rPr>
+              <w:t>quality</w:t>
+            </w:r>
+            <w:proofErr w:type="spellEnd"/>
           </w:p>
         </w:tc>
         <w:tc>
@@ -7495,8 +8306,17 @@
                 <w:sz w:val="24"/>
                 <w:szCs w:val="22"/>
               </w:rPr>
-              <w:t>R8: Database choice</w:t>
-            </w:r>
+              <w:t xml:space="preserve">R8: Database </w:t>
+            </w:r>
+            <w:proofErr w:type="spellStart"/>
+            <w:r>
+              <w:rPr>
+                <w:sz w:val="24"/>
+                <w:szCs w:val="22"/>
+              </w:rPr>
+              <w:t>choice</w:t>
+            </w:r>
+            <w:proofErr w:type="spellEnd"/>
           </w:p>
         </w:tc>
         <w:tc>
@@ -7739,7 +8559,21 @@
         <w:rPr>
           <w:lang w:val="en-US"/>
         </w:rPr>
-        <w:t>Nottingham, S. L., Lam, K. C., Kasamatsu, T. M., Eppelheimer, B. L., &amp; Welch Bacon, C. E. (2017). Athletic Trainers' Reasons for and Mechanics of Documenting Patient Care. </w:t>
+        <w:t xml:space="preserve">Nottingham, S. L., Lam, K. C., </w:t>
+      </w:r>
+      <w:proofErr w:type="spellStart"/>
+      <w:r>
+        <w:rPr>
+          <w:lang w:val="en-US"/>
+        </w:rPr>
+        <w:t>Kasamatsu</w:t>
+      </w:r>
+      <w:proofErr w:type="spellEnd"/>
+      <w:r>
+        <w:rPr>
+          <w:lang w:val="en-US"/>
+        </w:rPr>
+        <w:t>, T. M., Eppelheimer, B. L., &amp; Welch Bacon, C. E. (2017). Athletic Trainers' Reasons for and Mechanics of Documenting Patient Care. </w:t>
       </w:r>
       <w:r>
         <w:rPr>
@@ -7775,8 +8609,23 @@
         <w:rPr>
           <w:lang w:val="en-US"/>
         </w:rPr>
-        <w:t>García-Fernández, J., Gálvez-Ruiz, P., Bohórquez, M. R., Grimaldi-Puyana, M., &amp; Cepeda-Carrión, I. (2020). The Relationship between Technological Capabilities and Organizational Impact: Direct and Indirect Routes for Employed and Self-Employed Personal Fitness Trainers. </w:t>
-      </w:r>
+        <w:t>García-Fernández, J., Gálvez-Ruiz, P., Bohórquez, M. R., Grimaldi-</w:t>
+      </w:r>
+      <w:proofErr w:type="spellStart"/>
+      <w:r>
+        <w:rPr>
+          <w:lang w:val="en-US"/>
+        </w:rPr>
+        <w:t>Puyana</w:t>
+      </w:r>
+      <w:proofErr w:type="spellEnd"/>
+      <w:r>
+        <w:rPr>
+          <w:lang w:val="en-US"/>
+        </w:rPr>
+        <w:t>, M., &amp; Cepeda-Carrión, I. (2020). The Relationship between Technological Capabilities and Organizational Impact: Direct and Indirect Routes for Employed and Self-Employed Personal Fitness Trainers. </w:t>
+      </w:r>
+      <w:proofErr w:type="spellStart"/>
       <w:r>
         <w:rPr>
           <w:i/>
@@ -7784,6 +8633,7 @@
         </w:rPr>
         <w:t>Sustainability</w:t>
       </w:r>
+      <w:proofErr w:type="spellEnd"/>
       <w:r>
         <w:t>, </w:t>
       </w:r>

</xml_diff>

<commit_message>
FC-2 ASPM25T10-22 ASPM25T10-23 #done   #comment Implemented full trainer client management. Includes CRUD operations, role-based access, client-user linking via email, and trainee dashboard integration.
</commit_message>
<xml_diff>
--- a/docs/charter_2025-6_group10.docx
+++ b/docs/charter_2025-6_group10.docx
@@ -5791,20 +5791,50 @@
     <w:p>
       <w:pPr>
         <w:rPr>
-          <w:lang w:val="en-US"/>
-        </w:rPr>
-      </w:pPr>
-      <w:hyperlink r:id="rId11" w:anchor="json=oTOMih-6XafhS7H1nFTc3,swiqNQf0erjD71pdI_k3vg" w:history="1">
-        <w:r>
-          <w:rPr>
-            <w:rStyle w:val="ad"/>
-            <w:b/>
-            <w:bCs/>
-            <w:lang w:val="en-US"/>
-          </w:rPr>
-          <w:t>Link</w:t>
-        </w:r>
-      </w:hyperlink>
+          <w:rStyle w:val="ad"/>
+          <w:lang w:val="en-US"/>
+        </w:rPr>
+      </w:pPr>
+      <w:r>
+        <w:rPr>
+          <w:b/>
+          <w:bCs/>
+          <w:lang w:val="en-US"/>
+        </w:rPr>
+        <w:fldChar w:fldCharType="begin"/>
+      </w:r>
+      <w:r>
+        <w:rPr>
+          <w:b/>
+          <w:bCs/>
+          <w:lang w:val="en-US"/>
+        </w:rPr>
+        <w:instrText>HYPERLINK "https://excalidraw.com/" \l "json=lr_1RBeNQFxc6egoTK3PM,MlVEVRB4bYrSI31sA1N6Vg"</w:instrText>
+      </w:r>
+      <w:r>
+        <w:rPr>
+          <w:b/>
+          <w:bCs/>
+          <w:lang w:val="en-US"/>
+        </w:rPr>
+      </w:r>
+      <w:r>
+        <w:rPr>
+          <w:b/>
+          <w:bCs/>
+          <w:lang w:val="en-US"/>
+        </w:rPr>
+        <w:fldChar w:fldCharType="separate"/>
+      </w:r>
+      <w:r>
+        <w:rPr>
+          <w:rStyle w:val="ad"/>
+          <w:b/>
+          <w:bCs/>
+          <w:lang w:val="en-US"/>
+        </w:rPr>
+        <w:t>Link</w:t>
+      </w:r>
     </w:p>
     <w:p>
       <w:pPr>
@@ -5814,6 +5844,18 @@
           <w:numId w:val="15"/>
         </w:numPr>
       </w:pPr>
+      <w:r>
+        <w:rPr>
+          <w:rFonts w:asciiTheme="majorBidi" w:eastAsiaTheme="minorHAnsi" w:hAnsiTheme="majorBidi" w:cstheme="minorBidi"/>
+          <w:b/>
+          <w:bCs/>
+          <w:color w:val="auto"/>
+          <w:sz w:val="28"/>
+          <w:szCs w:val="24"/>
+          <w:lang w:val="en-US"/>
+        </w:rPr>
+        <w:fldChar w:fldCharType="end"/>
+      </w:r>
       <w:r>
         <w:t>SUCCESS METRICS AND MEASUREMENTS</w:t>
       </w:r>

</xml_diff>